<commit_message>
Rework hero headline and expand copy to about 1,840 words
Co-Authored-By: Claude Sonnet 5.5 <noreply@anthropic.com>
Claude-Session: https://claude.ai/code/session_012PGo17x7AccmkmEWZ5KHUv
</commit_message>
<xml_diff>
--- a/invoice-automation.docx
+++ b/invoice-automation.docx
@@ -284,7 +284,7 @@
                 <w:sz w:val="21"/>
                 <w:szCs w:val="21"/>
               </w:rPr>
-              <w:t xml:space="preserve">1625 words (H1 to closing CTA, excluding meta tags and this table)</w:t>
+              <w:t xml:space="preserve">1836 words (H1 to closing CTA, excluding meta tags and this table)</w:t>
             </w:r>
           </w:p>
         </w:tc>
@@ -330,7 +330,7 @@
           <w:b/>
           <w:bCs/>
         </w:rPr>
-        <w:t xml:space="preserve">Invoice automation powered by HAMT AI. It learns from every correction your team makes.</w:t>
+        <w:t xml:space="preserve">Your business has grown. Your invoice automation should keep learning.</w:t>
       </w:r>
     </w:p>
     <w:p>
@@ -936,6 +936,42 @@
     </w:p>
     <w:p>
       <w:pPr>
+        <w:pStyle w:val="ListParagraph"/>
+        <w:numPr>
+          <w:ilvl w:val="0"/>
+          <w:numId w:val="2"/>
+        </w:numPr>
+        <w:spacing w:after="60" w:line="276"/>
+      </w:pPr>
+      <w:r>
+        <w:rPr>
+          <w:rFonts w:ascii="Calibri" w:cs="Calibri" w:eastAsia="Calibri" w:hAnsi="Calibri"/>
+          <w:sz w:val="22"/>
+          <w:szCs w:val="22"/>
+        </w:rPr>
+        <w:t xml:space="preserve">Review queue with the reason attached</w:t>
+      </w:r>
+    </w:p>
+    <w:p>
+      <w:pPr>
+        <w:pStyle w:val="ListParagraph"/>
+        <w:numPr>
+          <w:ilvl w:val="0"/>
+          <w:numId w:val="2"/>
+        </w:numPr>
+        <w:spacing w:after="60" w:line="276"/>
+      </w:pPr>
+      <w:r>
+        <w:rPr>
+          <w:rFonts w:ascii="Calibri" w:cs="Calibri" w:eastAsia="Calibri" w:hAnsi="Calibri"/>
+          <w:sz w:val="22"/>
+          <w:szCs w:val="22"/>
+        </w:rPr>
+        <w:t xml:space="preserve">Approvals on web and mobile</w:t>
+      </w:r>
+    </w:p>
+    <w:p>
+      <w:pPr>
         <w:pStyle w:val="Heading3"/>
         <w:spacing w:after="80" w:before="200"/>
       </w:pPr>
@@ -963,6 +999,42 @@
     </w:p>
     <w:p>
       <w:pPr>
+        <w:pStyle w:val="ListParagraph"/>
+        <w:numPr>
+          <w:ilvl w:val="0"/>
+          <w:numId w:val="2"/>
+        </w:numPr>
+        <w:spacing w:after="60" w:line="276"/>
+      </w:pPr>
+      <w:r>
+        <w:rPr>
+          <w:rFonts w:ascii="Calibri" w:cs="Calibri" w:eastAsia="Calibri" w:hAnsi="Calibri"/>
+          <w:sz w:val="22"/>
+          <w:szCs w:val="22"/>
+        </w:rPr>
+        <w:t xml:space="preserve">Straight-through posting for clean invoices</w:t>
+      </w:r>
+    </w:p>
+    <w:p>
+      <w:pPr>
+        <w:pStyle w:val="ListParagraph"/>
+        <w:numPr>
+          <w:ilvl w:val="0"/>
+          <w:numId w:val="2"/>
+        </w:numPr>
+        <w:spacing w:after="60" w:line="276"/>
+      </w:pPr>
+      <w:r>
+        <w:rPr>
+          <w:rFonts w:ascii="Calibri" w:cs="Calibri" w:eastAsia="Calibri" w:hAnsi="Calibri"/>
+          <w:sz w:val="22"/>
+          <w:szCs w:val="22"/>
+        </w:rPr>
+        <w:t xml:space="preserve">Duplicate and fraud checks before posting</w:t>
+      </w:r>
+    </w:p>
+    <w:p>
+      <w:pPr>
         <w:pStyle w:val="Heading3"/>
         <w:spacing w:after="80" w:before="200"/>
       </w:pPr>
@@ -990,6 +1062,42 @@
     </w:p>
     <w:p>
       <w:pPr>
+        <w:pStyle w:val="ListParagraph"/>
+        <w:numPr>
+          <w:ilvl w:val="0"/>
+          <w:numId w:val="2"/>
+        </w:numPr>
+        <w:spacing w:after="60" w:line="276"/>
+      </w:pPr>
+      <w:r>
+        <w:rPr>
+          <w:rFonts w:ascii="Calibri" w:cs="Calibri" w:eastAsia="Calibri" w:hAnsi="Calibri"/>
+          <w:sz w:val="22"/>
+          <w:szCs w:val="22"/>
+        </w:rPr>
+        <w:t xml:space="preserve">Reads scans, PDFs and e-invoices</w:t>
+      </w:r>
+    </w:p>
+    <w:p>
+      <w:pPr>
+        <w:pStyle w:val="ListParagraph"/>
+        <w:numPr>
+          <w:ilvl w:val="0"/>
+          <w:numId w:val="2"/>
+        </w:numPr>
+        <w:spacing w:after="60" w:line="276"/>
+      </w:pPr>
+      <w:r>
+        <w:rPr>
+          <w:rFonts w:ascii="Calibri" w:cs="Calibri" w:eastAsia="Calibri" w:hAnsi="Calibri"/>
+          <w:sz w:val="22"/>
+          <w:szCs w:val="22"/>
+        </w:rPr>
+        <w:t xml:space="preserve">Improves with every correction</w:t>
+      </w:r>
+    </w:p>
+    <w:p>
+      <w:pPr>
         <w:pStyle w:val="Heading3"/>
         <w:spacing w:after="80" w:before="200"/>
       </w:pPr>
@@ -1013,6 +1121,42 @@
           <w:szCs w:val="22"/>
         </w:rPr>
         <w:t xml:space="preserve">Accounts payable shifts from keying and chasing to reviewing and controlling. We redesign the process alongside the technology, so the change sticks.</w:t>
+      </w:r>
+    </w:p>
+    <w:p>
+      <w:pPr>
+        <w:pStyle w:val="ListParagraph"/>
+        <w:numPr>
+          <w:ilvl w:val="0"/>
+          <w:numId w:val="2"/>
+        </w:numPr>
+        <w:spacing w:after="60" w:line="276"/>
+      </w:pPr>
+      <w:r>
+        <w:rPr>
+          <w:rFonts w:ascii="Calibri" w:cs="Calibri" w:eastAsia="Calibri" w:hAnsi="Calibri"/>
+          <w:sz w:val="22"/>
+          <w:szCs w:val="22"/>
+        </w:rPr>
+        <w:t xml:space="preserve">Process assessment before configuration</w:t>
+      </w:r>
+    </w:p>
+    <w:p>
+      <w:pPr>
+        <w:pStyle w:val="ListParagraph"/>
+        <w:numPr>
+          <w:ilvl w:val="0"/>
+          <w:numId w:val="2"/>
+        </w:numPr>
+        <w:spacing w:after="60" w:line="276"/>
+      </w:pPr>
+      <w:r>
+        <w:rPr>
+          <w:rFonts w:ascii="Calibri" w:cs="Calibri" w:eastAsia="Calibri" w:hAnsi="Calibri"/>
+          <w:sz w:val="22"/>
+          <w:szCs w:val="22"/>
+        </w:rPr>
+        <w:t xml:space="preserve">Roles and controls redesigned with you</w:t>
       </w:r>
     </w:p>
     <w:p>
@@ -1177,6 +1321,33 @@
           <w:b/>
           <w:bCs/>
         </w:rPr>
+        <w:t xml:space="preserve">A reviewer screen built for one-pass checks</w:t>
+      </w:r>
+    </w:p>
+    <w:p>
+      <w:pPr>
+        <w:spacing w:after="120" w:line="276"/>
+      </w:pPr>
+      <w:r>
+        <w:rPr>
+          <w:rFonts w:ascii="Calibri" w:cs="Calibri" w:eastAsia="Calibri" w:hAnsi="Calibri"/>
+          <w:sz w:val="22"/>
+          <w:szCs w:val="22"/>
+        </w:rPr>
+        <w:t xml:space="preserve">Reviewers see the invoice on one side, the extracted fields on the other, and the reason each field was flagged. They confirm or correct and move on. Because every correction is kept, HAMT AI learns your suppliers' quirks: a branch name, an Arabic spelling, a tax line in an unusual place.</w:t>
+      </w:r>
+    </w:p>
+    <w:p>
+      <w:pPr>
+        <w:pStyle w:val="Heading3"/>
+        <w:spacing w:after="80" w:before="200"/>
+      </w:pPr>
+      <w:r>
+        <w:rPr>
+          <w:rFonts w:ascii="Calibri" w:cs="Calibri" w:eastAsia="Calibri" w:hAnsi="Calibri"/>
+          <w:b/>
+          <w:bCs/>
+        </w:rPr>
         <w:t xml:space="preserve">Exception handling that gets smarter</w:t>
       </w:r>
     </w:p>
@@ -1963,6 +2134,60 @@
     </w:p>
     <w:p>
       <w:pPr>
+        <w:pStyle w:val="Heading3"/>
+        <w:spacing w:after="80" w:before="200"/>
+      </w:pPr>
+      <w:r>
+        <w:rPr>
+          <w:rFonts w:ascii="Calibri" w:cs="Calibri" w:eastAsia="Calibri" w:hAnsi="Calibri"/>
+          <w:b/>
+          <w:bCs/>
+        </w:rPr>
+        <w:t xml:space="preserve">Your choice of hosting</w:t>
+      </w:r>
+    </w:p>
+    <w:p>
+      <w:pPr>
+        <w:spacing w:after="120" w:line="276"/>
+      </w:pPr>
+      <w:r>
+        <w:rPr>
+          <w:rFonts w:ascii="Calibri" w:cs="Calibri" w:eastAsia="Calibri" w:hAnsi="Calibri"/>
+          <w:sz w:val="22"/>
+          <w:szCs w:val="22"/>
+        </w:rPr>
+        <w:t xml:space="preserve">Cloud, private cloud or on-premises, with the option to keep invoice data inside the UAE.</w:t>
+      </w:r>
+    </w:p>
+    <w:p>
+      <w:pPr>
+        <w:pStyle w:val="Heading3"/>
+        <w:spacing w:after="80" w:before="200"/>
+      </w:pPr>
+      <w:r>
+        <w:rPr>
+          <w:rFonts w:ascii="Calibri" w:cs="Calibri" w:eastAsia="Calibri" w:hAnsi="Calibri"/>
+          <w:b/>
+          <w:bCs/>
+        </w:rPr>
+        <w:t xml:space="preserve">Local team, global network</w:t>
+      </w:r>
+    </w:p>
+    <w:p>
+      <w:pPr>
+        <w:spacing w:after="120" w:line="276"/>
+      </w:pPr>
+      <w:r>
+        <w:rPr>
+          <w:rFonts w:ascii="Calibri" w:cs="Calibri" w:eastAsia="Calibri" w:hAnsi="Calibri"/>
+          <w:sz w:val="22"/>
+          <w:szCs w:val="22"/>
+        </w:rPr>
+        <w:t xml:space="preserve">Implemented and supported from Dubai in your time zone, backed by the HLB network.</w:t>
+      </w:r>
+    </w:p>
+    <w:p>
+      <w:pPr>
         <w:spacing w:after="40" w:before="200"/>
       </w:pPr>
       <w:r>
@@ -2123,6 +2348,33 @@
           <w:b/>
           <w:bCs/>
         </w:rPr>
+        <w:t xml:space="preserve">Ongoing optimisation, not a one-off project</w:t>
+      </w:r>
+    </w:p>
+    <w:p>
+      <w:pPr>
+        <w:spacing w:after="120" w:line="276"/>
+      </w:pPr>
+      <w:r>
+        <w:rPr>
+          <w:rFonts w:ascii="Calibri" w:cs="Calibri" w:eastAsia="Calibri" w:hAnsi="Calibri"/>
+          <w:sz w:val="22"/>
+          <w:szCs w:val="22"/>
+        </w:rPr>
+        <w:t xml:space="preserve">After go-live we review exception reasons, review rates and supplier trends with your finance team each period, tune the rules and extend HAMT AI to new invoice types and entities. The system keeps improving, and so does the value you get from it.</w:t>
+      </w:r>
+    </w:p>
+    <w:p>
+      <w:pPr>
+        <w:pStyle w:val="Heading3"/>
+        <w:spacing w:after="80" w:before="200"/>
+      </w:pPr>
+      <w:r>
+        <w:rPr>
+          <w:rFonts w:ascii="Calibri" w:cs="Calibri" w:eastAsia="Calibri" w:hAnsi="Calibri"/>
+          <w:b/>
+          <w:bCs/>
+        </w:rPr>
         <w:t xml:space="preserve">Audit-grade controls</w:t>
       </w:r>
     </w:p>
@@ -2301,7 +2553,7 @@
           <w:sz w:val="22"/>
           <w:szCs w:val="22"/>
         </w:rPr>
-        <w:t xml:space="preserve">HAMT AI is HLB HAMT's own AI. HAMT stands for Human-integrated, Automation, Machine learning and Transformation. In invoice automation it reads invoices, applies your controls and learns from reviewer corrections.</w:t>
+        <w:t xml:space="preserve">HAMT AI is HLB HAMT's own AI. HAMT stands for Human-integrated, Automation, Machine learning and Transformation. In invoice automation it reads invoices, applies your controls and learns from reviewer corrections. It is built and supported by HLB HAMT, so the models, rules and controls are tuned by the same team that implements your rollout.</w:t>
       </w:r>
     </w:p>
     <w:p>
@@ -2382,7 +2634,7 @@
           <w:sz w:val="22"/>
           <w:szCs w:val="22"/>
         </w:rPr>
-        <w:t xml:space="preserve">It depends on the number of entities, invoice types and your ERP. Our assessment sets the plan, usually starting with one entity or supplier group so you see results early, then scaling out.</w:t>
+        <w:t xml:space="preserve">It depends on the number of entities, invoice types and your ERP. Our assessment sets the plan, usually starting with one entity or supplier group so you see results early, then scaling out. Group rollouts go entity by entity.</w:t>
       </w:r>
     </w:p>
     <w:p>
@@ -3020,7 +3272,7 @@
                 <w:sz w:val="21"/>
                 <w:szCs w:val="21"/>
               </w:rPr>
-              <w:t xml:space="preserve">20</w:t>
+              <w:t xml:space="preserve">21</w:t>
             </w:r>
           </w:p>
         </w:tc>

</xml_diff>

<commit_message>
Replace closing CTA with three mid-page CTAs
Co-Authored-By: Claude Sonnet 5.5 <noreply@anthropic.com>
Claude-Session: https://claude.ai/code/session_012PGo17x7AccmkmEWZ5KHUv
</commit_message>
<xml_diff>
--- a/invoice-automation.docx
+++ b/invoice-automation.docx
@@ -1420,6 +1420,45 @@
     </w:p>
     <w:p>
       <w:pPr>
+        <w:spacing w:after="120" w:line="276"/>
+      </w:pPr>
+      <w:r>
+        <w:rPr>
+          <w:rFonts w:ascii="Calibri" w:cs="Calibri" w:eastAsia="Calibri" w:hAnsi="Calibri"/>
+          <w:sz w:val="22"/>
+          <w:szCs w:val="22"/>
+        </w:rPr>
+        <w:t xml:space="preserve">See HAMT AI learn from your invoices</w:t>
+      </w:r>
+    </w:p>
+    <w:p>
+      <w:pPr>
+        <w:spacing w:after="120" w:line="276"/>
+      </w:pPr>
+      <w:r>
+        <w:rPr>
+          <w:rFonts w:ascii="Calibri" w:cs="Calibri" w:eastAsia="Calibri" w:hAnsi="Calibri"/>
+          <w:sz w:val="22"/>
+          <w:szCs w:val="22"/>
+        </w:rPr>
+        <w:t xml:space="preserve">Book a demo and we'll run a sample of your invoices, then show you what HAMT AI flags and what a reviewer correction changes.</w:t>
+      </w:r>
+    </w:p>
+    <w:p>
+      <w:pPr>
+        <w:spacing w:after="120" w:line="276"/>
+      </w:pPr>
+      <w:r>
+        <w:rPr>
+          <w:rFonts w:ascii="Calibri" w:cs="Calibri" w:eastAsia="Calibri" w:hAnsi="Calibri"/>
+          <w:sz w:val="22"/>
+          <w:szCs w:val="22"/>
+        </w:rPr>
+        <w:t xml:space="preserve">Button: Book a demo</w:t>
+      </w:r>
+    </w:p>
+    <w:p>
+      <w:pPr>
         <w:spacing w:after="40" w:before="200"/>
       </w:pPr>
       <w:r>
@@ -2188,6 +2227,45 @@
     </w:p>
     <w:p>
       <w:pPr>
+        <w:spacing w:after="120" w:line="276"/>
+      </w:pPr>
+      <w:r>
+        <w:rPr>
+          <w:rFonts w:ascii="Calibri" w:cs="Calibri" w:eastAsia="Calibri" w:hAnsi="Calibri"/>
+          <w:sz w:val="22"/>
+          <w:szCs w:val="22"/>
+        </w:rPr>
+        <w:t xml:space="preserve">Ready to scale accounts payable?</w:t>
+      </w:r>
+    </w:p>
+    <w:p>
+      <w:pPr>
+        <w:spacing w:after="120" w:line="276"/>
+      </w:pPr>
+      <w:r>
+        <w:rPr>
+          <w:rFonts w:ascii="Calibri" w:cs="Calibri" w:eastAsia="Calibri" w:hAnsi="Calibri"/>
+          <w:sz w:val="22"/>
+          <w:szCs w:val="22"/>
+        </w:rPr>
+        <w:t xml:space="preserve">Talk to our team about your volumes, entities and ERP, and we'll outline the right place to start.</w:t>
+      </w:r>
+    </w:p>
+    <w:p>
+      <w:pPr>
+        <w:spacing w:after="120" w:line="276"/>
+      </w:pPr>
+      <w:r>
+        <w:rPr>
+          <w:rFonts w:ascii="Calibri" w:cs="Calibri" w:eastAsia="Calibri" w:hAnsi="Calibri"/>
+          <w:sz w:val="22"/>
+          <w:szCs w:val="22"/>
+        </w:rPr>
+        <w:t xml:space="preserve">Button: Talk to our team</w:t>
+      </w:r>
+    </w:p>
+    <w:p>
+      <w:pPr>
         <w:spacing w:after="40" w:before="200"/>
       </w:pPr>
       <w:r>
@@ -2447,6 +2525,45 @@
     </w:p>
     <w:p>
       <w:pPr>
+        <w:spacing w:after="120" w:line="276"/>
+      </w:pPr>
+      <w:r>
+        <w:rPr>
+          <w:rFonts w:ascii="Calibri" w:cs="Calibri" w:eastAsia="Calibri" w:hAnsi="Calibri"/>
+          <w:sz w:val="22"/>
+          <w:szCs w:val="22"/>
+        </w:rPr>
+        <w:t xml:space="preserve">Start with a process assessment</w:t>
+      </w:r>
+    </w:p>
+    <w:p>
+      <w:pPr>
+        <w:spacing w:after="120" w:line="276"/>
+      </w:pPr>
+      <w:r>
+        <w:rPr>
+          <w:rFonts w:ascii="Calibri" w:cs="Calibri" w:eastAsia="Calibri" w:hAnsi="Calibri"/>
+          <w:sz w:val="22"/>
+          <w:szCs w:val="22"/>
+        </w:rPr>
+        <w:t xml:space="preserve">We map your AP process and agree the outcomes to measure before anything is configured.</w:t>
+      </w:r>
+    </w:p>
+    <w:p>
+      <w:pPr>
+        <w:spacing w:after="120" w:line="276"/>
+      </w:pPr>
+      <w:r>
+        <w:rPr>
+          <w:rFonts w:ascii="Calibri" w:cs="Calibri" w:eastAsia="Calibri" w:hAnsi="Calibri"/>
+          <w:sz w:val="22"/>
+          <w:szCs w:val="22"/>
+        </w:rPr>
+        <w:t xml:space="preserve">Button: Request an assessment</w:t>
+      </w:r>
+    </w:p>
+    <w:p>
+      <w:pPr>
         <w:spacing w:after="40" w:before="200"/>
       </w:pPr>
       <w:r>
@@ -2635,117 +2752,6 @@
           <w:szCs w:val="22"/>
         </w:rPr>
         <w:t xml:space="preserve">It depends on the number of entities, invoice types and your ERP. Our assessment sets the plan, usually starting with one entity or supplier group so you see results early, then scaling out. Group rollouts go entity by entity.</w:t>
-      </w:r>
-    </w:p>
-    <w:p>
-      <w:pPr>
-        <w:spacing w:after="40" w:before="200"/>
-      </w:pPr>
-      <w:r>
-        <w:rPr>
-          <w:rFonts w:ascii="Calibri" w:cs="Calibri" w:eastAsia="Calibri" w:hAnsi="Calibri"/>
-          <w:b/>
-          <w:bCs/>
-          <w:color w:val="0A6E65"/>
-          <w:sz w:val="18"/>
-          <w:szCs w:val="18"/>
-        </w:rPr>
-        <w:t xml:space="preserve">BOOK A DEMO</w:t>
-      </w:r>
-    </w:p>
-    <w:p>
-      <w:pPr>
-        <w:pStyle w:val="Heading2"/>
-        <w:spacing w:after="120" w:before="320"/>
-      </w:pPr>
-      <w:r>
-        <w:rPr>
-          <w:rFonts w:ascii="Calibri" w:cs="Calibri" w:eastAsia="Calibri" w:hAnsi="Calibri"/>
-          <w:b/>
-          <w:bCs/>
-        </w:rPr>
-        <w:t xml:space="preserve">See HAMT AI work on your own invoices</w:t>
-      </w:r>
-    </w:p>
-    <w:p>
-      <w:pPr>
-        <w:spacing w:after="120" w:line="276"/>
-      </w:pPr>
-      <w:r>
-        <w:rPr>
-          <w:rFonts w:ascii="Calibri" w:cs="Calibri" w:eastAsia="Calibri" w:hAnsi="Calibri"/>
-          <w:sz w:val="22"/>
-          <w:szCs w:val="22"/>
-        </w:rPr>
-        <w:t xml:space="preserve">Bring a sample of your invoices, whether scanned, in Arabic or hard to read. We'll show what HAMT AI captures, checks and flags, and how an invoice automation rollout would work for your team. It takes a short call, with no obligation.</w:t>
-      </w:r>
-    </w:p>
-    <w:p>
-      <w:pPr>
-        <w:pStyle w:val="Heading3"/>
-        <w:spacing w:after="80" w:before="200"/>
-      </w:pPr>
-      <w:r>
-        <w:rPr>
-          <w:rFonts w:ascii="Calibri" w:cs="Calibri" w:eastAsia="Calibri" w:hAnsi="Calibri"/>
-          <w:b/>
-          <w:bCs/>
-        </w:rPr>
-        <w:t xml:space="preserve">A strong fit if you</w:t>
-      </w:r>
-    </w:p>
-    <w:p>
-      <w:pPr>
-        <w:pStyle w:val="ListParagraph"/>
-        <w:numPr>
-          <w:ilvl w:val="0"/>
-          <w:numId w:val="2"/>
-        </w:numPr>
-        <w:spacing w:after="60" w:line="276"/>
-      </w:pPr>
-      <w:r>
-        <w:rPr>
-          <w:rFonts w:ascii="Calibri" w:cs="Calibri" w:eastAsia="Calibri" w:hAnsi="Calibri"/>
-          <w:sz w:val="22"/>
-          <w:szCs w:val="22"/>
-        </w:rPr>
-        <w:t xml:space="preserve">Process hundreds or thousands of supplier invoices a month</w:t>
-      </w:r>
-    </w:p>
-    <w:p>
-      <w:pPr>
-        <w:pStyle w:val="ListParagraph"/>
-        <w:numPr>
-          <w:ilvl w:val="0"/>
-          <w:numId w:val="2"/>
-        </w:numPr>
-        <w:spacing w:after="60" w:line="276"/>
-      </w:pPr>
-      <w:r>
-        <w:rPr>
-          <w:rFonts w:ascii="Calibri" w:cs="Calibri" w:eastAsia="Calibri" w:hAnsi="Calibri"/>
-          <w:sz w:val="22"/>
-          <w:szCs w:val="22"/>
-        </w:rPr>
-        <w:t xml:space="preserve">Run more than one entity, branch or country</w:t>
-      </w:r>
-    </w:p>
-    <w:p>
-      <w:pPr>
-        <w:pStyle w:val="ListParagraph"/>
-        <w:numPr>
-          <w:ilvl w:val="0"/>
-          <w:numId w:val="2"/>
-        </w:numPr>
-        <w:spacing w:after="60" w:line="276"/>
-      </w:pPr>
-      <w:r>
-        <w:rPr>
-          <w:rFonts w:ascii="Calibri" w:cs="Calibri" w:eastAsia="Calibri" w:hAnsi="Calibri"/>
-          <w:sz w:val="22"/>
-          <w:szCs w:val="22"/>
-        </w:rPr>
-        <w:t xml:space="preserve">Want tighter control of approvals, matching and VAT than your ERP gives</w:t>
       </w:r>
     </w:p>
     <w:p>
@@ -2912,7 +2918,7 @@
                 <w:sz w:val="21"/>
                 <w:szCs w:val="21"/>
               </w:rPr>
-              <w:t xml:space="preserve">11</w:t>
+              <w:t xml:space="preserve">10</w:t>
             </w:r>
           </w:p>
         </w:tc>

</xml_diff>

<commit_message>
Restore all source points, remove ERP names, merge FAQs to six
Co-Authored-By: Claude Sonnet 5.5 <noreply@anthropic.com>
Claude-Session: https://claude.ai/code/session_012PGo17x7AccmkmEWZ5KHUv
</commit_message>
<xml_diff>
--- a/invoice-automation.docx
+++ b/invoice-automation.docx
@@ -284,7 +284,7 @@
                 <w:sz w:val="21"/>
                 <w:szCs w:val="21"/>
               </w:rPr>
-              <w:t xml:space="preserve">1836 words (H1 to closing CTA, excluding meta tags and this table)</w:t>
+              <w:t xml:space="preserve">2629 words (H1 to closing CTA, excluding meta tags and this table)</w:t>
             </w:r>
           </w:p>
         </w:tc>
@@ -343,20 +343,20 @@
           <w:sz w:val="22"/>
           <w:szCs w:val="22"/>
         </w:rPr>
-        <w:t xml:space="preserve">HLB HAMT's invoice automation uses HAMT AI, our own AI, to capture, check and route every supplier invoice in Arabic or English, from inbox to ERP posting. Reviewers stay in the loop, and each correction they make trains the models, so fewer invoices need review over time. We assess, implement, integrate and optimise it with you.</w:t>
-      </w:r>
-    </w:p>
-    <w:p>
-      <w:pPr>
-        <w:spacing w:after="120" w:line="276"/>
-      </w:pPr>
-      <w:r>
-        <w:rPr>
-          <w:rFonts w:ascii="Calibri" w:cs="Calibri" w:eastAsia="Calibri" w:hAnsi="Calibri"/>
-          <w:sz w:val="22"/>
-          <w:szCs w:val="22"/>
-        </w:rPr>
-        <w:t xml:space="preserve">From HLB HAMT, an advisory and accounting firm in Dubai and a member of the HLB network.</w:t>
+        <w:t xml:space="preserve">HLB HAMT's invoice automation uses HAMT AI, our own AI, to capture, check and route every supplier invoice in Arabic or English, from the moment it arrives until it posts to your ERP. It is built for mid-sized companies and large enterprises across the UAE, the GCC and the wider Middle East, and designed by auditors, so control comes as standard. Reviewers stay in the loop, and every correction they make trains the models. We assess, implement, integrate and optimise it with you.</w:t>
+      </w:r>
+    </w:p>
+    <w:p>
+      <w:pPr>
+        <w:spacing w:after="120" w:line="276"/>
+      </w:pPr>
+      <w:r>
+        <w:rPr>
+          <w:rFonts w:ascii="Calibri" w:cs="Calibri" w:eastAsia="Calibri" w:hAnsi="Calibri"/>
+          <w:sz w:val="22"/>
+          <w:szCs w:val="22"/>
+        </w:rPr>
+        <w:t xml:space="preserve">From HLB HAMT, an award-winning [CONFIRM] advisory and accounting firm in the UAE and a member of HLB, the global advisory and accounting network.</w:t>
       </w:r>
     </w:p>
     <w:p>
@@ -372,7 +372,7 @@
           <w:sz w:val="19"/>
           <w:szCs w:val="19"/>
         </w:rPr>
-        <w:t xml:space="preserve">[HERO VISUAL (example invoice card): Tax Invoice فاتورة ضريبية, INV-26-10482, Subtotal 17,550.00, VAT at 5% 877.50, Total AED 18,427.50. Four status rows:]</w:t>
+        <w:t xml:space="preserve">[HERO VISUAL (example invoice card): Tax Invoice فاتورة ضريبية, INV-26-10482, Subtotal 17,550.00, VAT at 5% 877.50, Total AED 18,427.50. Five status rows:]</w:t>
       </w:r>
     </w:p>
     <w:p>
@@ -408,7 +408,25 @@
           <w:sz w:val="22"/>
           <w:szCs w:val="22"/>
         </w:rPr>
-        <w:t xml:space="preserve">Matched and checked: Agrees with PO 4500912 and goods receipt GRN-7731. TRN and VAT verified, no duplicate found [Done]</w:t>
+        <w:t xml:space="preserve">Matched: Agrees with PO 4500912 and goods receipt GRN-7731, within tolerance [Done]</w:t>
+      </w:r>
+    </w:p>
+    <w:p>
+      <w:pPr>
+        <w:pStyle w:val="ListParagraph"/>
+        <w:numPr>
+          <w:ilvl w:val="0"/>
+          <w:numId w:val="2"/>
+        </w:numPr>
+        <w:spacing w:after="60" w:line="276"/>
+      </w:pPr>
+      <w:r>
+        <w:rPr>
+          <w:rFonts w:ascii="Calibri" w:cs="Calibri" w:eastAsia="Calibri" w:hAnsi="Calibri"/>
+          <w:sz w:val="22"/>
+          <w:szCs w:val="22"/>
+        </w:rPr>
+        <w:t xml:space="preserve">Checked: TRN matches the vendor master, VAT recalculated, no duplicate found [Done]</w:t>
       </w:r>
     </w:p>
     <w:p>
@@ -496,7 +514,7 @@
           <w:sz w:val="22"/>
           <w:szCs w:val="22"/>
         </w:rPr>
-        <w:t xml:space="preserve">Bilingual capture - Arabic, English and mixed-language invoices, scanned or digital</w:t>
+        <w:t xml:space="preserve">Bilingual by design - Arabic, English and mixed-language invoices, scanned or digital</w:t>
       </w:r>
     </w:p>
     <w:p>
@@ -514,7 +532,7 @@
           <w:sz w:val="22"/>
           <w:szCs w:val="22"/>
         </w:rPr>
-        <w:t xml:space="preserve">Learns from reviewers - Every correction trains the models</w:t>
+        <w:t xml:space="preserve">Three-way match - Every invoice checked against its purchase order and goods receipt</w:t>
       </w:r>
     </w:p>
     <w:p>
@@ -532,7 +550,7 @@
           <w:sz w:val="22"/>
           <w:szCs w:val="22"/>
         </w:rPr>
-        <w:t xml:space="preserve">Matched and controlled - Checked against purchase orders, receipts, TRN and VAT</w:t>
+        <w:t xml:space="preserve">Ready for UAE e-invoicing - Structured Peppol e-invoices handled alongside scans and PDFs</w:t>
       </w:r>
     </w:p>
     <w:p>
@@ -550,7 +568,7 @@
           <w:sz w:val="22"/>
           <w:szCs w:val="22"/>
         </w:rPr>
-        <w:t xml:space="preserve">Services-led delivery - Assessment, ERP integration and ongoing optimisation</w:t>
+        <w:t xml:space="preserve">Rooted in the region - More than two decades [CONFIRM] advising businesses across the UAE and GCC</w:t>
       </w:r>
     </w:p>
     <w:p>
@@ -593,20 +611,20 @@
           <w:sz w:val="22"/>
           <w:szCs w:val="22"/>
         </w:rPr>
-        <w:t xml:space="preserve">A capable AP team copes with a few hundred invoices a month. Then the business adds a branch, an entity or a country. Invoices arrive by email, courier and WhatsApp, in Arabic and English, approvals stall and controls slip.</w:t>
-      </w:r>
-    </w:p>
-    <w:p>
-      <w:pPr>
-        <w:spacing w:after="120" w:line="276"/>
-      </w:pPr>
-      <w:r>
-        <w:rPr>
-          <w:rFonts w:ascii="Calibri" w:cs="Calibri" w:eastAsia="Calibri" w:hAnsi="Calibri"/>
-          <w:sz w:val="22"/>
-          <w:szCs w:val="22"/>
-        </w:rPr>
-        <w:t xml:space="preserve">Hiring more people only delays the problem. Accounts payable automation changes the process itself.</w:t>
+        <w:t xml:space="preserve">A capable AP team copes with a few hundred invoices a month. Then the business adds a branch, a warehouse, a second entity or another country. Invoices arrive by email, courier and WhatsApp, in Arabic and English, and some still come off dot-matrix printers.</w:t>
+      </w:r>
+    </w:p>
+    <w:p>
+      <w:pPr>
+        <w:spacing w:after="120" w:line="276"/>
+      </w:pPr>
+      <w:r>
+        <w:rPr>
+          <w:rFonts w:ascii="Calibri" w:cs="Calibri" w:eastAsia="Calibri" w:hAnsi="Calibri"/>
+          <w:sz w:val="22"/>
+          <w:szCs w:val="22"/>
+        </w:rPr>
+        <w:t xml:space="preserve">Approvers travel, month-end turns into a scramble, and controls that worked at a smaller size start to slip.</w:t>
       </w:r>
     </w:p>
     <w:p>
@@ -633,7 +651,7 @@
           <w:sz w:val="22"/>
           <w:szCs w:val="22"/>
         </w:rPr>
-        <w:t xml:space="preserve">Keying delays hold up accruals and cash forecasting.</w:t>
+        <w:t xml:space="preserve">Invoices waiting to be keyed hold up accruals, reporting and cash forecasting.</w:t>
       </w:r>
     </w:p>
     <w:p>
@@ -660,7 +678,7 @@
           <w:sz w:val="22"/>
           <w:szCs w:val="22"/>
         </w:rPr>
-        <w:t xml:space="preserve">Duplicate or mismatched invoices are paid before anyone notices.</w:t>
+        <w:t xml:space="preserve">Duplicate, inflated or mismatched invoices are paid before anyone notices.</w:t>
       </w:r>
     </w:p>
     <w:p>
@@ -687,7 +705,7 @@
           <w:sz w:val="22"/>
           <w:szCs w:val="22"/>
         </w:rPr>
-        <w:t xml:space="preserve">Invoices sit in inboxes while suppliers chase payment.</w:t>
+        <w:t xml:space="preserve">Invoices sit in inboxes and chat groups while suppliers call to ask about payment.</w:t>
       </w:r>
     </w:p>
     <w:p>
@@ -701,20 +719,46 @@
           <w:b/>
           <w:bCs/>
         </w:rPr>
-        <w:t xml:space="preserve">Compliance exposure</w:t>
-      </w:r>
-    </w:p>
-    <w:p>
-      <w:pPr>
-        <w:spacing w:after="120" w:line="276"/>
-      </w:pPr>
-      <w:r>
-        <w:rPr>
-          <w:rFonts w:ascii="Calibri" w:cs="Calibri" w:eastAsia="Calibri" w:hAnsi="Calibri"/>
-          <w:sz w:val="22"/>
-          <w:szCs w:val="22"/>
-        </w:rPr>
-        <w:t xml:space="preserve">VAT and TRN errors and new e-invoicing rules raise the stakes.</w:t>
+        <w:t xml:space="preserve">Growing compliance exposure</w:t>
+      </w:r>
+    </w:p>
+    <w:p>
+      <w:pPr>
+        <w:spacing w:after="120" w:line="276"/>
+      </w:pPr>
+      <w:r>
+        <w:rPr>
+          <w:rFonts w:ascii="Calibri" w:cs="Calibri" w:eastAsia="Calibri" w:hAnsi="Calibri"/>
+          <w:sz w:val="22"/>
+          <w:szCs w:val="22"/>
+        </w:rPr>
+        <w:t xml:space="preserve">VAT and TRN errors, audit-trail gaps and new e-invoicing rules raise the stakes every year.</w:t>
+      </w:r>
+    </w:p>
+    <w:p>
+      <w:pPr>
+        <w:spacing w:after="120" w:line="276"/>
+      </w:pPr>
+      <w:r>
+        <w:rPr>
+          <w:rFonts w:ascii="Calibri" w:cs="Calibri" w:eastAsia="Calibri" w:hAnsi="Calibri"/>
+          <w:sz w:val="22"/>
+          <w:szCs w:val="22"/>
+        </w:rPr>
+        <w:t xml:space="preserve">Hiring more people keeps the process running for a while.</w:t>
+      </w:r>
+    </w:p>
+    <w:p>
+      <w:pPr>
+        <w:spacing w:after="120" w:line="276"/>
+      </w:pPr>
+      <w:r>
+        <w:rPr>
+          <w:rFonts w:ascii="Calibri" w:cs="Calibri" w:eastAsia="Calibri" w:hAnsi="Calibri"/>
+          <w:sz w:val="22"/>
+          <w:szCs w:val="22"/>
+        </w:rPr>
+        <w:t xml:space="preserve">Accounts payable automation changes the process, and that is what lets it scale.</w:t>
       </w:r>
     </w:p>
     <w:p>
@@ -757,7 +801,7 @@
           <w:sz w:val="22"/>
           <w:szCs w:val="22"/>
         </w:rPr>
-        <w:t xml:space="preserve">Invoice processing automation takes routine work off your team. Invoices that pass every check flow straight to approval and posting. The rest reach the right person with the reason attached.</w:t>
+        <w:t xml:space="preserve">Invoice processing automation takes over the routine work of accounts payable. Invoices that pass every check flow straight to approval and posting. Those that need judgement reach the right person with the reason attached.</w:t>
       </w:r>
     </w:p>
     <w:p>
@@ -789,7 +833,7 @@
           <w:sz w:val="22"/>
           <w:szCs w:val="22"/>
         </w:rPr>
-        <w:t xml:space="preserve">Manual: Typing invoice data into the ERP &gt; HAMT AI captures the data in Arabic or English</w:t>
+        <w:t xml:space="preserve">Manual: Typing invoice data into the ERP by hand &gt; HAMT AI data capture from any invoice, in Arabic or English</w:t>
       </w:r>
     </w:p>
     <w:p>
@@ -807,7 +851,7 @@
           <w:sz w:val="22"/>
           <w:szCs w:val="22"/>
         </w:rPr>
-        <w:t xml:space="preserve">Manual: Chasing approvers by email and chat &gt; Rule-based approval routing on web and mobile</w:t>
+        <w:t xml:space="preserve">Manual: Chasing approvers by email, phone and chat &gt; Rule-based approval routing on web and mobile</w:t>
       </w:r>
     </w:p>
     <w:p>
@@ -825,7 +869,7 @@
           <w:sz w:val="22"/>
           <w:szCs w:val="22"/>
         </w:rPr>
-        <w:t xml:space="preserve">Manual: Finding duplicates after payment &gt; Duplicate and fraud checks before posting</w:t>
+        <w:t xml:space="preserve">Manual: Finding duplicates after they are paid &gt; Duplicate and fraud checks before anything is posted</w:t>
       </w:r>
     </w:p>
     <w:p>
@@ -861,7 +905,25 @@
           <w:sz w:val="22"/>
           <w:szCs w:val="22"/>
         </w:rPr>
-        <w:t xml:space="preserve">Manual: Collecting audit evidence afterwards &gt; An audit trail recorded at every step</w:t>
+        <w:t xml:space="preserve">Manual: Gathering audit evidence after the fact &gt; An audit trail recorded at every step</w:t>
+      </w:r>
+    </w:p>
+    <w:p>
+      <w:pPr>
+        <w:pStyle w:val="ListParagraph"/>
+        <w:numPr>
+          <w:ilvl w:val="0"/>
+          <w:numId w:val="2"/>
+        </w:numPr>
+        <w:spacing w:after="60" w:line="276"/>
+      </w:pPr>
+      <w:r>
+        <w:rPr>
+          <w:rFonts w:ascii="Calibri" w:cs="Calibri" w:eastAsia="Calibri" w:hAnsi="Calibri"/>
+          <w:sz w:val="22"/>
+          <w:szCs w:val="22"/>
+        </w:rPr>
+        <w:t xml:space="preserve">Manual: Hiring to keep up with volume &gt; Room to grow without adding headcount</w:t>
       </w:r>
     </w:p>
     <w:p>
@@ -936,42 +998,6 @@
     </w:p>
     <w:p>
       <w:pPr>
-        <w:pStyle w:val="ListParagraph"/>
-        <w:numPr>
-          <w:ilvl w:val="0"/>
-          <w:numId w:val="2"/>
-        </w:numPr>
-        <w:spacing w:after="60" w:line="276"/>
-      </w:pPr>
-      <w:r>
-        <w:rPr>
-          <w:rFonts w:ascii="Calibri" w:cs="Calibri" w:eastAsia="Calibri" w:hAnsi="Calibri"/>
-          <w:sz w:val="22"/>
-          <w:szCs w:val="22"/>
-        </w:rPr>
-        <w:t xml:space="preserve">Review queue with the reason attached</w:t>
-      </w:r>
-    </w:p>
-    <w:p>
-      <w:pPr>
-        <w:pStyle w:val="ListParagraph"/>
-        <w:numPr>
-          <w:ilvl w:val="0"/>
-          <w:numId w:val="2"/>
-        </w:numPr>
-        <w:spacing w:after="60" w:line="276"/>
-      </w:pPr>
-      <w:r>
-        <w:rPr>
-          <w:rFonts w:ascii="Calibri" w:cs="Calibri" w:eastAsia="Calibri" w:hAnsi="Calibri"/>
-          <w:sz w:val="22"/>
-          <w:szCs w:val="22"/>
-        </w:rPr>
-        <w:t xml:space="preserve">Approvals on web and mobile</w:t>
-      </w:r>
-    </w:p>
-    <w:p>
-      <w:pPr>
         <w:pStyle w:val="Heading3"/>
         <w:spacing w:after="80" w:before="200"/>
       </w:pPr>
@@ -999,42 +1025,6 @@
     </w:p>
     <w:p>
       <w:pPr>
-        <w:pStyle w:val="ListParagraph"/>
-        <w:numPr>
-          <w:ilvl w:val="0"/>
-          <w:numId w:val="2"/>
-        </w:numPr>
-        <w:spacing w:after="60" w:line="276"/>
-      </w:pPr>
-      <w:r>
-        <w:rPr>
-          <w:rFonts w:ascii="Calibri" w:cs="Calibri" w:eastAsia="Calibri" w:hAnsi="Calibri"/>
-          <w:sz w:val="22"/>
-          <w:szCs w:val="22"/>
-        </w:rPr>
-        <w:t xml:space="preserve">Straight-through posting for clean invoices</w:t>
-      </w:r>
-    </w:p>
-    <w:p>
-      <w:pPr>
-        <w:pStyle w:val="ListParagraph"/>
-        <w:numPr>
-          <w:ilvl w:val="0"/>
-          <w:numId w:val="2"/>
-        </w:numPr>
-        <w:spacing w:after="60" w:line="276"/>
-      </w:pPr>
-      <w:r>
-        <w:rPr>
-          <w:rFonts w:ascii="Calibri" w:cs="Calibri" w:eastAsia="Calibri" w:hAnsi="Calibri"/>
-          <w:sz w:val="22"/>
-          <w:szCs w:val="22"/>
-        </w:rPr>
-        <w:t xml:space="preserve">Duplicate and fraud checks before posting</w:t>
-      </w:r>
-    </w:p>
-    <w:p>
-      <w:pPr>
         <w:pStyle w:val="Heading3"/>
         <w:spacing w:after="80" w:before="200"/>
       </w:pPr>
@@ -1062,42 +1052,6 @@
     </w:p>
     <w:p>
       <w:pPr>
-        <w:pStyle w:val="ListParagraph"/>
-        <w:numPr>
-          <w:ilvl w:val="0"/>
-          <w:numId w:val="2"/>
-        </w:numPr>
-        <w:spacing w:after="60" w:line="276"/>
-      </w:pPr>
-      <w:r>
-        <w:rPr>
-          <w:rFonts w:ascii="Calibri" w:cs="Calibri" w:eastAsia="Calibri" w:hAnsi="Calibri"/>
-          <w:sz w:val="22"/>
-          <w:szCs w:val="22"/>
-        </w:rPr>
-        <w:t xml:space="preserve">Reads scans, PDFs and e-invoices</w:t>
-      </w:r>
-    </w:p>
-    <w:p>
-      <w:pPr>
-        <w:pStyle w:val="ListParagraph"/>
-        <w:numPr>
-          <w:ilvl w:val="0"/>
-          <w:numId w:val="2"/>
-        </w:numPr>
-        <w:spacing w:after="60" w:line="276"/>
-      </w:pPr>
-      <w:r>
-        <w:rPr>
-          <w:rFonts w:ascii="Calibri" w:cs="Calibri" w:eastAsia="Calibri" w:hAnsi="Calibri"/>
-          <w:sz w:val="22"/>
-          <w:szCs w:val="22"/>
-        </w:rPr>
-        <w:t xml:space="preserve">Improves with every correction</w:t>
-      </w:r>
-    </w:p>
-    <w:p>
-      <w:pPr>
         <w:pStyle w:val="Heading3"/>
         <w:spacing w:after="80" w:before="200"/>
       </w:pPr>
@@ -1121,42 +1075,6 @@
           <w:szCs w:val="22"/>
         </w:rPr>
         <w:t xml:space="preserve">Accounts payable shifts from keying and chasing to reviewing and controlling. We redesign the process alongside the technology, so the change sticks.</w:t>
-      </w:r>
-    </w:p>
-    <w:p>
-      <w:pPr>
-        <w:pStyle w:val="ListParagraph"/>
-        <w:numPr>
-          <w:ilvl w:val="0"/>
-          <w:numId w:val="2"/>
-        </w:numPr>
-        <w:spacing w:after="60" w:line="276"/>
-      </w:pPr>
-      <w:r>
-        <w:rPr>
-          <w:rFonts w:ascii="Calibri" w:cs="Calibri" w:eastAsia="Calibri" w:hAnsi="Calibri"/>
-          <w:sz w:val="22"/>
-          <w:szCs w:val="22"/>
-        </w:rPr>
-        <w:t xml:space="preserve">Process assessment before configuration</w:t>
-      </w:r>
-    </w:p>
-    <w:p>
-      <w:pPr>
-        <w:pStyle w:val="ListParagraph"/>
-        <w:numPr>
-          <w:ilvl w:val="0"/>
-          <w:numId w:val="2"/>
-        </w:numPr>
-        <w:spacing w:after="60" w:line="276"/>
-      </w:pPr>
-      <w:r>
-        <w:rPr>
-          <w:rFonts w:ascii="Calibri" w:cs="Calibri" w:eastAsia="Calibri" w:hAnsi="Calibri"/>
-          <w:sz w:val="22"/>
-          <w:szCs w:val="22"/>
-        </w:rPr>
-        <w:t xml:space="preserve">Roles and controls redesigned with you</w:t>
       </w:r>
     </w:p>
     <w:p>
@@ -1321,33 +1239,6 @@
           <w:b/>
           <w:bCs/>
         </w:rPr>
-        <w:t xml:space="preserve">A reviewer screen built for one-pass checks</w:t>
-      </w:r>
-    </w:p>
-    <w:p>
-      <w:pPr>
-        <w:spacing w:after="120" w:line="276"/>
-      </w:pPr>
-      <w:r>
-        <w:rPr>
-          <w:rFonts w:ascii="Calibri" w:cs="Calibri" w:eastAsia="Calibri" w:hAnsi="Calibri"/>
-          <w:sz w:val="22"/>
-          <w:szCs w:val="22"/>
-        </w:rPr>
-        <w:t xml:space="preserve">Reviewers see the invoice on one side, the extracted fields on the other, and the reason each field was flagged. They confirm or correct and move on. Because every correction is kept, HAMT AI learns your suppliers' quirks: a branch name, an Arabic spelling, a tax line in an unusual place.</w:t>
-      </w:r>
-    </w:p>
-    <w:p>
-      <w:pPr>
-        <w:pStyle w:val="Heading3"/>
-        <w:spacing w:after="80" w:before="200"/>
-      </w:pPr>
-      <w:r>
-        <w:rPr>
-          <w:rFonts w:ascii="Calibri" w:cs="Calibri" w:eastAsia="Calibri" w:hAnsi="Calibri"/>
-          <w:b/>
-          <w:bCs/>
-        </w:rPr>
         <w:t xml:space="preserve">Exception handling that gets smarter</w:t>
       </w:r>
     </w:p>
@@ -1497,7 +1388,7 @@
           <w:sz w:val="22"/>
           <w:szCs w:val="22"/>
         </w:rPr>
-        <w:t xml:space="preserve">Six steps, each one recorded. Your team steps in only when a check fails or an approval is due.</w:t>
+        <w:t xml:space="preserve">Every invoice follows the same six steps, and every step is recorded. Your team steps in only when a check fails or an approval is due.</w:t>
       </w:r>
     </w:p>
     <w:p>
@@ -1524,7 +1415,7 @@
           <w:sz w:val="22"/>
           <w:szCs w:val="22"/>
         </w:rPr>
-        <w:t xml:space="preserve">Invoices from email, scanners, shared folders and e-invoicing providers join one queue.</w:t>
+        <w:t xml:space="preserve">Invoices are collected the moment they arrive, from email, scanners, shared folders or your e-invoicing provider, into one controlled queue.</w:t>
       </w:r>
     </w:p>
     <w:p>
@@ -1543,6 +1434,24 @@
           <w:szCs w:val="22"/>
         </w:rPr>
         <w:t xml:space="preserve">Paper, PDF, image and structured e-invoices</w:t>
+      </w:r>
+    </w:p>
+    <w:p>
+      <w:pPr>
+        <w:pStyle w:val="ListParagraph"/>
+        <w:numPr>
+          <w:ilvl w:val="0"/>
+          <w:numId w:val="2"/>
+        </w:numPr>
+        <w:spacing w:after="60" w:line="276"/>
+      </w:pPr>
+      <w:r>
+        <w:rPr>
+          <w:rFonts w:ascii="Calibri" w:cs="Calibri" w:eastAsia="Calibri" w:hAnsi="Calibri"/>
+          <w:sz w:val="22"/>
+          <w:szCs w:val="22"/>
+        </w:rPr>
+        <w:t xml:space="preserve">One register of every invoice received</w:t>
       </w:r>
     </w:p>
     <w:p>
@@ -1569,7 +1478,7 @@
           <w:sz w:val="22"/>
           <w:szCs w:val="22"/>
         </w:rPr>
-        <w:t xml:space="preserve">HAMT AI extracts header, line and tax data in Arabic or English and files it under the right supplier.</w:t>
+        <w:t xml:space="preserve">HAMT AI extracts header details, line items, tax and supplier data in Arabic or English, then files the invoice under the right supplier.</w:t>
       </w:r>
     </w:p>
     <w:p>
@@ -1588,6 +1497,24 @@
           <w:szCs w:val="22"/>
         </w:rPr>
         <w:t xml:space="preserve">Handles faded, skewed and dot-matrix prints</w:t>
+      </w:r>
+    </w:p>
+    <w:p>
+      <w:pPr>
+        <w:pStyle w:val="ListParagraph"/>
+        <w:numPr>
+          <w:ilvl w:val="0"/>
+          <w:numId w:val="2"/>
+        </w:numPr>
+        <w:spacing w:after="60" w:line="276"/>
+      </w:pPr>
+      <w:r>
+        <w:rPr>
+          <w:rFonts w:ascii="Calibri" w:cs="Calibri" w:eastAsia="Calibri" w:hAnsi="Calibri"/>
+          <w:sz w:val="22"/>
+          <w:szCs w:val="22"/>
+        </w:rPr>
+        <w:t xml:space="preserve">Uncertain values go to review instead of being guessed</w:t>
       </w:r>
     </w:p>
     <w:p>
@@ -1614,7 +1541,25 @@
           <w:sz w:val="22"/>
           <w:szCs w:val="22"/>
         </w:rPr>
-        <w:t xml:space="preserve">Each invoice is matched to its purchase order and goods receipt, within tolerances you set.</w:t>
+        <w:t xml:space="preserve">Each invoice is checked for completeness, matched to its purchase order and goods receipt, and tested against your VAT and business rules.</w:t>
+      </w:r>
+    </w:p>
+    <w:p>
+      <w:pPr>
+        <w:pStyle w:val="ListParagraph"/>
+        <w:numPr>
+          <w:ilvl w:val="0"/>
+          <w:numId w:val="2"/>
+        </w:numPr>
+        <w:spacing w:after="60" w:line="276"/>
+      </w:pPr>
+      <w:r>
+        <w:rPr>
+          <w:rFonts w:ascii="Calibri" w:cs="Calibri" w:eastAsia="Calibri" w:hAnsi="Calibri"/>
+          <w:sz w:val="22"/>
+          <w:szCs w:val="22"/>
+        </w:rPr>
+        <w:t xml:space="preserve">Two-way or three-way, with your tolerances</w:t>
       </w:r>
     </w:p>
     <w:p>
@@ -1659,7 +1604,7 @@
           <w:sz w:val="22"/>
           <w:szCs w:val="22"/>
         </w:rPr>
-        <w:t xml:space="preserve">Rules route it by entity, cost centre, value or category, with deputies and escalation.</w:t>
+        <w:t xml:space="preserve">Rules route it to the right approver by entity, cost centre, value or category, with deputies and escalation for leave and travel.</w:t>
       </w:r>
     </w:p>
     <w:p>
@@ -1677,7 +1622,25 @@
           <w:sz w:val="22"/>
           <w:szCs w:val="22"/>
         </w:rPr>
-        <w:t xml:space="preserve">Approve from a browser or phone</w:t>
+        <w:t xml:space="preserve">Multi-level approval limits you define</w:t>
+      </w:r>
+    </w:p>
+    <w:p>
+      <w:pPr>
+        <w:pStyle w:val="ListParagraph"/>
+        <w:numPr>
+          <w:ilvl w:val="0"/>
+          <w:numId w:val="2"/>
+        </w:numPr>
+        <w:spacing w:after="60" w:line="276"/>
+      </w:pPr>
+      <w:r>
+        <w:rPr>
+          <w:rFonts w:ascii="Calibri" w:cs="Calibri" w:eastAsia="Calibri" w:hAnsi="Calibri"/>
+          <w:sz w:val="22"/>
+          <w:szCs w:val="22"/>
+        </w:rPr>
+        <w:t xml:space="preserve">Approval from a browser or phone</w:t>
       </w:r>
     </w:p>
     <w:p>
@@ -1704,7 +1667,7 @@
           <w:sz w:val="22"/>
           <w:szCs w:val="22"/>
         </w:rPr>
-        <w:t xml:space="preserve">Approved invoices reach your ERP with posting data prepared, in time for supplier payment terms.</w:t>
+        <w:t xml:space="preserve">Approved invoices reach your ERP with posting data prepared, in time to meet supplier payment terms.</w:t>
       </w:r>
     </w:p>
     <w:p>
@@ -1723,6 +1686,24 @@
           <w:szCs w:val="22"/>
         </w:rPr>
         <w:t xml:space="preserve">PO-backed invoices post without manual entry</w:t>
+      </w:r>
+    </w:p>
+    <w:p>
+      <w:pPr>
+        <w:pStyle w:val="ListParagraph"/>
+        <w:numPr>
+          <w:ilvl w:val="0"/>
+          <w:numId w:val="2"/>
+        </w:numPr>
+        <w:spacing w:after="60" w:line="276"/>
+      </w:pPr>
+      <w:r>
+        <w:rPr>
+          <w:rFonts w:ascii="Calibri" w:cs="Calibri" w:eastAsia="Calibri" w:hAnsi="Calibri"/>
+          <w:sz w:val="22"/>
+          <w:szCs w:val="22"/>
+        </w:rPr>
+        <w:t xml:space="preserve">Early-payment discounts flagged before they lapse</w:t>
       </w:r>
     </w:p>
     <w:p>
@@ -1749,7 +1730,7 @@
           <w:sz w:val="22"/>
           <w:szCs w:val="22"/>
         </w:rPr>
-        <w:t xml:space="preserve">Every invoice is stored with its full history for the whole retention period.</w:t>
+        <w:t xml:space="preserve">Every invoice is stored with its full history and stays retrievable for the whole retention period.</w:t>
       </w:r>
     </w:p>
     <w:p>
@@ -1767,7 +1748,25 @@
           <w:sz w:val="22"/>
           <w:szCs w:val="22"/>
         </w:rPr>
-        <w:t xml:space="preserve">Retention rules by entity and country</w:t>
+        <w:t xml:space="preserve">A complete record of every change and approval</w:t>
+      </w:r>
+    </w:p>
+    <w:p>
+      <w:pPr>
+        <w:pStyle w:val="ListParagraph"/>
+        <w:numPr>
+          <w:ilvl w:val="0"/>
+          <w:numId w:val="2"/>
+        </w:numPr>
+        <w:spacing w:after="60" w:line="276"/>
+      </w:pPr>
+      <w:r>
+        <w:rPr>
+          <w:rFonts w:ascii="Calibri" w:cs="Calibri" w:eastAsia="Calibri" w:hAnsi="Calibri"/>
+          <w:sz w:val="22"/>
+          <w:szCs w:val="22"/>
+        </w:rPr>
+        <w:t xml:space="preserve">Retention rules set by entity and country</w:t>
       </w:r>
     </w:p>
     <w:p>
@@ -1810,7 +1809,7 @@
           <w:sz w:val="22"/>
           <w:szCs w:val="22"/>
         </w:rPr>
-        <w:t xml:space="preserve">Whether you handle hundreds of invoices a month or many thousands across countries, it runs on one platform.</w:t>
+        <w:t xml:space="preserve">Whether you handle hundreds of invoices a month or many thousands across several countries, it runs on one platform. Start with what you need today and extend it as the business grows.</w:t>
       </w:r>
     </w:p>
     <w:p>
@@ -1840,20 +1839,20 @@
           <w:b/>
           <w:bCs/>
         </w:rPr>
-        <w:t xml:space="preserve">Move off manual entry</w:t>
-      </w:r>
-    </w:p>
-    <w:p>
-      <w:pPr>
-        <w:spacing w:after="120" w:line="276"/>
-      </w:pPr>
-      <w:r>
-        <w:rPr>
-          <w:rFonts w:ascii="Calibri" w:cs="Calibri" w:eastAsia="Calibri" w:hAnsi="Calibri"/>
-          <w:sz w:val="22"/>
-          <w:szCs w:val="22"/>
-        </w:rPr>
-        <w:t xml:space="preserve">For growing businesses that want to stop keying invoices and bring approvals under control.</w:t>
+        <w:t xml:space="preserve">Move off manual entry, fast</w:t>
+      </w:r>
+    </w:p>
+    <w:p>
+      <w:pPr>
+        <w:spacing w:after="120" w:line="276"/>
+      </w:pPr>
+      <w:r>
+        <w:rPr>
+          <w:rFonts w:ascii="Calibri" w:cs="Calibri" w:eastAsia="Calibri" w:hAnsi="Calibri"/>
+          <w:sz w:val="22"/>
+          <w:szCs w:val="22"/>
+        </w:rPr>
+        <w:t xml:space="preserve">For growing businesses with one or a few entities that want to stop keying invoices and get approvals under control.</w:t>
       </w:r>
     </w:p>
     <w:p>
@@ -1871,7 +1870,7 @@
           <w:sz w:val="22"/>
           <w:szCs w:val="22"/>
         </w:rPr>
-        <w:t xml:space="preserve">Cloud deployment with ready-made approval and matching rules</w:t>
+        <w:t xml:space="preserve">Cloud deployment with ready-to-use approval and matching rules</w:t>
       </w:r>
     </w:p>
     <w:p>
@@ -1889,7 +1888,7 @@
           <w:sz w:val="22"/>
           <w:szCs w:val="22"/>
         </w:rPr>
-        <w:t xml:space="preserve">Connects to Sage, Odoo, Zoho Books and Dynamics 365</w:t>
+        <w:t xml:space="preserve">Connects to the accounting or ERP system you already run</w:t>
       </w:r>
     </w:p>
     <w:p>
@@ -1907,7 +1906,25 @@
           <w:sz w:val="22"/>
           <w:szCs w:val="22"/>
         </w:rPr>
-        <w:t xml:space="preserve">Starts with your highest-volume suppliers</w:t>
+        <w:t xml:space="preserve">Starts with your highest-volume suppliers, then widens</w:t>
+      </w:r>
+    </w:p>
+    <w:p>
+      <w:pPr>
+        <w:pStyle w:val="ListParagraph"/>
+        <w:numPr>
+          <w:ilvl w:val="0"/>
+          <w:numId w:val="2"/>
+        </w:numPr>
+        <w:spacing w:after="60" w:line="276"/>
+      </w:pPr>
+      <w:r>
+        <w:rPr>
+          <w:rFonts w:ascii="Calibri" w:cs="Calibri" w:eastAsia="Calibri" w:hAnsi="Calibri"/>
+          <w:sz w:val="22"/>
+          <w:szCs w:val="22"/>
+        </w:rPr>
+        <w:t xml:space="preserve">Add entities, users and invoice types as you grow</w:t>
       </w:r>
     </w:p>
     <w:p>
@@ -1950,7 +1967,7 @@
           <w:sz w:val="22"/>
           <w:szCs w:val="22"/>
         </w:rPr>
-        <w:t xml:space="preserve">For multi-entity, multi-country groups and shared service centres with layered approvals.</w:t>
+        <w:t xml:space="preserve">For multi-entity, multi-country groups and shared service centres with high volumes and layered approval structures.</w:t>
       </w:r>
     </w:p>
     <w:p>
@@ -1986,7 +2003,7 @@
           <w:sz w:val="22"/>
           <w:szCs w:val="22"/>
         </w:rPr>
-        <w:t xml:space="preserve">Integration with SAP, Oracle and Dynamics 365</w:t>
+        <w:t xml:space="preserve">Integration with enterprise ERP platforms</w:t>
       </w:r>
     </w:p>
     <w:p>
@@ -2004,20 +2021,38 @@
           <w:sz w:val="22"/>
           <w:szCs w:val="22"/>
         </w:rPr>
-        <w:t xml:space="preserve">Cloud, private cloud or on-premises hosting</w:t>
-      </w:r>
-    </w:p>
-    <w:p>
-      <w:pPr>
-        <w:spacing w:after="120" w:line="276"/>
-      </w:pPr>
-      <w:r>
-        <w:rPr>
-          <w:rFonts w:ascii="Calibri" w:cs="Calibri" w:eastAsia="Calibri" w:hAnsi="Calibri"/>
-          <w:sz w:val="22"/>
-          <w:szCs w:val="22"/>
-        </w:rPr>
-        <w:t xml:space="preserve">Every deployment includes bilingual capture, three-way matching, VAT and TRN checks, the learning cycle and a full audit trail.</w:t>
+        <w:t xml:space="preserve">Cloud, private cloud or on-premises deployment</w:t>
+      </w:r>
+    </w:p>
+    <w:p>
+      <w:pPr>
+        <w:pStyle w:val="ListParagraph"/>
+        <w:numPr>
+          <w:ilvl w:val="0"/>
+          <w:numId w:val="2"/>
+        </w:numPr>
+        <w:spacing w:after="60" w:line="276"/>
+      </w:pPr>
+      <w:r>
+        <w:rPr>
+          <w:rFonts w:ascii="Calibri" w:cs="Calibri" w:eastAsia="Calibri" w:hAnsi="Calibri"/>
+          <w:sz w:val="22"/>
+          <w:szCs w:val="22"/>
+        </w:rPr>
+        <w:t xml:space="preserve">Centralised processing and group-wide reporting for shared services</w:t>
+      </w:r>
+    </w:p>
+    <w:p>
+      <w:pPr>
+        <w:spacing w:after="120" w:line="276"/>
+      </w:pPr>
+      <w:r>
+        <w:rPr>
+          <w:rFonts w:ascii="Calibri" w:cs="Calibri" w:eastAsia="Calibri" w:hAnsi="Calibri"/>
+          <w:sz w:val="22"/>
+          <w:szCs w:val="22"/>
+        </w:rPr>
+        <w:t xml:space="preserve">Every deployment includes bilingual capture, three-way matching, VAT and TRN checks, the HAMT AI learning cycle and a complete audit trail.</w:t>
       </w:r>
     </w:p>
     <w:p>
@@ -2060,7 +2095,7 @@
           <w:sz w:val="22"/>
           <w:szCs w:val="22"/>
         </w:rPr>
-        <w:t xml:space="preserve">Regional invoices carry two languages, tax registration numbers, different VAT rates and, soon, structured e-invoices.</w:t>
+        <w:t xml:space="preserve">Regional invoices follow their own conventions: two languages on one page, tax registration numbers, VAT rates that differ by country and, increasingly, structured e-invoices. All of it is handled as standard.</w:t>
       </w:r>
     </w:p>
     <w:p>
@@ -2087,7 +2122,7 @@
           <w:sz w:val="22"/>
           <w:szCs w:val="22"/>
         </w:rPr>
-        <w:t xml:space="preserve">Right-to-left layouts and supplier names in Arabic are read as standard.</w:t>
+        <w:t xml:space="preserve">Arabic, English and mixed-language invoices are read as standard, including right-to-left layouts and supplier names written in Arabic.</w:t>
       </w:r>
     </w:p>
     <w:p>
@@ -2114,7 +2149,7 @@
           <w:sz w:val="22"/>
           <w:szCs w:val="22"/>
         </w:rPr>
-        <w:t xml:space="preserve">The supplier TRN, the VAT rate and every tax line are checked before posting.</w:t>
+        <w:t xml:space="preserve">The supplier's TRN, the VAT rate applied and the arithmetic of every tax line are checked before an invoice can post.</w:t>
       </w:r>
     </w:p>
     <w:p>
@@ -2141,7 +2176,7 @@
           <w:sz w:val="22"/>
           <w:szCs w:val="22"/>
         </w:rPr>
-        <w:t xml:space="preserve">AED, SAR, QAR, KWD, BHD and OMR, with three-decimal currencies handled exactly.</w:t>
+        <w:t xml:space="preserve">AED, SAR, QAR, KWD, BHD and OMR, plus USD and EUR for overseas suppliers, with three-decimal currencies handled to the last fils.</w:t>
       </w:r>
     </w:p>
     <w:p>
@@ -2168,7 +2203,7 @@
           <w:sz w:val="22"/>
           <w:szCs w:val="22"/>
         </w:rPr>
-        <w:t xml:space="preserve">E-invoicing is being phased in from 2027 [CONFIRM]. Structured invoices are processed alongside scans and PDFs.</w:t>
+        <w:t xml:space="preserve">As UAE e-invoicing comes into force from 2027 [CONFIRM], structured invoices will reach you through your Accredited Service Provider. They are processed alongside the scans and PDFs you still receive.</w:t>
       </w:r>
     </w:p>
     <w:p>
@@ -2222,7 +2257,7 @@
           <w:sz w:val="22"/>
           <w:szCs w:val="22"/>
         </w:rPr>
-        <w:t xml:space="preserve">Implemented and supported from Dubai in your time zone, backed by the HLB network.</w:t>
+        <w:t xml:space="preserve">Implemented and supported from Dubai, in your time zone, by a team backed by the HLB International network.</w:t>
       </w:r>
     </w:p>
     <w:p>
@@ -2291,20 +2326,20 @@
           <w:b/>
           <w:bCs/>
         </w:rPr>
-        <w:t xml:space="preserve">More than invoice processing software</w:t>
-      </w:r>
-    </w:p>
-    <w:p>
-      <w:pPr>
-        <w:spacing w:after="120" w:line="276"/>
-      </w:pPr>
-      <w:r>
-        <w:rPr>
-          <w:rFonts w:ascii="Calibri" w:cs="Calibri" w:eastAsia="Calibri" w:hAnsi="Calibri"/>
-          <w:sz w:val="22"/>
-          <w:szCs w:val="22"/>
-        </w:rPr>
-        <w:t xml:space="preserve">Software alone rarely fixes accounts payable. HLB HAMT assesses your process, implements HAMT AI, integrates your ERP and keeps optimising after go-live, through one accountable team.</w:t>
+        <w:t xml:space="preserve">A services partner, not just invoice processing software</w:t>
+      </w:r>
+    </w:p>
+    <w:p>
+      <w:pPr>
+        <w:spacing w:after="120" w:line="276"/>
+      </w:pPr>
+      <w:r>
+        <w:rPr>
+          <w:rFonts w:ascii="Calibri" w:cs="Calibri" w:eastAsia="Calibri" w:hAnsi="Calibri"/>
+          <w:sz w:val="22"/>
+          <w:szCs w:val="22"/>
+        </w:rPr>
+        <w:t xml:space="preserve">Software alone rarely fixes accounts payable. Mid-sized rollouts and enterprise programmes follow the same four steps, delivered by one team. Only the number of entities, countries and invoice types changes.</w:t>
       </w:r>
     </w:p>
     <w:p>
@@ -2331,7 +2366,7 @@
           <w:sz w:val="22"/>
           <w:szCs w:val="22"/>
         </w:rPr>
-        <w:t xml:space="preserve">We map your AP process, volumes, controls and ERP, then agree the outcomes to measure.</w:t>
+        <w:t xml:space="preserve">We map your AP process, invoice volumes, ERP and controls, and agree the outcomes you want to measure.</w:t>
       </w:r>
     </w:p>
     <w:p>
@@ -2358,7 +2393,7 @@
           <w:sz w:val="22"/>
           <w:szCs w:val="22"/>
         </w:rPr>
-        <w:t xml:space="preserve">We configure HAMT AI, rules and approvals, and pilot on your own invoices for one entity.</w:t>
+        <w:t xml:space="preserve">We configure HAMT AI, matching and approvals, then pilot on your own invoices for one entity or supplier group, so you see results on real documents.</w:t>
       </w:r>
     </w:p>
     <w:p>
@@ -2412,154 +2447,7 @@
           <w:sz w:val="22"/>
           <w:szCs w:val="22"/>
         </w:rPr>
-        <w:t xml:space="preserve">We monitor review rates, retrain models, tune rules and extend to more entities.</w:t>
-      </w:r>
-    </w:p>
-    <w:p>
-      <w:pPr>
-        <w:pStyle w:val="Heading3"/>
-        <w:spacing w:after="80" w:before="200"/>
-      </w:pPr>
-      <w:r>
-        <w:rPr>
-          <w:rFonts w:ascii="Calibri" w:cs="Calibri" w:eastAsia="Calibri" w:hAnsi="Calibri"/>
-          <w:b/>
-          <w:bCs/>
-        </w:rPr>
-        <w:t xml:space="preserve">Ongoing optimisation, not a one-off project</w:t>
-      </w:r>
-    </w:p>
-    <w:p>
-      <w:pPr>
-        <w:spacing w:after="120" w:line="276"/>
-      </w:pPr>
-      <w:r>
-        <w:rPr>
-          <w:rFonts w:ascii="Calibri" w:cs="Calibri" w:eastAsia="Calibri" w:hAnsi="Calibri"/>
-          <w:sz w:val="22"/>
-          <w:szCs w:val="22"/>
-        </w:rPr>
-        <w:t xml:space="preserve">After go-live we review exception reasons, review rates and supplier trends with your finance team each period, tune the rules and extend HAMT AI to new invoice types and entities. The system keeps improving, and so does the value you get from it.</w:t>
-      </w:r>
-    </w:p>
-    <w:p>
-      <w:pPr>
-        <w:pStyle w:val="Heading3"/>
-        <w:spacing w:after="80" w:before="200"/>
-      </w:pPr>
-      <w:r>
-        <w:rPr>
-          <w:rFonts w:ascii="Calibri" w:cs="Calibri" w:eastAsia="Calibri" w:hAnsi="Calibri"/>
-          <w:b/>
-          <w:bCs/>
-        </w:rPr>
-        <w:t xml:space="preserve">Audit-grade controls</w:t>
-      </w:r>
-    </w:p>
-    <w:p>
-      <w:pPr>
-        <w:spacing w:after="120" w:line="276"/>
-      </w:pPr>
-      <w:r>
-        <w:rPr>
-          <w:rFonts w:ascii="Calibri" w:cs="Calibri" w:eastAsia="Calibri" w:hAnsi="Calibri"/>
-          <w:sz w:val="22"/>
-          <w:szCs w:val="22"/>
-        </w:rPr>
-        <w:t xml:space="preserve">Segregation of duties, approval limits and a full audit trail in every workflow.</w:t>
-      </w:r>
-    </w:p>
-    <w:p>
-      <w:pPr>
-        <w:pStyle w:val="Heading3"/>
-        <w:spacing w:after="80" w:before="200"/>
-      </w:pPr>
-      <w:r>
-        <w:rPr>
-          <w:rFonts w:ascii="Calibri" w:cs="Calibri" w:eastAsia="Calibri" w:hAnsi="Calibri"/>
-          <w:b/>
-          <w:bCs/>
-        </w:rPr>
-        <w:t xml:space="preserve">Tax expertise in-house</w:t>
-      </w:r>
-    </w:p>
-    <w:p>
-      <w:pPr>
-        <w:spacing w:after="120" w:line="276"/>
-      </w:pPr>
-      <w:r>
-        <w:rPr>
-          <w:rFonts w:ascii="Calibri" w:cs="Calibri" w:eastAsia="Calibri" w:hAnsi="Calibri"/>
-          <w:sz w:val="22"/>
-          <w:szCs w:val="22"/>
-        </w:rPr>
-        <w:t xml:space="preserve">Our tax advisors know UAE VAT record-keeping and the e-invoicing changes ahead.</w:t>
-      </w:r>
-    </w:p>
-    <w:p>
-      <w:pPr>
-        <w:pStyle w:val="Heading3"/>
-        <w:spacing w:after="80" w:before="200"/>
-      </w:pPr>
-      <w:r>
-        <w:rPr>
-          <w:rFonts w:ascii="Calibri" w:cs="Calibri" w:eastAsia="Calibri" w:hAnsi="Calibri"/>
-          <w:b/>
-          <w:bCs/>
-        </w:rPr>
-        <w:t xml:space="preserve">ERP integration</w:t>
-      </w:r>
-    </w:p>
-    <w:p>
-      <w:pPr>
-        <w:spacing w:after="120" w:line="276"/>
-      </w:pPr>
-      <w:r>
-        <w:rPr>
-          <w:rFonts w:ascii="Calibri" w:cs="Calibri" w:eastAsia="Calibri" w:hAnsi="Calibri"/>
-          <w:sz w:val="22"/>
-          <w:szCs w:val="22"/>
-        </w:rPr>
-        <w:t xml:space="preserve">SAP, Oracle, Dynamics 365, Sage, Odoo, Zoho Books and in-house systems through APIs.</w:t>
-      </w:r>
-    </w:p>
-    <w:p>
-      <w:pPr>
-        <w:spacing w:after="120" w:line="276"/>
-      </w:pPr>
-      <w:r>
-        <w:rPr>
-          <w:rFonts w:ascii="Calibri" w:cs="Calibri" w:eastAsia="Calibri" w:hAnsi="Calibri"/>
-          <w:sz w:val="22"/>
-          <w:szCs w:val="22"/>
-        </w:rPr>
-        <w:t xml:space="preserve">Start with a process assessment</w:t>
-      </w:r>
-    </w:p>
-    <w:p>
-      <w:pPr>
-        <w:spacing w:after="120" w:line="276"/>
-      </w:pPr>
-      <w:r>
-        <w:rPr>
-          <w:rFonts w:ascii="Calibri" w:cs="Calibri" w:eastAsia="Calibri" w:hAnsi="Calibri"/>
-          <w:sz w:val="22"/>
-          <w:szCs w:val="22"/>
-        </w:rPr>
-        <w:t xml:space="preserve">We map your AP process and agree the outcomes to measure before anything is configured.</w:t>
-      </w:r>
-    </w:p>
-    <w:p>
-      <w:pPr>
-        <w:spacing w:after="120" w:line="276"/>
-      </w:pPr>
-      <w:r>
-        <w:rPr>
-          <w:rFonts w:ascii="Calibri" w:cs="Calibri" w:eastAsia="Calibri" w:hAnsi="Calibri"/>
-          <w:sz w:val="22"/>
-          <w:szCs w:val="22"/>
-        </w:rPr>
-        <w:t xml:space="preserve">Button: Request an assessment</w:t>
+        <w:t xml:space="preserve">We monitor, tune and support the platform after go-live, with regular service reviews, and extend it to more entities, countries and invoice types, configuring matching and approvals for each.</w:t>
       </w:r>
     </w:p>
     <w:p>
@@ -2575,7 +2463,7 @@
           <w:sz w:val="18"/>
           <w:szCs w:val="18"/>
         </w:rPr>
-        <w:t xml:space="preserve">INVOICE AUTOMATION FAQS</w:t>
+        <w:t xml:space="preserve">WHY HLB HAMT</w:t>
       </w:r>
     </w:p>
     <w:p>
@@ -2589,7 +2477,20 @@
           <w:b/>
           <w:bCs/>
         </w:rPr>
-        <w:t xml:space="preserve">Questions finance leaders ask us</w:t>
+        <w:t xml:space="preserve">Built by auditors. Delivered by technologists.</w:t>
+      </w:r>
+    </w:p>
+    <w:p>
+      <w:pPr>
+        <w:spacing w:after="120" w:line="276"/>
+      </w:pPr>
+      <w:r>
+        <w:rPr>
+          <w:rFonts w:ascii="Calibri" w:cs="Calibri" w:eastAsia="Calibri" w:hAnsi="Calibri"/>
+          <w:sz w:val="22"/>
+          <w:szCs w:val="22"/>
+        </w:rPr>
+        <w:t xml:space="preserve">HLB HAMT is an advisory and accounting firm with its own technology division. The people who design your invoice workflows understand the controls an auditor will test, the VAT rules your invoices must meet and the ERP they flow into.</w:t>
       </w:r>
     </w:p>
     <w:p>
@@ -2603,20 +2504,20 @@
           <w:b/>
           <w:bCs/>
         </w:rPr>
-        <w:t xml:space="preserve">What is invoice automation?</w:t>
-      </w:r>
-    </w:p>
-    <w:p>
-      <w:pPr>
-        <w:spacing w:after="120" w:line="276"/>
-      </w:pPr>
-      <w:r>
-        <w:rPr>
-          <w:rFonts w:ascii="Calibri" w:cs="Calibri" w:eastAsia="Calibri" w:hAnsi="Calibri"/>
-          <w:sz w:val="22"/>
-          <w:szCs w:val="22"/>
-        </w:rPr>
-        <w:t xml:space="preserve">Invoice automation uses software and AI to handle supplier invoices from receipt to ERP posting: capturing the data, matching it to purchase orders and receipts, routing approvals and archiving. It replaces manual keying and chasing, and forms part of accounts payable automation.</w:t>
+        <w:t xml:space="preserve">Audit-grade controls</w:t>
+      </w:r>
+    </w:p>
+    <w:p>
+      <w:pPr>
+        <w:spacing w:after="120" w:line="276"/>
+      </w:pPr>
+      <w:r>
+        <w:rPr>
+          <w:rFonts w:ascii="Calibri" w:cs="Calibri" w:eastAsia="Calibri" w:hAnsi="Calibri"/>
+          <w:sz w:val="22"/>
+          <w:szCs w:val="22"/>
+        </w:rPr>
+        <w:t xml:space="preserve">Segregation of duties, approval limits, maker-checker review and a full audit trail are part of every workflow.</w:t>
       </w:r>
     </w:p>
     <w:p>
@@ -2630,20 +2531,20 @@
           <w:b/>
           <w:bCs/>
         </w:rPr>
-        <w:t xml:space="preserve">How is AI invoice automation different from basic OCR?</w:t>
-      </w:r>
-    </w:p>
-    <w:p>
-      <w:pPr>
-        <w:spacing w:after="120" w:line="276"/>
-      </w:pPr>
-      <w:r>
-        <w:rPr>
-          <w:rFonts w:ascii="Calibri" w:cs="Calibri" w:eastAsia="Calibri" w:hAnsi="Calibri"/>
-          <w:sz w:val="22"/>
-          <w:szCs w:val="22"/>
-        </w:rPr>
-        <w:t xml:space="preserve">OCR only reads text. AI invoice automation adds intelligent document processing, so invoice data extraction understands layouts, line items and suppliers, scores its own confidence and learns from corrections. HAMT AI also applies your matching and VAT rules.</w:t>
+        <w:t xml:space="preserve">Tax expertise in-house</w:t>
+      </w:r>
+    </w:p>
+    <w:p>
+      <w:pPr>
+        <w:spacing w:after="120" w:line="276"/>
+      </w:pPr>
+      <w:r>
+        <w:rPr>
+          <w:rFonts w:ascii="Calibri" w:cs="Calibri" w:eastAsia="Calibri" w:hAnsi="Calibri"/>
+          <w:sz w:val="22"/>
+          <w:szCs w:val="22"/>
+        </w:rPr>
+        <w:t xml:space="preserve">Our tax advisors know the UAE VAT and Corporate Tax record-keeping rules your invoices must meet, and the e-invoicing changes ahead.</w:t>
       </w:r>
     </w:p>
     <w:p>
@@ -2657,20 +2558,20 @@
           <w:b/>
           <w:bCs/>
         </w:rPr>
-        <w:t xml:space="preserve">What is HAMT AI?</w:t>
-      </w:r>
-    </w:p>
-    <w:p>
-      <w:pPr>
-        <w:spacing w:after="120" w:line="276"/>
-      </w:pPr>
-      <w:r>
-        <w:rPr>
-          <w:rFonts w:ascii="Calibri" w:cs="Calibri" w:eastAsia="Calibri" w:hAnsi="Calibri"/>
-          <w:sz w:val="22"/>
-          <w:szCs w:val="22"/>
-        </w:rPr>
-        <w:t xml:space="preserve">HAMT AI is HLB HAMT's own AI. HAMT stands for Human-integrated, Automation, Machine learning and Transformation. In invoice automation it reads invoices, applies your controls and learns from reviewer corrections. It is built and supported by HLB HAMT, so the models, rules and controls are tuned by the same team that implements your rollout.</w:t>
+        <w:t xml:space="preserve">One accountable team</w:t>
+      </w:r>
+    </w:p>
+    <w:p>
+      <w:pPr>
+        <w:spacing w:after="120" w:line="276"/>
+      </w:pPr>
+      <w:r>
+        <w:rPr>
+          <w:rFonts w:ascii="Calibri" w:cs="Calibri" w:eastAsia="Calibri" w:hAnsi="Calibri"/>
+          <w:sz w:val="22"/>
+          <w:szCs w:val="22"/>
+        </w:rPr>
+        <w:t xml:space="preserve">Process review, configuration, ERP integration, training and support after go-live, delivered by one team.</w:t>
       </w:r>
     </w:p>
     <w:p>
@@ -2684,20 +2585,63 @@
           <w:b/>
           <w:bCs/>
         </w:rPr>
-        <w:t xml:space="preserve">Do people still review invoices?</w:t>
-      </w:r>
-    </w:p>
-    <w:p>
-      <w:pPr>
-        <w:spacing w:after="120" w:line="276"/>
-      </w:pPr>
-      <w:r>
-        <w:rPr>
-          <w:rFonts w:ascii="Calibri" w:cs="Calibri" w:eastAsia="Calibri" w:hAnsi="Calibri"/>
-          <w:sz w:val="22"/>
-          <w:szCs w:val="22"/>
-        </w:rPr>
-        <w:t xml:space="preserve">Yes, by design. Clean invoices flow through, while uncertain or failed ones go to a reviewer with the reason attached. Each correction retrains the models, so reviewers see fewer invoices over time.</w:t>
+        <w:t xml:space="preserve">Local presence, global reach</w:t>
+      </w:r>
+    </w:p>
+    <w:p>
+      <w:pPr>
+        <w:spacing w:after="120" w:line="276"/>
+      </w:pPr>
+      <w:r>
+        <w:rPr>
+          <w:rFonts w:ascii="Calibri" w:cs="Calibri" w:eastAsia="Calibri" w:hAnsi="Calibri"/>
+          <w:sz w:val="22"/>
+          <w:szCs w:val="22"/>
+        </w:rPr>
+        <w:t xml:space="preserve">A Dubai-based team, backed by HLB, the global advisory and accounting network in more than 150 countries [CONFIRM].</w:t>
+      </w:r>
+    </w:p>
+    <w:p>
+      <w:pPr>
+        <w:spacing w:after="40" w:before="200"/>
+      </w:pPr>
+      <w:r>
+        <w:rPr>
+          <w:rFonts w:ascii="Calibri" w:cs="Calibri" w:eastAsia="Calibri" w:hAnsi="Calibri"/>
+          <w:b/>
+          <w:bCs/>
+          <w:color w:val="0A6E65"/>
+          <w:sz w:val="18"/>
+          <w:szCs w:val="18"/>
+        </w:rPr>
+        <w:t xml:space="preserve">ERP INTEGRATION</w:t>
+      </w:r>
+    </w:p>
+    <w:p>
+      <w:pPr>
+        <w:pStyle w:val="Heading2"/>
+        <w:spacing w:after="120" w:before="320"/>
+      </w:pPr>
+      <w:r>
+        <w:rPr>
+          <w:rFonts w:ascii="Calibri" w:cs="Calibri" w:eastAsia="Calibri" w:hAnsi="Calibri"/>
+          <w:b/>
+          <w:bCs/>
+        </w:rPr>
+        <w:t xml:space="preserve">Works with the ERP you already run</w:t>
+      </w:r>
+    </w:p>
+    <w:p>
+      <w:pPr>
+        <w:spacing w:after="120" w:line="276"/>
+      </w:pPr>
+      <w:r>
+        <w:rPr>
+          <w:rFonts w:ascii="Calibri" w:cs="Calibri" w:eastAsia="Calibri" w:hAnsi="Calibri"/>
+          <w:sz w:val="22"/>
+          <w:szCs w:val="22"/>
+        </w:rPr>
+        <w:t xml:space="preserve">Invoice automation sits between the invoices you receive and the ERP that records them. Your ERP stays the system of record. We make sure everything that reaches it is complete, checked and approved.</w:t>
       </w:r>
     </w:p>
     <w:p>
@@ -2711,20 +2655,38 @@
           <w:b/>
           <w:bCs/>
         </w:rPr>
-        <w:t xml:space="preserve">Which ERPs does it integrate with?</w:t>
-      </w:r>
-    </w:p>
-    <w:p>
-      <w:pPr>
-        <w:spacing w:after="120" w:line="276"/>
-      </w:pPr>
-      <w:r>
-        <w:rPr>
-          <w:rFonts w:ascii="Calibri" w:cs="Calibri" w:eastAsia="Calibri" w:hAnsi="Calibri"/>
-          <w:sz w:val="22"/>
-          <w:szCs w:val="22"/>
-        </w:rPr>
-        <w:t xml:space="preserve">We integrate with SAP, Oracle, Microsoft Dynamics 365, Sage, Odoo, Zoho Books and in-house systems through APIs. Unlike standalone invoice processing software, our team scopes and builds the integration with your IT team.</w:t>
+        <w:t xml:space="preserve">ERP and accounting</w:t>
+      </w:r>
+    </w:p>
+    <w:p>
+      <w:pPr>
+        <w:pStyle w:val="ListParagraph"/>
+        <w:numPr>
+          <w:ilvl w:val="0"/>
+          <w:numId w:val="2"/>
+        </w:numPr>
+        <w:spacing w:after="60" w:line="276"/>
+      </w:pPr>
+      <w:r>
+        <w:rPr>
+          <w:rFonts w:ascii="Calibri" w:cs="Calibri" w:eastAsia="Calibri" w:hAnsi="Calibri"/>
+          <w:sz w:val="22"/>
+          <w:szCs w:val="22"/>
+        </w:rPr>
+        <w:t xml:space="preserve">Enterprise ERP platforms · Mid-market accounting systems · In-house ERPs via API</w:t>
+      </w:r>
+    </w:p>
+    <w:p>
+      <w:pPr>
+        <w:spacing w:after="120" w:line="276"/>
+      </w:pPr>
+      <w:r>
+        <w:rPr>
+          <w:rFonts w:ascii="Calibri" w:cs="Calibri" w:eastAsia="Calibri" w:hAnsi="Calibri"/>
+          <w:sz w:val="22"/>
+          <w:szCs w:val="22"/>
+        </w:rPr>
+        <w:t xml:space="preserve">Posting data is prepared to your chart of accounts, cost centres and tax codes, with the original invoice linked to the ERP entry.</w:t>
       </w:r>
     </w:p>
     <w:p>
@@ -2738,20 +2700,368 @@
           <w:b/>
           <w:bCs/>
         </w:rPr>
-        <w:t xml:space="preserve">How long does implementation take?</w:t>
-      </w:r>
-    </w:p>
-    <w:p>
-      <w:pPr>
-        <w:spacing w:after="120" w:line="276"/>
-      </w:pPr>
-      <w:r>
-        <w:rPr>
-          <w:rFonts w:ascii="Calibri" w:cs="Calibri" w:eastAsia="Calibri" w:hAnsi="Calibri"/>
-          <w:sz w:val="22"/>
-          <w:szCs w:val="22"/>
-        </w:rPr>
-        <w:t xml:space="preserve">It depends on the number of entities, invoice types and your ERP. Our assessment sets the plan, usually starting with one entity or supplier group so you see results early, then scaling out. Group rollouts go entity by entity.</w:t>
+        <w:t xml:space="preserve">Invoice channels</w:t>
+      </w:r>
+    </w:p>
+    <w:p>
+      <w:pPr>
+        <w:pStyle w:val="ListParagraph"/>
+        <w:numPr>
+          <w:ilvl w:val="0"/>
+          <w:numId w:val="2"/>
+        </w:numPr>
+        <w:spacing w:after="60" w:line="276"/>
+      </w:pPr>
+      <w:r>
+        <w:rPr>
+          <w:rFonts w:ascii="Calibri" w:cs="Calibri" w:eastAsia="Calibri" w:hAnsi="Calibri"/>
+          <w:sz w:val="22"/>
+          <w:szCs w:val="22"/>
+        </w:rPr>
+        <w:t xml:space="preserve">Email inboxes · Scanners and shared folders · Supplier portals · Peppol via your ASP · EDI</w:t>
+      </w:r>
+    </w:p>
+    <w:p>
+      <w:pPr>
+        <w:spacing w:after="120" w:line="276"/>
+      </w:pPr>
+      <w:r>
+        <w:rPr>
+          <w:rFonts w:ascii="Calibri" w:cs="Calibri" w:eastAsia="Calibri" w:hAnsi="Calibri"/>
+          <w:sz w:val="22"/>
+          <w:szCs w:val="22"/>
+        </w:rPr>
+        <w:t xml:space="preserve">Every route an invoice takes into your business feeds one queue, so nothing is missed or processed twice.</w:t>
+      </w:r>
+    </w:p>
+    <w:p>
+      <w:pPr>
+        <w:pStyle w:val="Heading3"/>
+        <w:spacing w:after="80" w:before="200"/>
+      </w:pPr>
+      <w:r>
+        <w:rPr>
+          <w:rFonts w:ascii="Calibri" w:cs="Calibri" w:eastAsia="Calibri" w:hAnsi="Calibri"/>
+          <w:b/>
+          <w:bCs/>
+        </w:rPr>
+        <w:t xml:space="preserve">Reporting</w:t>
+      </w:r>
+    </w:p>
+    <w:p>
+      <w:pPr>
+        <w:pStyle w:val="ListParagraph"/>
+        <w:numPr>
+          <w:ilvl w:val="0"/>
+          <w:numId w:val="2"/>
+        </w:numPr>
+        <w:spacing w:after="60" w:line="276"/>
+      </w:pPr>
+      <w:r>
+        <w:rPr>
+          <w:rFonts w:ascii="Calibri" w:cs="Calibri" w:eastAsia="Calibri" w:hAnsi="Calibri"/>
+          <w:sz w:val="22"/>
+          <w:szCs w:val="22"/>
+        </w:rPr>
+        <w:t xml:space="preserve">BI dashboards · Your data warehouse · Excel</w:t>
+      </w:r>
+    </w:p>
+    <w:p>
+      <w:pPr>
+        <w:spacing w:after="120" w:line="276"/>
+      </w:pPr>
+      <w:r>
+        <w:rPr>
+          <w:rFonts w:ascii="Calibri" w:cs="Calibri" w:eastAsia="Calibri" w:hAnsi="Calibri"/>
+          <w:sz w:val="22"/>
+          <w:szCs w:val="22"/>
+        </w:rPr>
+        <w:t xml:space="preserve">AP ageing, cycle times, exception rates and approver turnaround feed the dashboards your finance leaders already use.</w:t>
+      </w:r>
+    </w:p>
+    <w:p>
+      <w:pPr>
+        <w:pStyle w:val="ListParagraph"/>
+        <w:numPr>
+          <w:ilvl w:val="0"/>
+          <w:numId w:val="2"/>
+        </w:numPr>
+        <w:spacing w:after="60" w:line="276"/>
+      </w:pPr>
+      <w:r>
+        <w:rPr>
+          <w:rFonts w:ascii="Calibri" w:cs="Calibri" w:eastAsia="Calibri" w:hAnsi="Calibri"/>
+          <w:sz w:val="22"/>
+          <w:szCs w:val="22"/>
+        </w:rPr>
+        <w:t xml:space="preserve">Matching tolerances, posting rules and approval limits are agreed with your finance team before go-live.</w:t>
+      </w:r>
+    </w:p>
+    <w:p>
+      <w:pPr>
+        <w:pStyle w:val="ListParagraph"/>
+        <w:numPr>
+          <w:ilvl w:val="0"/>
+          <w:numId w:val="2"/>
+        </w:numPr>
+        <w:spacing w:after="60" w:line="276"/>
+      </w:pPr>
+      <w:r>
+        <w:rPr>
+          <w:rFonts w:ascii="Calibri" w:cs="Calibri" w:eastAsia="Calibri" w:hAnsi="Calibri"/>
+          <w:sz w:val="22"/>
+          <w:szCs w:val="22"/>
+        </w:rPr>
+        <w:t xml:space="preserve">Every transfer to the ERP is logged and reconciled, so a missing or duplicated posting is caught quickly.</w:t>
+      </w:r>
+    </w:p>
+    <w:p>
+      <w:pPr>
+        <w:pStyle w:val="ListParagraph"/>
+        <w:numPr>
+          <w:ilvl w:val="0"/>
+          <w:numId w:val="2"/>
+        </w:numPr>
+        <w:spacing w:after="60" w:line="276"/>
+      </w:pPr>
+      <w:r>
+        <w:rPr>
+          <w:rFonts w:ascii="Calibri" w:cs="Calibri" w:eastAsia="Calibri" w:hAnsi="Calibri"/>
+          <w:sz w:val="22"/>
+          <w:szCs w:val="22"/>
+        </w:rPr>
+        <w:t xml:space="preserve">Integrations are documented and monitored, so they never depend on one person's knowledge.</w:t>
+      </w:r>
+    </w:p>
+    <w:p>
+      <w:pPr>
+        <w:spacing w:after="120" w:line="276"/>
+      </w:pPr>
+      <w:r>
+        <w:rPr>
+          <w:rFonts w:ascii="Calibri" w:cs="Calibri" w:eastAsia="Calibri" w:hAnsi="Calibri"/>
+          <w:sz w:val="22"/>
+          <w:szCs w:val="22"/>
+        </w:rPr>
+        <w:t xml:space="preserve">Start with a process assessment</w:t>
+      </w:r>
+    </w:p>
+    <w:p>
+      <w:pPr>
+        <w:spacing w:after="120" w:line="276"/>
+      </w:pPr>
+      <w:r>
+        <w:rPr>
+          <w:rFonts w:ascii="Calibri" w:cs="Calibri" w:eastAsia="Calibri" w:hAnsi="Calibri"/>
+          <w:sz w:val="22"/>
+          <w:szCs w:val="22"/>
+        </w:rPr>
+        <w:t xml:space="preserve">We map your AP process and agree the outcomes to measure before anything is configured.</w:t>
+      </w:r>
+    </w:p>
+    <w:p>
+      <w:pPr>
+        <w:spacing w:after="120" w:line="276"/>
+      </w:pPr>
+      <w:r>
+        <w:rPr>
+          <w:rFonts w:ascii="Calibri" w:cs="Calibri" w:eastAsia="Calibri" w:hAnsi="Calibri"/>
+          <w:sz w:val="22"/>
+          <w:szCs w:val="22"/>
+        </w:rPr>
+        <w:t xml:space="preserve">Button: Request an assessment</w:t>
+      </w:r>
+    </w:p>
+    <w:p>
+      <w:pPr>
+        <w:spacing w:after="40" w:before="200"/>
+      </w:pPr>
+      <w:r>
+        <w:rPr>
+          <w:rFonts w:ascii="Calibri" w:cs="Calibri" w:eastAsia="Calibri" w:hAnsi="Calibri"/>
+          <w:b/>
+          <w:bCs/>
+          <w:color w:val="0A6E65"/>
+          <w:sz w:val="18"/>
+          <w:szCs w:val="18"/>
+        </w:rPr>
+        <w:t xml:space="preserve">INVOICE AUTOMATION FAQS</w:t>
+      </w:r>
+    </w:p>
+    <w:p>
+      <w:pPr>
+        <w:pStyle w:val="Heading2"/>
+        <w:spacing w:after="120" w:before="320"/>
+      </w:pPr>
+      <w:r>
+        <w:rPr>
+          <w:rFonts w:ascii="Calibri" w:cs="Calibri" w:eastAsia="Calibri" w:hAnsi="Calibri"/>
+          <w:b/>
+          <w:bCs/>
+        </w:rPr>
+        <w:t xml:space="preserve">Questions finance leaders ask us</w:t>
+      </w:r>
+    </w:p>
+    <w:p>
+      <w:pPr>
+        <w:pStyle w:val="Heading3"/>
+        <w:spacing w:after="80" w:before="200"/>
+      </w:pPr>
+      <w:r>
+        <w:rPr>
+          <w:rFonts w:ascii="Calibri" w:cs="Calibri" w:eastAsia="Calibri" w:hAnsi="Calibri"/>
+          <w:b/>
+          <w:bCs/>
+        </w:rPr>
+        <w:t xml:space="preserve">What is invoice automation, and how does it differ from accounts payable automation?</w:t>
+      </w:r>
+    </w:p>
+    <w:p>
+      <w:pPr>
+        <w:spacing w:after="120" w:line="276"/>
+      </w:pPr>
+      <w:r>
+        <w:rPr>
+          <w:rFonts w:ascii="Calibri" w:cs="Calibri" w:eastAsia="Calibri" w:hAnsi="Calibri"/>
+          <w:sz w:val="22"/>
+          <w:szCs w:val="22"/>
+        </w:rPr>
+        <w:t xml:space="preserve">Invoice automation uses software and AI to handle supplier invoices from the moment they arrive: capturing the data, checking it against purchase orders and receipts, routing approvals, posting to the ERP and archiving. It replaces manual keying and approval chasing, which shortens processing time and reduces errors and cost. Accounts payable automation is broader and also covers supplier onboarding, payment runs, reconciliations and AP reporting. We start with invoice processing and can extend across the wider purchase-to-pay cycle.</w:t>
+      </w:r>
+    </w:p>
+    <w:p>
+      <w:pPr>
+        <w:pStyle w:val="Heading3"/>
+        <w:spacing w:after="80" w:before="200"/>
+      </w:pPr>
+      <w:r>
+        <w:rPr>
+          <w:rFonts w:ascii="Calibri" w:cs="Calibri" w:eastAsia="Calibri" w:hAnsi="Calibri"/>
+          <w:b/>
+          <w:bCs/>
+        </w:rPr>
+        <w:t xml:space="preserve">How does AI invoice automation work, and how is it different from basic OCR?</w:t>
+      </w:r>
+    </w:p>
+    <w:p>
+      <w:pPr>
+        <w:spacing w:after="120" w:line="276"/>
+      </w:pPr>
+      <w:r>
+        <w:rPr>
+          <w:rFonts w:ascii="Calibri" w:cs="Calibri" w:eastAsia="Calibri" w:hAnsi="Calibri"/>
+          <w:sz w:val="22"/>
+          <w:szCs w:val="22"/>
+        </w:rPr>
+        <w:t xml:space="preserve">An invoice is captured on arrival by email, scanner or e-invoice. HAMT AI reads it, and the platform checks it against the purchase order, goods receipt and your VAT rules. It then goes to the right approver, and once approved the posting data is sent to your ERP. OCR only reads text. Intelligent document processing adds invoice data extraction that understands layouts, line items and suppliers, scores its own confidence and learns from corrections. Arabic, English and mixed-language invoices, including faded, skewed and dot-matrix prints, are read as standard.</w:t>
+      </w:r>
+    </w:p>
+    <w:p>
+      <w:pPr>
+        <w:pStyle w:val="Heading3"/>
+        <w:spacing w:after="80" w:before="200"/>
+      </w:pPr>
+      <w:r>
+        <w:rPr>
+          <w:rFonts w:ascii="Calibri" w:cs="Calibri" w:eastAsia="Calibri" w:hAnsi="Calibri"/>
+          <w:b/>
+          <w:bCs/>
+        </w:rPr>
+        <w:t xml:space="preserve">What is HAMT AI, and do people still review invoices?</w:t>
+      </w:r>
+    </w:p>
+    <w:p>
+      <w:pPr>
+        <w:spacing w:after="120" w:line="276"/>
+      </w:pPr>
+      <w:r>
+        <w:rPr>
+          <w:rFonts w:ascii="Calibri" w:cs="Calibri" w:eastAsia="Calibri" w:hAnsi="Calibri"/>
+          <w:sz w:val="22"/>
+          <w:szCs w:val="22"/>
+        </w:rPr>
+        <w:t xml:space="preserve">HAMT AI is HLB HAMT's own AI. HAMT stands for Human-integrated, Automation, Machine learning and Transformation. Clean invoices flow through, while uncertain or failed ones go to a reviewer with the reason attached, instead of being guessed. Each correction retrains the models, so reviewers see fewer invoices over time. HLB HAMT builds and supports it, so the team that implements your rollout also tunes the models, rules and controls.</w:t>
+      </w:r>
+    </w:p>
+    <w:p>
+      <w:pPr>
+        <w:pStyle w:val="Heading3"/>
+        <w:spacing w:after="80" w:before="200"/>
+      </w:pPr>
+      <w:r>
+        <w:rPr>
+          <w:rFonts w:ascii="Calibri" w:cs="Calibri" w:eastAsia="Calibri" w:hAnsi="Calibri"/>
+          <w:b/>
+          <w:bCs/>
+        </w:rPr>
+        <w:t xml:space="preserve">Is it suitable for mid-sized companies and large enterprises, and how does it fit our ERP?</w:t>
+      </w:r>
+    </w:p>
+    <w:p>
+      <w:pPr>
+        <w:spacing w:after="120" w:line="276"/>
+      </w:pPr>
+      <w:r>
+        <w:rPr>
+          <w:rFonts w:ascii="Calibri" w:cs="Calibri" w:eastAsia="Calibri" w:hAnsi="Calibri"/>
+          <w:sz w:val="22"/>
+          <w:szCs w:val="22"/>
+        </w:rPr>
+        <w:t xml:space="preserve">Yes. Mid-sized companies usually start in the cloud with ready-to-use workflows and one or two entities, and go live quickly. Large enterprises and groups add multi-level approval hierarchies, enterprise ERP integration, private hosting and shared service centre operation. Both run on the same platform, so you never switch systems as you grow. We integrate with leading ERP and accounting systems and in-house platforms through APIs or structured file imports, agreed with your IT team during scoping. Approvers work in our own web and mobile screens, so they need no ERP access. Hosting can be cloud, private cloud or your own servers, with invoice data kept inside the UAE if you need it, and we document the architecture for your IT and security teams before go-live. Unlike standalone invoice processing software, our team scopes and builds all of this with you.</w:t>
+      </w:r>
+    </w:p>
+    <w:p>
+      <w:pPr>
+        <w:pStyle w:val="Heading3"/>
+        <w:spacing w:after="80" w:before="200"/>
+      </w:pPr>
+      <w:r>
+        <w:rPr>
+          <w:rFonts w:ascii="Calibri" w:cs="Calibri" w:eastAsia="Calibri" w:hAnsi="Calibri"/>
+          <w:b/>
+          <w:bCs/>
+        </w:rPr>
+        <w:t xml:space="preserve">Is it ready for UAE e-invoicing?</w:t>
+      </w:r>
+    </w:p>
+    <w:p>
+      <w:pPr>
+        <w:spacing w:after="120" w:line="276"/>
+      </w:pPr>
+      <w:r>
+        <w:rPr>
+          <w:rFonts w:ascii="Calibri" w:cs="Calibri" w:eastAsia="Calibri" w:hAnsi="Calibri"/>
+          <w:sz w:val="22"/>
+          <w:szCs w:val="22"/>
+        </w:rPr>
+        <w:t xml:space="preserve">Yes. The UAE is introducing e-invoicing on the Peppol-based PINT AE standard. Businesses with annual revenue of AED 50 million or more must go live from 1 January 2027, other businesses from 1 July 2027 and government entities from 1 October 2027 [CONFIRM]. Invoices will be exchanged through Accredited Service Providers. We receive structured invoices from your provider and process them alongside the scanned and PDF invoices you will still get from other suppliers.</w:t>
+      </w:r>
+    </w:p>
+    <w:p>
+      <w:pPr>
+        <w:pStyle w:val="Heading3"/>
+        <w:spacing w:after="80" w:before="200"/>
+      </w:pPr>
+      <w:r>
+        <w:rPr>
+          <w:rFonts w:ascii="Calibri" w:cs="Calibri" w:eastAsia="Calibri" w:hAnsi="Calibri"/>
+          <w:b/>
+          <w:bCs/>
+        </w:rPr>
+        <w:t xml:space="preserve">How long does implementation take, and how much does it cost?</w:t>
+      </w:r>
+    </w:p>
+    <w:p>
+      <w:pPr>
+        <w:spacing w:after="120" w:line="276"/>
+      </w:pPr>
+      <w:r>
+        <w:rPr>
+          <w:rFonts w:ascii="Calibri" w:cs="Calibri" w:eastAsia="Calibri" w:hAnsi="Calibri"/>
+          <w:sz w:val="22"/>
+          <w:szCs w:val="22"/>
+        </w:rPr>
+        <w:t xml:space="preserve">A focused rollout with one entity, one ERP and standard invoice formats can usually go live within a few weeks [CONFIRM]. Group-wide programmes roll out entity by entity over several months, with the first entity live early so you see results before the full rollout ends. Cost depends on invoice volumes, users and entities, the hosting model and the depth of ERP integration. After a short scoping call, we send a written quote based on your actual setup.</w:t>
       </w:r>
     </w:p>
     <w:p>
@@ -2918,7 +3228,7 @@
                 <w:sz w:val="21"/>
                 <w:szCs w:val="21"/>
               </w:rPr>
-              <w:t xml:space="preserve">10</w:t>
+              <w:t xml:space="preserve">9</w:t>
             </w:r>
           </w:p>
         </w:tc>
@@ -2978,7 +3288,7 @@
                 <w:sz w:val="21"/>
                 <w:szCs w:val="21"/>
               </w:rPr>
-              <w:t xml:space="preserve">2</w:t>
+              <w:t xml:space="preserve">1</w:t>
             </w:r>
           </w:p>
         </w:tc>
@@ -3158,7 +3468,7 @@
                 <w:sz w:val="21"/>
                 <w:szCs w:val="21"/>
               </w:rPr>
-              <w:t xml:space="preserve">2</w:t>
+              <w:t xml:space="preserve">3</w:t>
             </w:r>
           </w:p>
         </w:tc>
@@ -3278,7 +3588,7 @@
                 <w:sz w:val="21"/>
                 <w:szCs w:val="21"/>
               </w:rPr>
-              <w:t xml:space="preserve">21</w:t>
+              <w:t xml:space="preserve">19</w:t>
             </w:r>
           </w:p>
         </w:tc>
@@ -3613,7 +3923,7 @@
           <w:sz w:val="22"/>
           <w:szCs w:val="22"/>
         </w:rPr>
-        <w:t xml:space="preserve">UAE e-invoicing timing ("phased in from 2027") is marked [CONFIRM]. Bala's draft gave specific dates and an AED 50 million threshold; I did not carry those over until sourced.</w:t>
+        <w:t xml:space="preserve">Every point from Bala's draft is kept (see the coverage list below). Where two points were combined, nothing was dropped. All ERP, accounting and BI product names were removed: ERPs are now described generically.</w:t>
       </w:r>
     </w:p>
     <w:p>
@@ -3631,6 +3941,24 @@
           <w:sz w:val="22"/>
           <w:szCs w:val="22"/>
         </w:rPr>
+        <w:t xml:space="preserve">Bala's draft claims that I could not verify are kept and marked [CONFIRM] in the copy: "award-winning", "more than two decades", "more than 150 countries", "within a few weeks", and the UAE e-invoicing dates and AED 50 million threshold.</w:t>
+      </w:r>
+    </w:p>
+    <w:p>
+      <w:pPr>
+        <w:pStyle w:val="ListParagraph"/>
+        <w:numPr>
+          <w:ilvl w:val="0"/>
+          <w:numId w:val="2"/>
+        </w:numPr>
+        <w:spacing w:after="80" w:line="276"/>
+      </w:pPr>
+      <w:r>
+        <w:rPr>
+          <w:rFonts w:ascii="Calibri" w:cs="Calibri" w:eastAsia="Calibri" w:hAnsi="Calibri"/>
+          <w:sz w:val="22"/>
+          <w:szCs w:val="22"/>
+        </w:rPr>
         <w:t xml:space="preserve">HAMT AI: the only source detail was the four pillars. The capabilities described (confidence scoring, supervised retraining on approved corrections, review-rate tracking, logged corrections) are written for this page and must be checked against how HAMT AI actually works.</w:t>
       </w:r>
     </w:p>
@@ -3667,7 +3995,7 @@
           <w:sz w:val="22"/>
           <w:szCs w:val="22"/>
         </w:rPr>
-        <w:t xml:space="preserve">Data handling: the page only says it is agreed with the client IT team before go-live. Confirm whether data stays in the UAE and how correction data is stored.</w:t>
+        <w:t xml:space="preserve">Data handling: the page only says it is agreed with the client IT team before go-live and that data can stay in the UAE. Confirm both.</w:t>
       </w:r>
     </w:p>
     <w:p>
@@ -3685,7 +4013,7 @@
           <w:sz w:val="22"/>
           <w:szCs w:val="22"/>
         </w:rPr>
-        <w:t xml:space="preserve">Removed from Bala's draft because unsourced: "award-winning", "more than two decades", "150+ countries", and the "within a few weeks" implementation timeline. No statistics are used anywhere.</w:t>
+        <w:t xml:space="preserve">FAQ: Bala's ten questions are merged into six (brief asked for 5 to 6). Every answer point is retained.</w:t>
       </w:r>
     </w:p>
     <w:p>
@@ -3703,7 +4031,25 @@
           <w:sz w:val="22"/>
           <w:szCs w:val="22"/>
         </w:rPr>
-        <w:t xml:space="preserve">Example invoice (INV-26-10482, PO 4500912, GRN-7731) is illustrative and labelled "Example". VAT rates in the region chips (UAE 5%, KSA 15%, Bahrain 10%, Oman 5%) come from Bala's draft.</w:t>
+        <w:t xml:space="preserve">Example invoice (INV-26-10482, PO 4500912, GRN-7731) is illustrative and labelled "Example". VAT rates in the region chips come from Bala's draft.</w:t>
+      </w:r>
+    </w:p>
+    <w:p>
+      <w:pPr>
+        <w:pStyle w:val="ListParagraph"/>
+        <w:numPr>
+          <w:ilvl w:val="0"/>
+          <w:numId w:val="2"/>
+        </w:numPr>
+        <w:spacing w:after="80" w:line="276"/>
+      </w:pPr>
+      <w:r>
+        <w:rPr>
+          <w:rFonts w:ascii="Calibri" w:cs="Calibri" w:eastAsia="Calibri" w:hAnsi="Calibri"/>
+          <w:sz w:val="22"/>
+          <w:szCs w:val="22"/>
+        </w:rPr>
+        <w:t xml:space="preserve">No competitor or reference-site names appear anywhere in the copy.</w:t>
       </w:r>
     </w:p>
     <w:p>

</xml_diff>

<commit_message>
Add benefits section, fold HAMT AI into learning cycle, trim to 2,300 words
Co-Authored-By: Claude Sonnet 5.5 <noreply@anthropic.com>
Claude-Session: https://claude.ai/code/session_012PGo17x7AccmkmEWZ5KHUv
</commit_message>
<xml_diff>
--- a/invoice-automation.docx
+++ b/invoice-automation.docx
@@ -284,7 +284,7 @@
                 <w:sz w:val="21"/>
                 <w:szCs w:val="21"/>
               </w:rPr>
-              <w:t xml:space="preserve">2629 words (H1 to closing CTA, excluding meta tags and this table)</w:t>
+              <w:t xml:space="preserve">2298 words (H1 to closing CTA, excluding meta tags and this table)</w:t>
             </w:r>
           </w:p>
         </w:tc>
@@ -343,7 +343,7 @@
           <w:sz w:val="22"/>
           <w:szCs w:val="22"/>
         </w:rPr>
-        <w:t xml:space="preserve">HLB HAMT's invoice automation uses HAMT AI, our own AI, to capture, check and route every supplier invoice in Arabic or English, from the moment it arrives until it posts to your ERP. It is built for mid-sized companies and large enterprises across the UAE, the GCC and the wider Middle East, and designed by auditors, so control comes as standard. Reviewers stay in the loop, and every correction they make trains the models. We assess, implement, integrate and optimise it with you.</w:t>
+        <w:t xml:space="preserve">HLB HAMT's invoice automation uses HAMT AI, our own AI, to capture, check and route every supplier invoice in Arabic or English, from arrival to ERP posting. Built for mid-sized companies and large enterprises across the UAE, the GCC and the wider Middle East, and designed by auditors, so control comes as standard. Reviewer corrections train the models, and we assess, implement, integrate and optimise it with you.</w:t>
       </w:r>
     </w:p>
     <w:p>
@@ -444,7 +444,7 @@
           <w:sz w:val="22"/>
           <w:szCs w:val="22"/>
         </w:rPr>
-        <w:t xml:space="preserve">Reviewed and learned: One low-confidence field went to a reviewer. The correction is saved to train HAMT AI [Learned]</w:t>
+        <w:t xml:space="preserve">Reviewed and learned: One low-confidence field went to a reviewer, and the correction trains HAMT AI [Learned]</w:t>
       </w:r>
     </w:p>
     <w:p>
@@ -611,7 +611,7 @@
           <w:sz w:val="22"/>
           <w:szCs w:val="22"/>
         </w:rPr>
-        <w:t xml:space="preserve">A capable AP team copes with a few hundred invoices a month. Then the business adds a branch, a warehouse, a second entity or another country. Invoices arrive by email, courier and WhatsApp, in Arabic and English, and some still come off dot-matrix printers.</w:t>
+        <w:t xml:space="preserve">A capable AP team copes with a few hundred invoices a month. Then the business adds a branch, a warehouse, a second entity or another country. Invoices arrive by email, courier and WhatsApp, in Arabic and English, some still off dot-matrix printers.</w:t>
       </w:r>
     </w:p>
     <w:p>
@@ -705,7 +705,7 @@
           <w:sz w:val="22"/>
           <w:szCs w:val="22"/>
         </w:rPr>
-        <w:t xml:space="preserve">Invoices sit in inboxes and chat groups while suppliers call to ask about payment.</w:t>
+        <w:t xml:space="preserve">Invoices sit in inboxes and chat groups while suppliers call about payment.</w:t>
       </w:r>
     </w:p>
     <w:p>
@@ -732,7 +732,7 @@
           <w:sz w:val="22"/>
           <w:szCs w:val="22"/>
         </w:rPr>
-        <w:t xml:space="preserve">VAT and TRN errors, audit-trail gaps and new e-invoicing rules raise the stakes every year.</w:t>
+        <w:t xml:space="preserve">VAT and TRN errors, audit-trail gaps and new e-invoicing rules raise the stakes yearly.</w:t>
       </w:r>
     </w:p>
     <w:p>
@@ -801,7 +801,7 @@
           <w:sz w:val="22"/>
           <w:szCs w:val="22"/>
         </w:rPr>
-        <w:t xml:space="preserve">Invoice processing automation takes over the routine work of accounts payable. Invoices that pass every check flow straight to approval and posting. Those that need judgement reach the right person with the reason attached.</w:t>
+        <w:t xml:space="preserve">Invoice processing automation takes over routine accounts payable work. Invoices that pass every check flow straight to approval and posting; those needing judgement reach the right person with the reason attached.</w:t>
       </w:r>
     </w:p>
     <w:p>
@@ -939,7 +939,7 @@
           <w:sz w:val="18"/>
           <w:szCs w:val="18"/>
         </w:rPr>
-        <w:t xml:space="preserve">HAMT AI</w:t>
+        <w:t xml:space="preserve">BENEFITS</w:t>
       </w:r>
     </w:p>
     <w:p>
@@ -953,128 +953,115 @@
           <w:b/>
           <w:bCs/>
         </w:rPr>
-        <w:t xml:space="preserve">HAMT AI: the engine behind HLB HAMT's invoice automation</w:t>
-      </w:r>
-    </w:p>
-    <w:p>
-      <w:pPr>
-        <w:spacing w:after="120" w:line="276"/>
-      </w:pPr>
-      <w:r>
-        <w:rPr>
-          <w:rFonts w:ascii="Calibri" w:cs="Calibri" w:eastAsia="Calibri" w:hAnsi="Calibri"/>
-          <w:sz w:val="22"/>
-          <w:szCs w:val="22"/>
-        </w:rPr>
-        <w:t xml:space="preserve">HAMT AI is HLB HAMT's own AI. It combines intelligent document processing, workflow automation and human review in one design, built on four pillars that decide how every invoice is handled.</w:t>
-      </w:r>
-    </w:p>
-    <w:p>
-      <w:pPr>
-        <w:pStyle w:val="Heading3"/>
-        <w:spacing w:after="80" w:before="200"/>
-      </w:pPr>
-      <w:r>
-        <w:rPr>
-          <w:rFonts w:ascii="Calibri" w:cs="Calibri" w:eastAsia="Calibri" w:hAnsi="Calibri"/>
-          <w:b/>
-          <w:bCs/>
-        </w:rPr>
-        <w:t xml:space="preserve">Human-integrated</w:t>
-      </w:r>
-    </w:p>
-    <w:p>
-      <w:pPr>
-        <w:spacing w:after="120" w:line="276"/>
-      </w:pPr>
-      <w:r>
-        <w:rPr>
-          <w:rFonts w:ascii="Calibri" w:cs="Calibri" w:eastAsia="Calibri" w:hAnsi="Calibri"/>
-          <w:sz w:val="22"/>
-          <w:szCs w:val="22"/>
-        </w:rPr>
-        <w:t xml:space="preserve">People are part of the workflow, not a fallback. Reviewers see what HAMT AI is unsure about, correct it on one screen, and approve what matters.</w:t>
-      </w:r>
-    </w:p>
-    <w:p>
-      <w:pPr>
-        <w:pStyle w:val="Heading3"/>
-        <w:spacing w:after="80" w:before="200"/>
-      </w:pPr>
-      <w:r>
-        <w:rPr>
-          <w:rFonts w:ascii="Calibri" w:cs="Calibri" w:eastAsia="Calibri" w:hAnsi="Calibri"/>
-          <w:b/>
-          <w:bCs/>
-        </w:rPr>
-        <w:t xml:space="preserve">Automation</w:t>
-      </w:r>
-    </w:p>
-    <w:p>
-      <w:pPr>
-        <w:spacing w:after="120" w:line="276"/>
-      </w:pPr>
-      <w:r>
-        <w:rPr>
-          <w:rFonts w:ascii="Calibri" w:cs="Calibri" w:eastAsia="Calibri" w:hAnsi="Calibri"/>
-          <w:sz w:val="22"/>
-          <w:szCs w:val="22"/>
-        </w:rPr>
-        <w:t xml:space="preserve">Invoices that pass capture, matching and VAT checks move to approval and posting untouched. The rules, tolerances and approval limits are yours.</w:t>
-      </w:r>
-    </w:p>
-    <w:p>
-      <w:pPr>
-        <w:pStyle w:val="Heading3"/>
-        <w:spacing w:after="80" w:before="200"/>
-      </w:pPr>
-      <w:r>
-        <w:rPr>
-          <w:rFonts w:ascii="Calibri" w:cs="Calibri" w:eastAsia="Calibri" w:hAnsi="Calibri"/>
-          <w:b/>
-          <w:bCs/>
-        </w:rPr>
-        <w:t xml:space="preserve">Machine learning</w:t>
-      </w:r>
-    </w:p>
-    <w:p>
-      <w:pPr>
-        <w:spacing w:after="120" w:line="276"/>
-      </w:pPr>
-      <w:r>
-        <w:rPr>
-          <w:rFonts w:ascii="Calibri" w:cs="Calibri" w:eastAsia="Calibri" w:hAnsi="Calibri"/>
-          <w:sz w:val="22"/>
-          <w:szCs w:val="22"/>
-        </w:rPr>
-        <w:t xml:space="preserve">Models handle invoice data extraction, supplier recognition and line-item coding, and score their confidence on every field. Corrections make them sharper on your suppliers.</w:t>
-      </w:r>
-    </w:p>
-    <w:p>
-      <w:pPr>
-        <w:pStyle w:val="Heading3"/>
-        <w:spacing w:after="80" w:before="200"/>
-      </w:pPr>
-      <w:r>
-        <w:rPr>
-          <w:rFonts w:ascii="Calibri" w:cs="Calibri" w:eastAsia="Calibri" w:hAnsi="Calibri"/>
-          <w:b/>
-          <w:bCs/>
-        </w:rPr>
-        <w:t xml:space="preserve">Transformation</w:t>
-      </w:r>
-    </w:p>
-    <w:p>
-      <w:pPr>
-        <w:spacing w:after="120" w:line="276"/>
-      </w:pPr>
-      <w:r>
-        <w:rPr>
-          <w:rFonts w:ascii="Calibri" w:cs="Calibri" w:eastAsia="Calibri" w:hAnsi="Calibri"/>
-          <w:sz w:val="22"/>
-          <w:szCs w:val="22"/>
-        </w:rPr>
-        <w:t xml:space="preserve">Accounts payable shifts from keying and chasing to reviewing and controlling. We redesign the process alongside the technology, so the change sticks.</w:t>
+        <w:t xml:space="preserve">Benefits of invoice automation for finance teams</w:t>
+      </w:r>
+    </w:p>
+    <w:p>
+      <w:pPr>
+        <w:pStyle w:val="Heading3"/>
+        <w:spacing w:after="80" w:before="200"/>
+      </w:pPr>
+      <w:r>
+        <w:rPr>
+          <w:rFonts w:ascii="Calibri" w:cs="Calibri" w:eastAsia="Calibri" w:hAnsi="Calibri"/>
+          <w:b/>
+          <w:bCs/>
+        </w:rPr>
+        <w:t xml:space="preserve">A faster close</w:t>
+      </w:r>
+    </w:p>
+    <w:p>
+      <w:pPr>
+        <w:spacing w:after="120" w:line="276"/>
+      </w:pPr>
+      <w:r>
+        <w:rPr>
+          <w:rFonts w:ascii="Calibri" w:cs="Calibri" w:eastAsia="Calibri" w:hAnsi="Calibri"/>
+          <w:sz w:val="22"/>
+          <w:szCs w:val="22"/>
+        </w:rPr>
+        <w:t xml:space="preserve">Invoices post as they arrive, so accruals and reporting stop waiting.</w:t>
+      </w:r>
+    </w:p>
+    <w:p>
+      <w:pPr>
+        <w:pStyle w:val="Heading3"/>
+        <w:spacing w:after="80" w:before="200"/>
+      </w:pPr>
+      <w:r>
+        <w:rPr>
+          <w:rFonts w:ascii="Calibri" w:cs="Calibri" w:eastAsia="Calibri" w:hAnsi="Calibri"/>
+          <w:b/>
+          <w:bCs/>
+        </w:rPr>
+        <w:t xml:space="preserve">Fewer costly errors</w:t>
+      </w:r>
+    </w:p>
+    <w:p>
+      <w:pPr>
+        <w:spacing w:after="120" w:line="276"/>
+      </w:pPr>
+      <w:r>
+        <w:rPr>
+          <w:rFonts w:ascii="Calibri" w:cs="Calibri" w:eastAsia="Calibri" w:hAnsi="Calibri"/>
+          <w:sz w:val="22"/>
+          <w:szCs w:val="22"/>
+        </w:rPr>
+        <w:t xml:space="preserve">Matching, VAT checks and duplicate detection catch problems before payment.</w:t>
+      </w:r>
+    </w:p>
+    <w:p>
+      <w:pPr>
+        <w:pStyle w:val="Heading3"/>
+        <w:spacing w:after="80" w:before="200"/>
+      </w:pPr>
+      <w:r>
+        <w:rPr>
+          <w:rFonts w:ascii="Calibri" w:cs="Calibri" w:eastAsia="Calibri" w:hAnsi="Calibri"/>
+          <w:b/>
+          <w:bCs/>
+        </w:rPr>
+        <w:t xml:space="preserve">Stronger supplier relationships</w:t>
+      </w:r>
+    </w:p>
+    <w:p>
+      <w:pPr>
+        <w:spacing w:after="120" w:line="276"/>
+      </w:pPr>
+      <w:r>
+        <w:rPr>
+          <w:rFonts w:ascii="Calibri" w:cs="Calibri" w:eastAsia="Calibri" w:hAnsi="Calibri"/>
+          <w:sz w:val="22"/>
+          <w:szCs w:val="22"/>
+        </w:rPr>
+        <w:t xml:space="preserve">Faster approvals mean on-time payment and early-payment discounts.</w:t>
+      </w:r>
+    </w:p>
+    <w:p>
+      <w:pPr>
+        <w:pStyle w:val="Heading3"/>
+        <w:spacing w:after="80" w:before="200"/>
+      </w:pPr>
+      <w:r>
+        <w:rPr>
+          <w:rFonts w:ascii="Calibri" w:cs="Calibri" w:eastAsia="Calibri" w:hAnsi="Calibri"/>
+          <w:b/>
+          <w:bCs/>
+        </w:rPr>
+        <w:t xml:space="preserve">Time for higher-value work</w:t>
+      </w:r>
+    </w:p>
+    <w:p>
+      <w:pPr>
+        <w:spacing w:after="120" w:line="276"/>
+      </w:pPr>
+      <w:r>
+        <w:rPr>
+          <w:rFonts w:ascii="Calibri" w:cs="Calibri" w:eastAsia="Calibri" w:hAnsi="Calibri"/>
+          <w:sz w:val="22"/>
+          <w:szCs w:val="22"/>
+        </w:rPr>
+        <w:t xml:space="preserve">AP staff move from keying and chasing to reviewing exceptions and analysing spend.</w:t>
       </w:r>
     </w:p>
     <w:p>
@@ -1104,20 +1091,20 @@
           <w:b/>
           <w:bCs/>
         </w:rPr>
-        <w:t xml:space="preserve">Every reviewer correction makes HAMT AI better at your invoices</w:t>
-      </w:r>
-    </w:p>
-    <w:p>
-      <w:pPr>
-        <w:spacing w:after="120" w:line="276"/>
-      </w:pPr>
-      <w:r>
-        <w:rPr>
-          <w:rFonts w:ascii="Calibri" w:cs="Calibri" w:eastAsia="Calibri" w:hAnsi="Calibri"/>
-          <w:sz w:val="22"/>
-          <w:szCs w:val="22"/>
-        </w:rPr>
-        <w:t xml:space="preserve">Most tools extract data and stop. HAMT AI keeps learning from the people who check its work, and that is what sets our invoice automation apart.</w:t>
+        <w:t xml:space="preserve">Every reviewer correction makes your invoice automation smarter</w:t>
+      </w:r>
+    </w:p>
+    <w:p>
+      <w:pPr>
+        <w:spacing w:after="120" w:line="276"/>
+      </w:pPr>
+      <w:r>
+        <w:rPr>
+          <w:rFonts w:ascii="Calibri" w:cs="Calibri" w:eastAsia="Calibri" w:hAnsi="Calibri"/>
+          <w:sz w:val="22"/>
+          <w:szCs w:val="22"/>
+        </w:rPr>
+        <w:t xml:space="preserve">HAMT AI, the engine behind our invoice automation, pairs intelligent document processing with human review and keeps learning from the people who check its work.</w:t>
       </w:r>
     </w:p>
     <w:p>
@@ -1144,7 +1131,7 @@
           <w:sz w:val="22"/>
           <w:szCs w:val="22"/>
         </w:rPr>
-        <w:t xml:space="preserve">HAMT AI scores its confidence on each field and holds uncertain values for review instead of guessing.</w:t>
+        <w:t xml:space="preserve">HAMT AI scores its confidence on each field and holds uncertain values for review.</w:t>
       </w:r>
     </w:p>
     <w:p>
@@ -1171,7 +1158,7 @@
           <w:sz w:val="22"/>
           <w:szCs w:val="22"/>
         </w:rPr>
-        <w:t xml:space="preserve">A reviewer fixes the value beside the original invoice. The change and the reviewer are recorded.</w:t>
+        <w:t xml:space="preserve">A reviewer fixes the value beside the invoice, and the change is recorded.</w:t>
       </w:r>
     </w:p>
     <w:p>
@@ -1198,7 +1185,7 @@
           <w:sz w:val="22"/>
           <w:szCs w:val="22"/>
         </w:rPr>
-        <w:t xml:space="preserve">Approved corrections feed the models for your setup, tested before an update goes live.</w:t>
+        <w:t xml:space="preserve">Approved corrections feed the models for your setup, tested before release.</w:t>
       </w:r>
     </w:p>
     <w:p>
@@ -1239,6 +1226,128 @@
           <w:b/>
           <w:bCs/>
         </w:rPr>
+        <w:t xml:space="preserve">HAMT AI's four pillars, applied to invoices</w:t>
+      </w:r>
+    </w:p>
+    <w:p>
+      <w:pPr>
+        <w:pStyle w:val="Heading3"/>
+        <w:spacing w:after="80" w:before="200"/>
+      </w:pPr>
+      <w:r>
+        <w:rPr>
+          <w:rFonts w:ascii="Calibri" w:cs="Calibri" w:eastAsia="Calibri" w:hAnsi="Calibri"/>
+          <w:b/>
+          <w:bCs/>
+        </w:rPr>
+        <w:t xml:space="preserve">Human-integrated</w:t>
+      </w:r>
+    </w:p>
+    <w:p>
+      <w:pPr>
+        <w:spacing w:after="120" w:line="276"/>
+      </w:pPr>
+      <w:r>
+        <w:rPr>
+          <w:rFonts w:ascii="Calibri" w:cs="Calibri" w:eastAsia="Calibri" w:hAnsi="Calibri"/>
+          <w:sz w:val="22"/>
+          <w:szCs w:val="22"/>
+        </w:rPr>
+        <w:t xml:space="preserve">Reviewers see what HAMT AI is unsure about, correct it on one screen and approve what matters.</w:t>
+      </w:r>
+    </w:p>
+    <w:p>
+      <w:pPr>
+        <w:pStyle w:val="Heading3"/>
+        <w:spacing w:after="80" w:before="200"/>
+      </w:pPr>
+      <w:r>
+        <w:rPr>
+          <w:rFonts w:ascii="Calibri" w:cs="Calibri" w:eastAsia="Calibri" w:hAnsi="Calibri"/>
+          <w:b/>
+          <w:bCs/>
+        </w:rPr>
+        <w:t xml:space="preserve">Automation</w:t>
+      </w:r>
+    </w:p>
+    <w:p>
+      <w:pPr>
+        <w:spacing w:after="120" w:line="276"/>
+      </w:pPr>
+      <w:r>
+        <w:rPr>
+          <w:rFonts w:ascii="Calibri" w:cs="Calibri" w:eastAsia="Calibri" w:hAnsi="Calibri"/>
+          <w:sz w:val="22"/>
+          <w:szCs w:val="22"/>
+        </w:rPr>
+        <w:t xml:space="preserve">Invoices that pass capture, matching and VAT checks post untouched, within rules you set.</w:t>
+      </w:r>
+    </w:p>
+    <w:p>
+      <w:pPr>
+        <w:pStyle w:val="Heading3"/>
+        <w:spacing w:after="80" w:before="200"/>
+      </w:pPr>
+      <w:r>
+        <w:rPr>
+          <w:rFonts w:ascii="Calibri" w:cs="Calibri" w:eastAsia="Calibri" w:hAnsi="Calibri"/>
+          <w:b/>
+          <w:bCs/>
+        </w:rPr>
+        <w:t xml:space="preserve">Machine learning</w:t>
+      </w:r>
+    </w:p>
+    <w:p>
+      <w:pPr>
+        <w:spacing w:after="120" w:line="276"/>
+      </w:pPr>
+      <w:r>
+        <w:rPr>
+          <w:rFonts w:ascii="Calibri" w:cs="Calibri" w:eastAsia="Calibri" w:hAnsi="Calibri"/>
+          <w:sz w:val="22"/>
+          <w:szCs w:val="22"/>
+        </w:rPr>
+        <w:t xml:space="preserve">Models handle invoice data extraction and supplier recognition, and sharpen on your suppliers.</w:t>
+      </w:r>
+    </w:p>
+    <w:p>
+      <w:pPr>
+        <w:pStyle w:val="Heading3"/>
+        <w:spacing w:after="80" w:before="200"/>
+      </w:pPr>
+      <w:r>
+        <w:rPr>
+          <w:rFonts w:ascii="Calibri" w:cs="Calibri" w:eastAsia="Calibri" w:hAnsi="Calibri"/>
+          <w:b/>
+          <w:bCs/>
+        </w:rPr>
+        <w:t xml:space="preserve">Transformation</w:t>
+      </w:r>
+    </w:p>
+    <w:p>
+      <w:pPr>
+        <w:spacing w:after="120" w:line="276"/>
+      </w:pPr>
+      <w:r>
+        <w:rPr>
+          <w:rFonts w:ascii="Calibri" w:cs="Calibri" w:eastAsia="Calibri" w:hAnsi="Calibri"/>
+          <w:sz w:val="22"/>
+          <w:szCs w:val="22"/>
+        </w:rPr>
+        <w:t xml:space="preserve">AP moves from keying and chasing to reviewing and controlling, with the process redesigned alongside.</w:t>
+      </w:r>
+    </w:p>
+    <w:p>
+      <w:pPr>
+        <w:pStyle w:val="Heading3"/>
+        <w:spacing w:after="80" w:before="200"/>
+      </w:pPr>
+      <w:r>
+        <w:rPr>
+          <w:rFonts w:ascii="Calibri" w:cs="Calibri" w:eastAsia="Calibri" w:hAnsi="Calibri"/>
+          <w:b/>
+          <w:bCs/>
+        </w:rPr>
         <w:t xml:space="preserve">Exception handling that gets smarter</w:t>
       </w:r>
     </w:p>
@@ -1252,7 +1361,7 @@
           <w:sz w:val="22"/>
           <w:szCs w:val="22"/>
         </w:rPr>
-        <w:t xml:space="preserve">Exception handling is where most automation projects stall. We design the review queues, roles and thresholds with you, then track the review rate as a service measure, so the benefit is proven rather than assumed.</w:t>
+        <w:t xml:space="preserve">We design review queues, roles and thresholds with you and track the review rate as a service measure.</w:t>
       </w:r>
     </w:p>
     <w:p>
@@ -1288,25 +1397,7 @@
           <w:sz w:val="22"/>
           <w:szCs w:val="22"/>
         </w:rPr>
-        <w:t xml:space="preserve">Retraining is supervised by HLB HAMT, not left to run unchecked.</w:t>
-      </w:r>
-    </w:p>
-    <w:p>
-      <w:pPr>
-        <w:pStyle w:val="ListParagraph"/>
-        <w:numPr>
-          <w:ilvl w:val="0"/>
-          <w:numId w:val="2"/>
-        </w:numPr>
-        <w:spacing w:after="60" w:line="276"/>
-      </w:pPr>
-      <w:r>
-        <w:rPr>
-          <w:rFonts w:ascii="Calibri" w:cs="Calibri" w:eastAsia="Calibri" w:hAnsi="Calibri"/>
-          <w:sz w:val="22"/>
-          <w:szCs w:val="22"/>
-        </w:rPr>
-        <w:t xml:space="preserve">Data handling is agreed with your IT team before go-live.</w:t>
+        <w:t xml:space="preserve">Retraining is supervised by HLB HAMT, and data handling is agreed with your IT team before go-live.</w:t>
       </w:r>
     </w:p>
     <w:p>
@@ -1320,19 +1411,6 @@
           <w:szCs w:val="22"/>
         </w:rPr>
         <w:t xml:space="preserve">See HAMT AI learn from your invoices</w:t>
-      </w:r>
-    </w:p>
-    <w:p>
-      <w:pPr>
-        <w:spacing w:after="120" w:line="276"/>
-      </w:pPr>
-      <w:r>
-        <w:rPr>
-          <w:rFonts w:ascii="Calibri" w:cs="Calibri" w:eastAsia="Calibri" w:hAnsi="Calibri"/>
-          <w:sz w:val="22"/>
-          <w:szCs w:val="22"/>
-        </w:rPr>
-        <w:t xml:space="preserve">Book a demo and we'll run a sample of your invoices, then show you what HAMT AI flags and what a reviewer correction changes.</w:t>
       </w:r>
     </w:p>
     <w:p>
@@ -1388,7 +1466,7 @@
           <w:sz w:val="22"/>
           <w:szCs w:val="22"/>
         </w:rPr>
-        <w:t xml:space="preserve">Every invoice follows the same six steps, and every step is recorded. Your team steps in only when a check fails or an approval is due.</w:t>
+        <w:t xml:space="preserve">Six steps, each one recorded. Your team steps in only when a check fails or an approval is due.</w:t>
       </w:r>
     </w:p>
     <w:p>
@@ -1415,7 +1493,7 @@
           <w:sz w:val="22"/>
           <w:szCs w:val="22"/>
         </w:rPr>
-        <w:t xml:space="preserve">Invoices are collected the moment they arrive, from email, scanners, shared folders or your e-invoicing provider, into one controlled queue.</w:t>
+        <w:t xml:space="preserve">Invoices are collected on arrival from email, scanners, shared folders or your e-invoicing provider into one controlled queue.</w:t>
       </w:r>
     </w:p>
     <w:p>
@@ -1478,7 +1556,7 @@
           <w:sz w:val="22"/>
           <w:szCs w:val="22"/>
         </w:rPr>
-        <w:t xml:space="preserve">HAMT AI extracts header details, line items, tax and supplier data in Arabic or English, then files the invoice under the right supplier.</w:t>
+        <w:t xml:space="preserve">HAMT AI extracts header, line, tax and supplier data in Arabic or English and files the invoice under the right supplier.</w:t>
       </w:r>
     </w:p>
     <w:p>
@@ -1604,7 +1682,7 @@
           <w:sz w:val="22"/>
           <w:szCs w:val="22"/>
         </w:rPr>
-        <w:t xml:space="preserve">Rules route it to the right approver by entity, cost centre, value or category, with deputies and escalation for leave and travel.</w:t>
+        <w:t xml:space="preserve">Rules route it by entity, cost centre, value or category, with deputies and escalation for leave and travel.</w:t>
       </w:r>
     </w:p>
     <w:p>
@@ -1667,7 +1745,7 @@
           <w:sz w:val="22"/>
           <w:szCs w:val="22"/>
         </w:rPr>
-        <w:t xml:space="preserve">Approved invoices reach your ERP with posting data prepared, in time to meet supplier payment terms.</w:t>
+        <w:t xml:space="preserve">Approved invoices reach your ERP with posting data prepared, in time for supplier payment terms.</w:t>
       </w:r>
     </w:p>
     <w:p>
@@ -1730,7 +1808,7 @@
           <w:sz w:val="22"/>
           <w:szCs w:val="22"/>
         </w:rPr>
-        <w:t xml:space="preserve">Every invoice is stored with its full history and stays retrievable for the whole retention period.</w:t>
+        <w:t xml:space="preserve">Every invoice is stored with its full history, retrievable for the whole retention period.</w:t>
       </w:r>
     </w:p>
     <w:p>
@@ -1809,7 +1887,7 @@
           <w:sz w:val="22"/>
           <w:szCs w:val="22"/>
         </w:rPr>
-        <w:t xml:space="preserve">Whether you handle hundreds of invoices a month or many thousands across several countries, it runs on one platform. Start with what you need today and extend it as the business grows.</w:t>
+        <w:t xml:space="preserve">Whether you handle hundreds of invoices a month or many thousands across countries, it runs on one platform. Start with what you need and extend as you grow.</w:t>
       </w:r>
     </w:p>
     <w:p>
@@ -1852,7 +1930,7 @@
           <w:sz w:val="22"/>
           <w:szCs w:val="22"/>
         </w:rPr>
-        <w:t xml:space="preserve">For growing businesses with one or a few entities that want to stop keying invoices and get approvals under control.</w:t>
+        <w:t xml:space="preserve">For growing businesses with one or a few entities that want to stop keying invoices and control approvals.</w:t>
       </w:r>
     </w:p>
     <w:p>
@@ -1870,7 +1948,7 @@
           <w:sz w:val="22"/>
           <w:szCs w:val="22"/>
         </w:rPr>
-        <w:t xml:space="preserve">Cloud deployment with ready-to-use approval and matching rules</w:t>
+        <w:t xml:space="preserve">Cloud deployment with ready-made approval and matching rules</w:t>
       </w:r>
     </w:p>
     <w:p>
@@ -1967,7 +2045,7 @@
           <w:sz w:val="22"/>
           <w:szCs w:val="22"/>
         </w:rPr>
-        <w:t xml:space="preserve">For multi-entity, multi-country groups and shared service centres with high volumes and layered approval structures.</w:t>
+        <w:t xml:space="preserve">For multi-entity, multi-country groups and shared service centres with high volumes and layered approvals.</w:t>
       </w:r>
     </w:p>
     <w:p>
@@ -2095,7 +2173,7 @@
           <w:sz w:val="22"/>
           <w:szCs w:val="22"/>
         </w:rPr>
-        <w:t xml:space="preserve">Regional invoices follow their own conventions: two languages on one page, tax registration numbers, VAT rates that differ by country and, increasingly, structured e-invoices. All of it is handled as standard.</w:t>
+        <w:t xml:space="preserve">Regional invoices carry two languages, tax registration numbers, country-specific VAT rates and, increasingly, structured e-invoices, all handled as standard.</w:t>
       </w:r>
     </w:p>
     <w:p>
@@ -2122,7 +2200,7 @@
           <w:sz w:val="22"/>
           <w:szCs w:val="22"/>
         </w:rPr>
-        <w:t xml:space="preserve">Arabic, English and mixed-language invoices are read as standard, including right-to-left layouts and supplier names written in Arabic.</w:t>
+        <w:t xml:space="preserve">Arabic, English and mixed-language invoices are read as standard, including right-to-left layouts and Arabic supplier names.</w:t>
       </w:r>
     </w:p>
     <w:p>
@@ -2149,7 +2227,7 @@
           <w:sz w:val="22"/>
           <w:szCs w:val="22"/>
         </w:rPr>
-        <w:t xml:space="preserve">The supplier's TRN, the VAT rate applied and the arithmetic of every tax line are checked before an invoice can post.</w:t>
+        <w:t xml:space="preserve">The supplier TRN, the VAT rate and every tax line are checked before an invoice can post.</w:t>
       </w:r>
     </w:p>
     <w:p>
@@ -2203,7 +2281,7 @@
           <w:sz w:val="22"/>
           <w:szCs w:val="22"/>
         </w:rPr>
-        <w:t xml:space="preserve">As UAE e-invoicing comes into force from 2027 [CONFIRM], structured invoices will reach you through your Accredited Service Provider. They are processed alongside the scans and PDFs you still receive.</w:t>
+        <w:t xml:space="preserve">As UAE e-invoicing comes into force from 2027 [CONFIRM], structured invoices reach you through your Accredited Service Provider and are processed alongside scans and PDFs.</w:t>
       </w:r>
     </w:p>
     <w:p>
@@ -2257,7 +2335,7 @@
           <w:sz w:val="22"/>
           <w:szCs w:val="22"/>
         </w:rPr>
-        <w:t xml:space="preserve">Implemented and supported from Dubai, in your time zone, by a team backed by the HLB International network.</w:t>
+        <w:t xml:space="preserve">Implemented and supported from Dubai, in your time zone, backed by the HLB International network.</w:t>
       </w:r>
     </w:p>
     <w:p>
@@ -2271,19 +2349,6 @@
           <w:szCs w:val="22"/>
         </w:rPr>
         <w:t xml:space="preserve">Ready to scale accounts payable?</w:t>
-      </w:r>
-    </w:p>
-    <w:p>
-      <w:pPr>
-        <w:spacing w:after="120" w:line="276"/>
-      </w:pPr>
-      <w:r>
-        <w:rPr>
-          <w:rFonts w:ascii="Calibri" w:cs="Calibri" w:eastAsia="Calibri" w:hAnsi="Calibri"/>
-          <w:sz w:val="22"/>
-          <w:szCs w:val="22"/>
-        </w:rPr>
-        <w:t xml:space="preserve">Talk to our team about your volumes, entities and ERP, and we'll outline the right place to start.</w:t>
       </w:r>
     </w:p>
     <w:p>
@@ -2339,7 +2404,7 @@
           <w:sz w:val="22"/>
           <w:szCs w:val="22"/>
         </w:rPr>
-        <w:t xml:space="preserve">Software alone rarely fixes accounts payable. Mid-sized rollouts and enterprise programmes follow the same four steps, delivered by one team. Only the number of entities, countries and invoice types changes.</w:t>
+        <w:t xml:space="preserve">Software alone rarely fixes accounts payable. Mid-sized and enterprise rollouts follow the same four steps with one team, covering more entities, countries and invoice types as you grow.</w:t>
       </w:r>
     </w:p>
     <w:p>
@@ -2393,7 +2458,7 @@
           <w:sz w:val="22"/>
           <w:szCs w:val="22"/>
         </w:rPr>
-        <w:t xml:space="preserve">We configure HAMT AI, matching and approvals, then pilot on your own invoices for one entity or supplier group, so you see results on real documents.</w:t>
+        <w:t xml:space="preserve">We configure HAMT AI, matching and approvals, then pilot on your own invoices for one entity or supplier group and see results on real documents.</w:t>
       </w:r>
     </w:p>
     <w:p>
@@ -2490,7 +2555,7 @@
           <w:sz w:val="22"/>
           <w:szCs w:val="22"/>
         </w:rPr>
-        <w:t xml:space="preserve">HLB HAMT is an advisory and accounting firm with its own technology division. The people who design your invoice workflows understand the controls an auditor will test, the VAT rules your invoices must meet and the ERP they flow into.</w:t>
+        <w:t xml:space="preserve">HLB HAMT is an advisory and accounting firm with its own technology division. The people designing your invoice workflows understand the controls an auditor will test, the VAT rules and the ERP.</w:t>
       </w:r>
     </w:p>
     <w:p>
@@ -2544,7 +2609,7 @@
           <w:sz w:val="22"/>
           <w:szCs w:val="22"/>
         </w:rPr>
-        <w:t xml:space="preserve">Our tax advisors know the UAE VAT and Corporate Tax record-keeping rules your invoices must meet, and the e-invoicing changes ahead.</w:t>
+        <w:t xml:space="preserve">Our tax advisors know the UAE VAT and Corporate Tax record-keeping rules, and the e-invoicing changes ahead.</w:t>
       </w:r>
     </w:p>
     <w:p>
@@ -2598,7 +2663,7 @@
           <w:sz w:val="22"/>
           <w:szCs w:val="22"/>
         </w:rPr>
-        <w:t xml:space="preserve">A Dubai-based team, backed by HLB, the global advisory and accounting network in more than 150 countries [CONFIRM].</w:t>
+        <w:t xml:space="preserve">A Dubai-based team backed by HLB, the global advisory and accounting network in more than 150 countries [CONFIRM].</w:t>
       </w:r>
     </w:p>
     <w:p>
@@ -2641,7 +2706,7 @@
           <w:sz w:val="22"/>
           <w:szCs w:val="22"/>
         </w:rPr>
-        <w:t xml:space="preserve">Invoice automation sits between the invoices you receive and the ERP that records them. Your ERP stays the system of record. We make sure everything that reaches it is complete, checked and approved.</w:t>
+        <w:t xml:space="preserve">Invoice automation sits between your incoming invoices and the ERP that records them. Your ERP stays the system of record, and everything reaching it is complete, checked and approved.</w:t>
       </w:r>
     </w:p>
     <w:p>
@@ -2731,7 +2796,7 @@
           <w:sz w:val="22"/>
           <w:szCs w:val="22"/>
         </w:rPr>
-        <w:t xml:space="preserve">Every route an invoice takes into your business feeds one queue, so nothing is missed or processed twice.</w:t>
+        <w:t xml:space="preserve">Every route into your business feeds one queue, so nothing is missed or processed twice.</w:t>
       </w:r>
     </w:p>
     <w:p>
@@ -2776,7 +2841,7 @@
           <w:sz w:val="22"/>
           <w:szCs w:val="22"/>
         </w:rPr>
-        <w:t xml:space="preserve">AP ageing, cycle times, exception rates and approver turnaround feed the dashboards your finance leaders already use.</w:t>
+        <w:t xml:space="preserve">AP ageing, cycle times, exception rates and approver turnaround feed your finance leaders' dashboards.</w:t>
       </w:r>
     </w:p>
     <w:p>
@@ -2844,19 +2909,6 @@
           <w:szCs w:val="22"/>
         </w:rPr>
         <w:t xml:space="preserve">Start with a process assessment</w:t>
-      </w:r>
-    </w:p>
-    <w:p>
-      <w:pPr>
-        <w:spacing w:after="120" w:line="276"/>
-      </w:pPr>
-      <w:r>
-        <w:rPr>
-          <w:rFonts w:ascii="Calibri" w:cs="Calibri" w:eastAsia="Calibri" w:hAnsi="Calibri"/>
-          <w:sz w:val="22"/>
-          <w:szCs w:val="22"/>
-        </w:rPr>
-        <w:t xml:space="preserve">We map your AP process and agree the outcomes to measure before anything is configured.</w:t>
       </w:r>
     </w:p>
     <w:p>
@@ -2926,7 +2978,7 @@
           <w:sz w:val="22"/>
           <w:szCs w:val="22"/>
         </w:rPr>
-        <w:t xml:space="preserve">Invoice automation uses software and AI to handle supplier invoices from the moment they arrive: capturing the data, checking it against purchase orders and receipts, routing approvals, posting to the ERP and archiving. It replaces manual keying and approval chasing, which shortens processing time and reduces errors and cost. Accounts payable automation is broader and also covers supplier onboarding, payment runs, reconciliations and AP reporting. We start with invoice processing and can extend across the wider purchase-to-pay cycle.</w:t>
+        <w:t xml:space="preserve">Invoice automation uses software and AI to handle supplier invoices from arrival to ERP posting: capture, matching to purchase orders and receipts, approvals and archiving. It replaces manual keying and chasing, cutting processing time, errors and cost. Accounts payable automation is broader, adding supplier onboarding, payment runs, reconciliations and AP reporting. We start with invoice processing and can extend across purchase-to-pay.</w:t>
       </w:r>
     </w:p>
     <w:p>
@@ -2953,7 +3005,7 @@
           <w:sz w:val="22"/>
           <w:szCs w:val="22"/>
         </w:rPr>
-        <w:t xml:space="preserve">An invoice is captured on arrival by email, scanner or e-invoice. HAMT AI reads it, and the platform checks it against the purchase order, goods receipt and your VAT rules. It then goes to the right approver, and once approved the posting data is sent to your ERP. OCR only reads text. Intelligent document processing adds invoice data extraction that understands layouts, line items and suppliers, scores its own confidence and learns from corrections. Arabic, English and mixed-language invoices, including faded, skewed and dot-matrix prints, are read as standard.</w:t>
+        <w:t xml:space="preserve">An invoice is captured by email, scanner or e-invoice, read by HAMT AI, checked against the purchase order, goods receipt and VAT rules, approved, then posted to your ERP. OCR only reads text. Intelligent document processing adds invoice data extraction that understands layouts, line items and suppliers, scores its confidence and learns from corrections. Arabic, English and mixed-language invoices, including faded, skewed and dot-matrix prints, are read as standard.</w:t>
       </w:r>
     </w:p>
     <w:p>
@@ -2980,7 +3032,7 @@
           <w:sz w:val="22"/>
           <w:szCs w:val="22"/>
         </w:rPr>
-        <w:t xml:space="preserve">HAMT AI is HLB HAMT's own AI. HAMT stands for Human-integrated, Automation, Machine learning and Transformation. Clean invoices flow through, while uncertain or failed ones go to a reviewer with the reason attached, instead of being guessed. Each correction retrains the models, so reviewers see fewer invoices over time. HLB HAMT builds and supports it, so the team that implements your rollout also tunes the models, rules and controls.</w:t>
+        <w:t xml:space="preserve">HAMT AI is HLB HAMT's own AI: Human-integrated, Automation, Machine learning and Transformation. Clean invoices flow through. Uncertain or failed ones go to a reviewer with the reason attached, never guessed, and each correction retrains the models. HLB HAMT builds and supports it, so the team implementing your rollout also tunes it.</w:t>
       </w:r>
     </w:p>
     <w:p>
@@ -3007,7 +3059,7 @@
           <w:sz w:val="22"/>
           <w:szCs w:val="22"/>
         </w:rPr>
-        <w:t xml:space="preserve">Yes. Mid-sized companies usually start in the cloud with ready-to-use workflows and one or two entities, and go live quickly. Large enterprises and groups add multi-level approval hierarchies, enterprise ERP integration, private hosting and shared service centre operation. Both run on the same platform, so you never switch systems as you grow. We integrate with leading ERP and accounting systems and in-house platforms through APIs or structured file imports, agreed with your IT team during scoping. Approvers work in our own web and mobile screens, so they need no ERP access. Hosting can be cloud, private cloud or your own servers, with invoice data kept inside the UAE if you need it, and we document the architecture for your IT and security teams before go-live. Unlike standalone invoice processing software, our team scopes and builds all of this with you.</w:t>
+        <w:t xml:space="preserve">Yes. Mid-sized companies usually start in the cloud with ready-to-use workflows and one or two entities; large enterprises add multi-level approvals, enterprise ERP integration, private hosting and shared service centres. Both run on one platform, so you never switch systems. We integrate with ERP, accounting and in-house systems through APIs or file imports, agreed with your IT team during scoping, and approvers use our web and mobile screens with no ERP access. Hosting can be cloud, private cloud or your own servers, with data kept in the UAE if needed and the architecture documented before go-live. Unlike standalone invoice processing software, our team scopes and builds it all with you.</w:t>
       </w:r>
     </w:p>
     <w:p>
@@ -3034,7 +3086,7 @@
           <w:sz w:val="22"/>
           <w:szCs w:val="22"/>
         </w:rPr>
-        <w:t xml:space="preserve">Yes. The UAE is introducing e-invoicing on the Peppol-based PINT AE standard. Businesses with annual revenue of AED 50 million or more must go live from 1 January 2027, other businesses from 1 July 2027 and government entities from 1 October 2027 [CONFIRM]. Invoices will be exchanged through Accredited Service Providers. We receive structured invoices from your provider and process them alongside the scanned and PDF invoices you will still get from other suppliers.</w:t>
+        <w:t xml:space="preserve">Yes. UAE e-invoicing is introduced on the Peppol-based PINT AE standard: from 1 January 2027 for businesses with revenue of AED 50 million or more, 1 July 2027 for others and 1 October 2027 for government entities [CONFIRM], through Accredited Service Providers. We receive structured invoices from your provider and process them alongside scans and PDFs.</w:t>
       </w:r>
     </w:p>
     <w:p>
@@ -3061,7 +3113,7 @@
           <w:sz w:val="22"/>
           <w:szCs w:val="22"/>
         </w:rPr>
-        <w:t xml:space="preserve">A focused rollout with one entity, one ERP and standard invoice formats can usually go live within a few weeks [CONFIRM]. Group-wide programmes roll out entity by entity over several months, with the first entity live early so you see results before the full rollout ends. Cost depends on invoice volumes, users and entities, the hosting model and the depth of ERP integration. After a short scoping call, we send a written quote based on your actual setup.</w:t>
+        <w:t xml:space="preserve">A focused rollout with one entity, one ERP and standard formats can usually go live within a few weeks [CONFIRM]. Group programmes roll out entity by entity over several months, with the first entity live early. Cost depends on volumes, users, entities, hosting and ERP integration. After a short scoping call we send a written quote.</w:t>
       </w:r>
     </w:p>
     <w:p>
@@ -3228,7 +3280,7 @@
                 <w:sz w:val="21"/>
                 <w:szCs w:val="21"/>
               </w:rPr>
-              <w:t xml:space="preserve">9</w:t>
+              <w:t xml:space="preserve">10</w:t>
             </w:r>
           </w:p>
         </w:tc>
@@ -3588,7 +3640,7 @@
                 <w:sz w:val="21"/>
                 <w:szCs w:val="21"/>
               </w:rPr>
-              <w:t xml:space="preserve">19</w:t>
+              <w:t xml:space="preserve">15</w:t>
             </w:r>
           </w:p>
         </w:tc>
@@ -3768,7 +3820,7 @@
                 <w:sz w:val="21"/>
                 <w:szCs w:val="21"/>
               </w:rPr>
-              <w:t xml:space="preserve">2</w:t>
+              <w:t xml:space="preserve">1</w:t>
             </w:r>
           </w:p>
         </w:tc>

</xml_diff>

<commit_message>
Add five inline SVG illustrations to the invoice automation page
Co-Authored-By: Claude Sonnet 5.5 <noreply@anthropic.com>
Claude-Session: https://claude.ai/code/session_012PGo17x7AccmkmEWZ5KHUv
</commit_message>
<xml_diff>
--- a/invoice-automation.docx
+++ b/invoice-automation.docx
@@ -928,6 +928,22 @@
     </w:p>
     <w:p>
       <w:pPr>
+        <w:spacing w:after="120" w:line="276"/>
+      </w:pPr>
+      <w:r>
+        <w:rPr>
+          <w:rFonts w:ascii="Calibri" w:cs="Calibri" w:eastAsia="Calibri" w:hAnsi="Calibri"/>
+          <w:i/>
+          <w:iCs/>
+          <w:color w:val="8A97A3"/>
+          <w:sz w:val="19"/>
+          <w:szCs w:val="19"/>
+        </w:rPr>
+        <w:t xml:space="preserve">[IMAGE: month-end illustration (pile of unkeyed invoices becomes a closed month), beside the Benefits heading.]</w:t>
+      </w:r>
+    </w:p>
+    <w:p>
+      <w:pPr>
         <w:spacing w:after="40" w:before="200"/>
       </w:pPr>
       <w:r>
@@ -1066,6 +1082,22 @@
     </w:p>
     <w:p>
       <w:pPr>
+        <w:spacing w:after="120" w:line="276"/>
+      </w:pPr>
+      <w:r>
+        <w:rPr>
+          <w:rFonts w:ascii="Calibri" w:cs="Calibri" w:eastAsia="Calibri" w:hAnsi="Calibri"/>
+          <w:i/>
+          <w:iCs/>
+          <w:color w:val="8A97A3"/>
+          <w:sz w:val="19"/>
+          <w:szCs w:val="19"/>
+        </w:rPr>
+        <w:t xml:space="preserve">[IMAGE: learning cycle diagram (Flag, Correct, Retrain, Improve around HAMT AI), beside the section heading.]</w:t>
+      </w:r>
+    </w:p>
+    <w:p>
+      <w:pPr>
         <w:spacing w:after="40" w:before="200"/>
       </w:pPr>
       <w:r>
@@ -1428,6 +1460,22 @@
     </w:p>
     <w:p>
       <w:pPr>
+        <w:spacing w:after="120" w:line="276"/>
+      </w:pPr>
+      <w:r>
+        <w:rPr>
+          <w:rFonts w:ascii="Calibri" w:cs="Calibri" w:eastAsia="Calibri" w:hAnsi="Calibri"/>
+          <w:i/>
+          <w:iCs/>
+          <w:color w:val="8A97A3"/>
+          <w:sz w:val="19"/>
+          <w:szCs w:val="19"/>
+        </w:rPr>
+        <w:t xml:space="preserve">[IMAGE: inbox-to-ERP pipeline (Capture, Read, Verify, Approve, Post, Archive), above the six step cards.]</w:t>
+      </w:r>
+    </w:p>
+    <w:p>
+      <w:pPr>
         <w:spacing w:after="40" w:before="200"/>
       </w:pPr>
       <w:r>
@@ -2135,6 +2183,22 @@
     </w:p>
     <w:p>
       <w:pPr>
+        <w:spacing w:after="120" w:line="276"/>
+      </w:pPr>
+      <w:r>
+        <w:rPr>
+          <w:rFonts w:ascii="Calibri" w:cs="Calibri" w:eastAsia="Calibri" w:hAnsi="Calibri"/>
+          <w:i/>
+          <w:iCs/>
+          <w:color w:val="8A97A3"/>
+          <w:sz w:val="19"/>
+          <w:szCs w:val="19"/>
+        </w:rPr>
+        <w:t xml:space="preserve">[IMAGE: bilingual Arabic and English tax invoice illustration with TRN and VAT checks, beside the Region heading.]</w:t>
+      </w:r>
+    </w:p>
+    <w:p>
+      <w:pPr>
         <w:spacing w:after="40" w:before="200"/>
       </w:pPr>
       <w:r>
@@ -2664,6 +2728,22 @@
           <w:szCs w:val="22"/>
         </w:rPr>
         <w:t xml:space="preserve">A Dubai-based team backed by HLB, the global advisory and accounting network in more than 150 countries [CONFIRM].</w:t>
+      </w:r>
+    </w:p>
+    <w:p>
+      <w:pPr>
+        <w:spacing w:after="120" w:line="276"/>
+      </w:pPr>
+      <w:r>
+        <w:rPr>
+          <w:rFonts w:ascii="Calibri" w:cs="Calibri" w:eastAsia="Calibri" w:hAnsi="Calibri"/>
+          <w:i/>
+          <w:iCs/>
+          <w:color w:val="8A97A3"/>
+          <w:sz w:val="19"/>
+          <w:szCs w:val="19"/>
+        </w:rPr>
+        <w:t xml:space="preserve">[IMAGE: ERP integration diagram (invoice channels, Invoice Automation with HAMT AI, ERP and reporting), above the three integration cards.]</w:t>
       </w:r>
     </w:p>
     <w:p>

</xml_diff>

<commit_message>
Apply HLB HAMT brand colours to page and illustrations
Co-Authored-By: Claude Sonnet 5.5 <noreply@anthropic.com>
Claude-Session: https://claude.ai/code/session_012PGo17x7AccmkmEWZ5KHUv
</commit_message>
<xml_diff>
--- a/invoice-automation.docx
+++ b/invoice-automation.docx
@@ -4199,6 +4199,24 @@
           <w:sz w:val="22"/>
           <w:szCs w:val="22"/>
         </w:rPr>
+        <w:t xml:space="preserve">Colours were taken from HLB HAMT's own SugarAI CRM page: deep blue #005A77 (section backgrounds), gold #FBBA00 (highlighted words), and neutrals #111827, #4B5563, #E5E7EB. Please confirm against the official brand guide.</w:t>
+      </w:r>
+    </w:p>
+    <w:p>
+      <w:pPr>
+        <w:pStyle w:val="ListParagraph"/>
+        <w:numPr>
+          <w:ilvl w:val="0"/>
+          <w:numId w:val="2"/>
+        </w:numPr>
+        <w:spacing w:after="80" w:line="276"/>
+      </w:pPr>
+      <w:r>
+        <w:rPr>
+          <w:rFonts w:ascii="Calibri" w:cs="Calibri" w:eastAsia="Calibri" w:hAnsi="Calibri"/>
+          <w:sz w:val="22"/>
+          <w:szCs w:val="22"/>
+        </w:rPr>
         <w:t xml:space="preserve">CLAUDE.md was not found in the repository, so its rules could not be applied. Please send it and I will check the page against it.</w:t>
       </w:r>
     </w:p>

</xml_diff>

<commit_message>
Bold subheading labels in the doc and record the rule
Co-Authored-By: Claude Sonnet 5.5 <noreply@anthropic.com>
Claude-Session: https://claude.ai/code/session_012PGo17x7AccmkmEWZ5KHUv
</commit_message>
<xml_diff>
--- a/invoice-automation.docx
+++ b/invoice-automation.docx
@@ -348,8 +348,14 @@
         <w:jc w:val="both"/>
       </w:pPr>
       <w:r>
+        <w:rPr>
+          <w:b/>
+        </w:rPr>
+        <w:t>● Eyebrow:</w:t>
+      </w:r>
+      <w:r>
         <w:rPr/>
-        <w:t>● Eyebrow: AI · Document Processing · Invoice Automation</w:t>
+        <w:t xml:space="preserve"> AI · Document Processing · Invoice Automation</w:t>
       </w:r>
     </w:p>
     <w:p>
@@ -359,8 +365,14 @@
         <w:jc w:val="both"/>
       </w:pPr>
       <w:r>
+        <w:rPr>
+          <w:b/>
+        </w:rPr>
+        <w:t>● H1:</w:t>
+      </w:r>
+      <w:r>
         <w:rPr/>
-        <w:t>● H1: Your business has grown. Your invoice automation should keep learning.</w:t>
+        <w:t xml:space="preserve"> Your business has grown. Your invoice automation should keep learning.</w:t>
       </w:r>
     </w:p>
     <w:p>
@@ -370,8 +382,14 @@
         <w:jc w:val="both"/>
       </w:pPr>
       <w:r>
+        <w:rPr>
+          <w:b/>
+        </w:rPr>
+        <w:t>● Intro paragraph:</w:t>
+      </w:r>
+      <w:r>
         <w:rPr/>
-        <w:t>● Intro paragraph: HLB HAMT's invoice automation uses HAMT AI, our own AI, to capture, check and route every supplier invoice in Arabic or English, from arrival to ERP posting. Built for mid-sized companies and large enterprises across the UAE, the GCC and the wider Middle East, and designed by auditors, so control comes as standard. Reviewer corrections train the models, and we assess, implement, integrate and optimise it with you.</w:t>
+        <w:t xml:space="preserve"> HLB HAMT's invoice automation uses HAMT AI, our own AI, to capture, check and route every supplier invoice in Arabic or English, from arrival to ERP posting. Built for mid-sized companies and large enterprises across the UAE, the GCC and the wider Middle East, and designed by auditors, so control comes as standard. Reviewer corrections train the models, and we assess, implement, integrate and optimise it with you.</w:t>
       </w:r>
     </w:p>
     <w:p>
@@ -381,8 +399,14 @@
         <w:jc w:val="both"/>
       </w:pPr>
       <w:r>
+        <w:rPr>
+          <w:b/>
+        </w:rPr>
+        <w:t>● Buttons:</w:t>
+      </w:r>
+      <w:r>
         <w:rPr/>
-        <w:t>● Buttons: Book a demo (primary) · See how it works (secondary)</w:t>
+        <w:t xml:space="preserve"> Book a demo (primary) · See how it works (secondary)</w:t>
       </w:r>
     </w:p>
     <w:p>
@@ -392,8 +416,14 @@
         <w:jc w:val="both"/>
       </w:pPr>
       <w:r>
+        <w:rPr>
+          <w:b/>
+        </w:rPr>
+        <w:t>● Hero note:</w:t>
+      </w:r>
+      <w:r>
         <w:rPr/>
-        <w:t>● Hero note: From HLB HAMT, an award-winning [CONFIRM] advisory and accounting firm in the UAE and a member of HLB, the global advisory and accounting network.</w:t>
+        <w:t xml:space="preserve"> From HLB HAMT, an award-winning [CONFIRM] advisory and accounting firm in the UAE and a member of HLB, the global advisory and accounting network.</w:t>
       </w:r>
     </w:p>
     <w:p/>
@@ -404,7 +434,9 @@
         <w:jc w:val="both"/>
       </w:pPr>
       <w:r>
-        <w:rPr/>
+        <w:rPr>
+          <w:b/>
+        </w:rPr>
         <w:t>Hero side panel (example invoice card)</w:t>
       </w:r>
     </w:p>
@@ -415,8 +447,14 @@
         <w:jc w:val="both"/>
       </w:pPr>
       <w:r>
+        <w:rPr>
+          <w:b/>
+        </w:rPr>
+        <w:t>● Heading:</w:t>
+      </w:r>
+      <w:r>
         <w:rPr/>
-        <w:t>● Heading: Example: one supplier invoice moving through the process</w:t>
+        <w:t xml:space="preserve"> Example: one supplier invoice moving through the process</w:t>
       </w:r>
     </w:p>
     <w:p>
@@ -426,8 +464,14 @@
         <w:jc w:val="both"/>
       </w:pPr>
       <w:r>
+        <w:rPr>
+          <w:b/>
+        </w:rPr>
+        <w:t>● Sub-line:</w:t>
+      </w:r>
+      <w:r>
         <w:rPr/>
-        <w:t>● Sub-line: Tax Invoice فاتورة ضريبية · INV-26-10482 · Subtotal 17,550.00 · VAT at 5% 877.50 · Total AED 18,427.50 (illustrative example)</w:t>
+        <w:t xml:space="preserve"> Tax Invoice فاتورة ضريبية · INV-26-10482 · Subtotal 17,550.00 · VAT at 5% 877.50 · Total AED 18,427.50 (illustrative example)</w:t>
       </w:r>
     </w:p>
     <w:tbl>
@@ -686,8 +730,14 @@
         <w:jc w:val="both"/>
       </w:pPr>
       <w:r>
+        <w:rPr>
+          <w:b/>
+        </w:rPr>
+        <w:t>● Footer line:</w:t>
+      </w:r>
+      <w:r>
         <w:rPr/>
-        <w:t>● Footer line: When a check fails, the invoice goes to a person with the reason attached. Nothing reaches the ledger unchecked.</w:t>
+        <w:t xml:space="preserve"> When a check fails, the invoice goes to a person with the reason attached. Nothing reaches the ledger unchecked.</w:t>
       </w:r>
     </w:p>
     <w:p/>
@@ -716,7 +766,9 @@
         <w:jc w:val="both"/>
       </w:pPr>
       <w:r>
-        <w:rPr/>
+        <w:rPr>
+          <w:b/>
+        </w:rPr>
         <w:t>Four highlights (heading / copy):</w:t>
       </w:r>
     </w:p>
@@ -957,8 +1009,14 @@
         <w:jc w:val="both"/>
       </w:pPr>
       <w:r>
+        <w:rPr>
+          <w:b/>
+        </w:rPr>
+        <w:t>● Eyebrow:</w:t>
+      </w:r>
+      <w:r>
         <w:rPr/>
-        <w:t>● Eyebrow: Why automate accounts payable</w:t>
+        <w:t xml:space="preserve"> Why automate accounts payable</w:t>
       </w:r>
     </w:p>
     <w:p>
@@ -968,8 +1026,14 @@
         <w:jc w:val="both"/>
       </w:pPr>
       <w:r>
+        <w:rPr>
+          <w:b/>
+        </w:rPr>
+        <w:t>● H2:</w:t>
+      </w:r>
+      <w:r>
         <w:rPr/>
-        <w:t>● H2: More suppliers and more entities, but the same manual AP process</w:t>
+        <w:t xml:space="preserve"> More suppliers and more entities, but the same manual AP process</w:t>
       </w:r>
     </w:p>
     <w:p>
@@ -979,8 +1043,14 @@
         <w:jc w:val="both"/>
       </w:pPr>
       <w:r>
+        <w:rPr>
+          <w:b/>
+        </w:rPr>
+        <w:t>● Intro:</w:t>
+      </w:r>
+      <w:r>
         <w:rPr/>
-        <w:t>● Intro: A capable AP team copes with a few hundred invoices a month. Then the business adds a branch, a warehouse, a second entity or another country. Invoices arrive by email, courier and WhatsApp, in Arabic and English, some still off dot-matrix printers. Approvers travel, month-end turns into a scramble, and controls that worked at a smaller size start to slip.</w:t>
+        <w:t xml:space="preserve"> A capable AP team copes with a few hundred invoices a month. Then the business adds a branch, a warehouse, a second entity or another country. Invoices arrive by email, courier and WhatsApp, in Arabic and English, some still off dot-matrix printers. Approvers travel, month-end turns into a scramble, and controls that worked at a smaller size start to slip.</w:t>
       </w:r>
     </w:p>
     <w:p>
@@ -990,7 +1060,9 @@
         <w:jc w:val="both"/>
       </w:pPr>
       <w:r>
-        <w:rPr/>
+        <w:rPr>
+          <w:b/>
+        </w:rPr>
         <w:t>Four cards (heading / copy):</w:t>
       </w:r>
     </w:p>
@@ -1213,8 +1285,14 @@
         <w:jc w:val="both"/>
       </w:pPr>
       <w:r>
+        <w:rPr>
+          <w:b/>
+        </w:rPr>
+        <w:t>● Bridge line:</w:t>
+      </w:r>
+      <w:r>
         <w:rPr/>
-        <w:t>● Bridge line: Hiring more people keeps the process running for a while. Accounts payable automation changes the process, and that is what lets it scale.</w:t>
+        <w:t xml:space="preserve"> Hiring more people keeps the process running for a while. Accounts payable automation changes the process, and that is what lets it scale.</w:t>
       </w:r>
     </w:p>
     <w:p/>
@@ -1243,8 +1321,14 @@
         <w:jc w:val="both"/>
       </w:pPr>
       <w:r>
+        <w:rPr>
+          <w:b/>
+        </w:rPr>
+        <w:t>● Eyebrow:</w:t>
+      </w:r>
+      <w:r>
         <w:rPr/>
-        <w:t>● Eyebrow: What changes</w:t>
+        <w:t xml:space="preserve"> What changes</w:t>
       </w:r>
     </w:p>
     <w:p>
@@ -1254,8 +1338,14 @@
         <w:jc w:val="both"/>
       </w:pPr>
       <w:r>
+        <w:rPr>
+          <w:b/>
+        </w:rPr>
+        <w:t>● H2:</w:t>
+      </w:r>
+      <w:r>
         <w:rPr/>
-        <w:t>● H2: From paper chase to touchless invoice processing</w:t>
+        <w:t xml:space="preserve"> From paper chase to touchless invoice processing</w:t>
       </w:r>
     </w:p>
     <w:p>
@@ -1265,8 +1355,14 @@
         <w:jc w:val="both"/>
       </w:pPr>
       <w:r>
+        <w:rPr>
+          <w:b/>
+        </w:rPr>
+        <w:t>● Intro:</w:t>
+      </w:r>
+      <w:r>
         <w:rPr/>
-        <w:t>● Intro: Invoice processing automation takes over routine accounts payable work. Invoices that pass every check flow straight to approval and posting; those needing judgement reach the right person with the reason attached.</w:t>
+        <w:t xml:space="preserve"> Invoice processing automation takes over routine accounts payable work. Invoices that pass every check flow straight to approval and posting; those needing judgement reach the right person with the reason attached.</w:t>
       </w:r>
     </w:p>
     <w:p>
@@ -1276,8 +1372,14 @@
         <w:jc w:val="both"/>
       </w:pPr>
       <w:r>
+        <w:rPr>
+          <w:b/>
+        </w:rPr>
+        <w:t>● H3:</w:t>
+      </w:r>
+      <w:r>
         <w:rPr/>
-        <w:t>● H3: Manual vs automated invoice processing</w:t>
+        <w:t xml:space="preserve"> Manual vs automated invoice processing</w:t>
       </w:r>
     </w:p>
     <w:p>
@@ -1287,7 +1389,9 @@
         <w:jc w:val="both"/>
       </w:pPr>
       <w:r>
-        <w:rPr/>
+        <w:rPr>
+          <w:b/>
+        </w:rPr>
         <w:t>Six rows (manual today / with HAMT AI):</w:t>
       </w:r>
     </w:p>
@@ -1602,8 +1706,14 @@
         <w:jc w:val="both"/>
       </w:pPr>
       <w:r>
+        <w:rPr>
+          <w:b/>
+        </w:rPr>
+        <w:t>● Eyebrow:</w:t>
+      </w:r>
+      <w:r>
         <w:rPr/>
-        <w:t>● Eyebrow: Benefits</w:t>
+        <w:t xml:space="preserve"> Benefits</w:t>
       </w:r>
     </w:p>
     <w:p>
@@ -1613,8 +1723,14 @@
         <w:jc w:val="both"/>
       </w:pPr>
       <w:r>
+        <w:rPr>
+          <w:b/>
+        </w:rPr>
+        <w:t>● H2:</w:t>
+      </w:r>
+      <w:r>
         <w:rPr/>
-        <w:t>● H2: Benefits of invoice automation for finance teams</w:t>
+        <w:t xml:space="preserve"> Benefits of invoice automation for finance teams</w:t>
       </w:r>
     </w:p>
     <w:p>
@@ -1624,8 +1740,14 @@
         <w:jc w:val="both"/>
       </w:pPr>
       <w:r>
+        <w:rPr>
+          <w:b/>
+        </w:rPr>
+        <w:t>● Image:</w:t>
+      </w:r>
+      <w:r>
         <w:rPr/>
-        <w:t>● Image: A pile of unkeyed invoices becomes a month-end close that finishes on time</w:t>
+        <w:t xml:space="preserve"> A pile of unkeyed invoices becomes a month-end close that finishes on time</w:t>
       </w:r>
     </w:p>
     <w:p>
@@ -1635,7 +1757,9 @@
         <w:jc w:val="both"/>
       </w:pPr>
       <w:r>
-        <w:rPr/>
+        <w:rPr>
+          <w:b/>
+        </w:rPr>
         <w:t>Four cards (heading / copy):</w:t>
       </w:r>
     </w:p>
@@ -1876,8 +2000,14 @@
         <w:jc w:val="both"/>
       </w:pPr>
       <w:r>
+        <w:rPr>
+          <w:b/>
+        </w:rPr>
+        <w:t>● Eyebrow:</w:t>
+      </w:r>
+      <w:r>
         <w:rPr/>
-        <w:t>● Eyebrow: The learning cycle</w:t>
+        <w:t xml:space="preserve"> The learning cycle</w:t>
       </w:r>
     </w:p>
     <w:p>
@@ -1887,8 +2017,14 @@
         <w:jc w:val="both"/>
       </w:pPr>
       <w:r>
+        <w:rPr>
+          <w:b/>
+        </w:rPr>
+        <w:t>● H2:</w:t>
+      </w:r>
+      <w:r>
         <w:rPr/>
-        <w:t>● H2: Every reviewer correction makes your invoice automation smarter</w:t>
+        <w:t xml:space="preserve"> Every reviewer correction makes your invoice automation smarter</w:t>
       </w:r>
     </w:p>
     <w:p>
@@ -1898,8 +2034,14 @@
         <w:jc w:val="both"/>
       </w:pPr>
       <w:r>
+        <w:rPr>
+          <w:b/>
+        </w:rPr>
+        <w:t>● Intro:</w:t>
+      </w:r>
+      <w:r>
         <w:rPr/>
-        <w:t>● Intro: HAMT AI, the engine behind our invoice automation, pairs intelligent document processing with human review and keeps learning from the people who check its work.</w:t>
+        <w:t xml:space="preserve"> HAMT AI, the engine behind our invoice automation, pairs intelligent document processing with human review and keeps learning from the people who check its work.</w:t>
       </w:r>
     </w:p>
     <w:p>
@@ -1909,8 +2051,14 @@
         <w:jc w:val="both"/>
       </w:pPr>
       <w:r>
+        <w:rPr>
+          <w:b/>
+        </w:rPr>
+        <w:t>● Image:</w:t>
+      </w:r>
+      <w:r>
         <w:rPr/>
-        <w:t>● Image: Learning cycle: HAMT AI flags uncertain fields, a reviewer corrects them, the models retrain and improve</w:t>
+        <w:t xml:space="preserve"> Learning cycle: HAMT AI flags uncertain fields, a reviewer corrects them, the models retrain and improve</w:t>
       </w:r>
     </w:p>
     <w:p>
@@ -1920,7 +2068,9 @@
         <w:jc w:val="both"/>
       </w:pPr>
       <w:r>
-        <w:rPr/>
+        <w:rPr>
+          <w:b/>
+        </w:rPr>
         <w:t>Four steps (heading / copy):</w:t>
       </w:r>
     </w:p>
@@ -1999,8 +2149,14 @@
         <w:jc w:val="both"/>
       </w:pPr>
       <w:r>
+        <w:rPr>
+          <w:b/>
+        </w:rPr>
+        <w:t>● H3:</w:t>
+      </w:r>
+      <w:r>
         <w:rPr/>
-        <w:t>● H3: HAMT AI's four pillars, applied to invoices</w:t>
+        <w:t xml:space="preserve"> HAMT AI's four pillars, applied to invoices</w:t>
       </w:r>
     </w:p>
     <w:p>
@@ -2010,7 +2166,9 @@
         <w:jc w:val="both"/>
       </w:pPr>
       <w:r>
-        <w:rPr/>
+        <w:rPr>
+          <w:b/>
+        </w:rPr>
         <w:t>Four pillars (letter / heading / copy):</w:t>
       </w:r>
     </w:p>
@@ -2317,8 +2475,14 @@
         <w:jc w:val="both"/>
       </w:pPr>
       <w:r>
+        <w:rPr>
+          <w:b/>
+        </w:rPr>
+        <w:t>● H3:</w:t>
+      </w:r>
+      <w:r>
         <w:rPr/>
-        <w:t>● H3: Exception handling that gets smarter</w:t>
+        <w:t xml:space="preserve"> Exception handling that gets smarter</w:t>
       </w:r>
     </w:p>
     <w:p>
@@ -2328,8 +2492,14 @@
         <w:jc w:val="both"/>
       </w:pPr>
       <w:r>
+        <w:rPr>
+          <w:b/>
+        </w:rPr>
+        <w:t>● Copy:</w:t>
+      </w:r>
+      <w:r>
         <w:rPr/>
-        <w:t>● Copy: We design review queues, roles and thresholds with you and track the review rate as a service measure.</w:t>
+        <w:t xml:space="preserve"> We design review queues, roles and thresholds with you and track the review rate as a service measure.</w:t>
       </w:r>
     </w:p>
     <w:p>
@@ -2339,8 +2509,14 @@
         <w:jc w:val="both"/>
       </w:pPr>
       <w:r>
+        <w:rPr>
+          <w:b/>
+        </w:rPr>
+        <w:t>● Point:</w:t>
+      </w:r>
+      <w:r>
         <w:rPr/>
-        <w:t>● Point: Corrections are logged with who made them and when.</w:t>
+        <w:t xml:space="preserve"> Corrections are logged with who made them and when.</w:t>
       </w:r>
     </w:p>
     <w:p>
@@ -2350,8 +2526,14 @@
         <w:jc w:val="both"/>
       </w:pPr>
       <w:r>
+        <w:rPr>
+          <w:b/>
+        </w:rPr>
+        <w:t>● Point:</w:t>
+      </w:r>
+      <w:r>
         <w:rPr/>
-        <w:t>● Point: Retraining is supervised by HLB HAMT, and data handling is agreed with your IT team before go-live.</w:t>
+        <w:t xml:space="preserve"> Retraining is supervised by HLB HAMT, and data handling is agreed with your IT team before go-live.</w:t>
       </w:r>
     </w:p>
     <w:p/>
@@ -2380,8 +2562,14 @@
         <w:jc w:val="both"/>
       </w:pPr>
       <w:r>
+        <w:rPr>
+          <w:b/>
+        </w:rPr>
+        <w:t>● H2:</w:t>
+      </w:r>
+      <w:r>
         <w:rPr/>
-        <w:t>● H2: See HAMT AI learn from your invoices</w:t>
+        <w:t xml:space="preserve"> See HAMT AI learn from your invoices</w:t>
       </w:r>
     </w:p>
     <w:p>
@@ -2391,8 +2579,14 @@
         <w:jc w:val="both"/>
       </w:pPr>
       <w:r>
+        <w:rPr>
+          <w:b/>
+        </w:rPr>
+        <w:t>● Button:</w:t>
+      </w:r>
+      <w:r>
         <w:rPr/>
-        <w:t>● Button: Book a demo</w:t>
+        <w:t xml:space="preserve"> Book a demo</w:t>
       </w:r>
     </w:p>
     <w:p/>
@@ -2421,8 +2615,14 @@
         <w:jc w:val="both"/>
       </w:pPr>
       <w:r>
+        <w:rPr>
+          <w:b/>
+        </w:rPr>
+        <w:t>● Eyebrow:</w:t>
+      </w:r>
+      <w:r>
         <w:rPr/>
-        <w:t>● Eyebrow: How automated invoice processing works</w:t>
+        <w:t xml:space="preserve"> How automated invoice processing works</w:t>
       </w:r>
     </w:p>
     <w:p>
@@ -2432,8 +2632,14 @@
         <w:jc w:val="both"/>
       </w:pPr>
       <w:r>
+        <w:rPr>
+          <w:b/>
+        </w:rPr>
+        <w:t>● H2:</w:t>
+      </w:r>
+      <w:r>
         <w:rPr/>
-        <w:t>● H2: The journey of an invoice, from inbox to ERP</w:t>
+        <w:t xml:space="preserve"> The journey of an invoice, from inbox to ERP</w:t>
       </w:r>
     </w:p>
     <w:p>
@@ -2443,8 +2649,14 @@
         <w:jc w:val="both"/>
       </w:pPr>
       <w:r>
+        <w:rPr>
+          <w:b/>
+        </w:rPr>
+        <w:t>● Intro:</w:t>
+      </w:r>
+      <w:r>
         <w:rPr/>
-        <w:t>● Intro: Six steps, each one recorded. Your team steps in only when a check fails or an approval is due.</w:t>
+        <w:t xml:space="preserve"> Six steps, each one recorded. Your team steps in only when a check fails or an approval is due.</w:t>
       </w:r>
     </w:p>
     <w:p>
@@ -2454,8 +2666,14 @@
         <w:jc w:val="both"/>
       </w:pPr>
       <w:r>
+        <w:rPr>
+          <w:b/>
+        </w:rPr>
+        <w:t>● Image:</w:t>
+      </w:r>
+      <w:r>
         <w:rPr/>
-        <w:t>● Image: One invoice: HAMT AI reads and checks it, clean invoices go straight to approval and the ERP, flagged ones go to a reviewer whose correction retrains HAMT AI</w:t>
+        <w:t xml:space="preserve"> One invoice: HAMT AI reads and checks it, clean invoices go straight to approval and the ERP, flagged ones go to a reviewer whose correction retrains HAMT AI</w:t>
       </w:r>
     </w:p>
     <w:p>
@@ -2465,7 +2683,9 @@
         <w:jc w:val="both"/>
       </w:pPr>
       <w:r>
-        <w:rPr/>
+        <w:rPr>
+          <w:b/>
+        </w:rPr>
         <w:t>Six-step process (step / heading / copy / points):</w:t>
       </w:r>
     </w:p>
@@ -3078,8 +3298,14 @@
         <w:jc w:val="both"/>
       </w:pPr>
       <w:r>
+        <w:rPr>
+          <w:b/>
+        </w:rPr>
+        <w:t>● Eyebrow:</w:t>
+      </w:r>
+      <w:r>
         <w:rPr/>
-        <w:t>● Eyebrow: From mid-market to enterprise</w:t>
+        <w:t xml:space="preserve"> From mid-market to enterprise</w:t>
       </w:r>
     </w:p>
     <w:p>
@@ -3089,8 +3315,14 @@
         <w:jc w:val="both"/>
       </w:pPr>
       <w:r>
+        <w:rPr>
+          <w:b/>
+        </w:rPr>
+        <w:t>● H2:</w:t>
+      </w:r>
+      <w:r>
         <w:rPr/>
-        <w:t>● H2: Start with one entity. Grow into the whole group.</w:t>
+        <w:t xml:space="preserve"> Start with one entity. Grow into the whole group.</w:t>
       </w:r>
     </w:p>
     <w:p>
@@ -3100,8 +3332,14 @@
         <w:jc w:val="both"/>
       </w:pPr>
       <w:r>
+        <w:rPr>
+          <w:b/>
+        </w:rPr>
+        <w:t>● Intro:</w:t>
+      </w:r>
+      <w:r>
         <w:rPr/>
-        <w:t>● Intro: Whether you handle hundreds of invoices a month or many thousands across countries, it runs on one platform. Start with what you need and extend as you grow.</w:t>
+        <w:t xml:space="preserve"> Whether you handle hundreds of invoices a month or many thousands across countries, it runs on one platform. Start with what you need and extend as you grow.</w:t>
       </w:r>
     </w:p>
     <w:p>
@@ -3111,7 +3349,9 @@
         <w:jc w:val="both"/>
       </w:pPr>
       <w:r>
-        <w:rPr/>
+        <w:rPr>
+          <w:b/>
+        </w:rPr>
         <w:t>Two tiers (tier / heading / copy and points):</w:t>
       </w:r>
     </w:p>
@@ -3400,8 +3640,14 @@
         <w:jc w:val="both"/>
       </w:pPr>
       <w:r>
+        <w:rPr>
+          <w:b/>
+        </w:rPr>
+        <w:t>● Note (all deployments):</w:t>
+      </w:r>
+      <w:r>
         <w:rPr/>
-        <w:t>● Note (all deployments): Every deployment includes bilingual capture, three-way matching, VAT and TRN checks, the HAMT AI learning cycle and a complete audit trail.</w:t>
+        <w:t xml:space="preserve"> Every deployment includes bilingual capture, three-way matching, VAT and TRN checks, the HAMT AI learning cycle and a complete audit trail.</w:t>
       </w:r>
     </w:p>
     <w:p/>
@@ -3430,8 +3676,14 @@
         <w:jc w:val="both"/>
       </w:pPr>
       <w:r>
+        <w:rPr>
+          <w:b/>
+        </w:rPr>
+        <w:t>● Eyebrow:</w:t>
+      </w:r>
+      <w:r>
         <w:rPr/>
-        <w:t>● Eyebrow: Built for the UAE, GCC and Middle East</w:t>
+        <w:t xml:space="preserve"> Built for the UAE, GCC and Middle East</w:t>
       </w:r>
     </w:p>
     <w:p>
@@ -3441,8 +3693,14 @@
         <w:jc w:val="both"/>
       </w:pPr>
       <w:r>
+        <w:rPr>
+          <w:b/>
+        </w:rPr>
+        <w:t>● H2:</w:t>
+      </w:r>
+      <w:r>
         <w:rPr/>
-        <w:t>● H2: Designed for how invoices look across the region</w:t>
+        <w:t xml:space="preserve"> Designed for how invoices look across the region</w:t>
       </w:r>
     </w:p>
     <w:p>
@@ -3452,8 +3710,14 @@
         <w:jc w:val="both"/>
       </w:pPr>
       <w:r>
+        <w:rPr>
+          <w:b/>
+        </w:rPr>
+        <w:t>● Intro:</w:t>
+      </w:r>
+      <w:r>
         <w:rPr/>
-        <w:t>● Intro: Regional invoices carry two languages, tax registration numbers, country-specific VAT rates and, increasingly, structured e-invoices, all handled as standard.</w:t>
+        <w:t xml:space="preserve"> Regional invoices carry two languages, tax registration numbers, country-specific VAT rates and, increasingly, structured e-invoices, all handled as standard.</w:t>
       </w:r>
     </w:p>
     <w:p>
@@ -3463,8 +3727,14 @@
         <w:jc w:val="both"/>
       </w:pPr>
       <w:r>
+        <w:rPr>
+          <w:b/>
+        </w:rPr>
+        <w:t>● Image:</w:t>
+      </w:r>
+      <w:r>
         <w:rPr/>
-        <w:t>● Image: Example tax invoice in Arabic and English with TRN and VAT checks passed</w:t>
+        <w:t xml:space="preserve"> Example tax invoice in Arabic and English with TRN and VAT checks passed</w:t>
       </w:r>
     </w:p>
     <w:p>
@@ -3474,7 +3744,9 @@
         <w:jc w:val="both"/>
       </w:pPr>
       <w:r>
-        <w:rPr/>
+        <w:rPr>
+          <w:b/>
+        </w:rPr>
         <w:t>Six cards (heading / copy / chips):</w:t>
       </w:r>
     </w:p>
@@ -3605,8 +3877,14 @@
         <w:jc w:val="both"/>
       </w:pPr>
       <w:r>
+        <w:rPr>
+          <w:b/>
+        </w:rPr>
+        <w:t>● H2:</w:t>
+      </w:r>
+      <w:r>
         <w:rPr/>
-        <w:t>● H2: Ready to scale accounts payable?</w:t>
+        <w:t xml:space="preserve"> Ready to scale accounts payable?</w:t>
       </w:r>
     </w:p>
     <w:p>
@@ -3616,8 +3894,14 @@
         <w:jc w:val="both"/>
       </w:pPr>
       <w:r>
+        <w:rPr>
+          <w:b/>
+        </w:rPr>
+        <w:t>● Button:</w:t>
+      </w:r>
+      <w:r>
         <w:rPr/>
-        <w:t>● Button: Talk to our team</w:t>
+        <w:t xml:space="preserve"> Talk to our team</w:t>
       </w:r>
     </w:p>
     <w:p/>
@@ -3646,8 +3930,14 @@
         <w:jc w:val="both"/>
       </w:pPr>
       <w:r>
+        <w:rPr>
+          <w:b/>
+        </w:rPr>
+        <w:t>● Eyebrow:</w:t>
+      </w:r>
+      <w:r>
         <w:rPr/>
-        <w:t>● Eyebrow: Your services partner</w:t>
+        <w:t xml:space="preserve"> Your services partner</w:t>
       </w:r>
     </w:p>
     <w:p>
@@ -3657,8 +3947,14 @@
         <w:jc w:val="both"/>
       </w:pPr>
       <w:r>
+        <w:rPr>
+          <w:b/>
+        </w:rPr>
+        <w:t>● H2:</w:t>
+      </w:r>
+      <w:r>
         <w:rPr/>
-        <w:t>● H2: A services partner, not just invoice processing software</w:t>
+        <w:t xml:space="preserve"> A services partner, not just invoice processing software</w:t>
       </w:r>
     </w:p>
     <w:p>
@@ -3668,8 +3964,14 @@
         <w:jc w:val="both"/>
       </w:pPr>
       <w:r>
+        <w:rPr>
+          <w:b/>
+        </w:rPr>
+        <w:t>● Intro:</w:t>
+      </w:r>
+      <w:r>
         <w:rPr/>
-        <w:t>● Intro: Software alone rarely fixes accounts payable. Mid-sized and enterprise rollouts follow the same four steps with one team, covering more entities, countries and invoice types as you grow.</w:t>
+        <w:t xml:space="preserve"> Software alone rarely fixes accounts payable. Mid-sized and enterprise rollouts follow the same four steps with one team, covering more entities, countries and invoice types as you grow.</w:t>
       </w:r>
     </w:p>
     <w:p>
@@ -3679,7 +3981,9 @@
         <w:jc w:val="both"/>
       </w:pPr>
       <w:r>
-        <w:rPr/>
+        <w:rPr>
+          <w:b/>
+        </w:rPr>
         <w:t>Four-step process (heading / copy):</w:t>
       </w:r>
     </w:p>
@@ -3777,8 +4081,14 @@
         <w:jc w:val="both"/>
       </w:pPr>
       <w:r>
+        <w:rPr>
+          <w:b/>
+        </w:rPr>
+        <w:t>● Eyebrow:</w:t>
+      </w:r>
+      <w:r>
         <w:rPr/>
-        <w:t>● Eyebrow: Why HLB HAMT</w:t>
+        <w:t xml:space="preserve"> Why HLB HAMT</w:t>
       </w:r>
     </w:p>
     <w:p>
@@ -3788,8 +4098,14 @@
         <w:jc w:val="both"/>
       </w:pPr>
       <w:r>
+        <w:rPr>
+          <w:b/>
+        </w:rPr>
+        <w:t>● H2:</w:t>
+      </w:r>
+      <w:r>
         <w:rPr/>
-        <w:t>● H2: Built by auditors. Delivered by technologists.</w:t>
+        <w:t xml:space="preserve"> Built by auditors. Delivered by technologists.</w:t>
       </w:r>
     </w:p>
     <w:p>
@@ -3799,8 +4115,14 @@
         <w:jc w:val="both"/>
       </w:pPr>
       <w:r>
+        <w:rPr>
+          <w:b/>
+        </w:rPr>
+        <w:t>● Intro:</w:t>
+      </w:r>
+      <w:r>
         <w:rPr/>
-        <w:t>● Intro: HLB HAMT is an advisory and accounting firm with its own technology division. The people designing your invoice workflows understand the controls an auditor will test, the VAT rules and the ERP.</w:t>
+        <w:t xml:space="preserve"> HLB HAMT is an advisory and accounting firm with its own technology division. The people designing your invoice workflows understand the controls an auditor will test, the VAT rules and the ERP.</w:t>
       </w:r>
     </w:p>
     <w:p>
@@ -3810,7 +4132,9 @@
         <w:jc w:val="both"/>
       </w:pPr>
       <w:r>
-        <w:rPr/>
+        <w:rPr>
+          <w:b/>
+        </w:rPr>
         <w:t>Four cards (heading / copy):</w:t>
       </w:r>
     </w:p>
@@ -3908,8 +4232,14 @@
         <w:jc w:val="both"/>
       </w:pPr>
       <w:r>
+        <w:rPr>
+          <w:b/>
+        </w:rPr>
+        <w:t>● Eyebrow:</w:t>
+      </w:r>
+      <w:r>
         <w:rPr/>
-        <w:t>● Eyebrow: ERP integration</w:t>
+        <w:t xml:space="preserve"> ERP integration</w:t>
       </w:r>
     </w:p>
     <w:p>
@@ -3919,8 +4249,14 @@
         <w:jc w:val="both"/>
       </w:pPr>
       <w:r>
+        <w:rPr>
+          <w:b/>
+        </w:rPr>
+        <w:t>● H2:</w:t>
+      </w:r>
+      <w:r>
         <w:rPr/>
-        <w:t>● H2: Works with the ERP you already run</w:t>
+        <w:t xml:space="preserve"> Works with the ERP you already run</w:t>
       </w:r>
     </w:p>
     <w:p>
@@ -3930,8 +4266,14 @@
         <w:jc w:val="both"/>
       </w:pPr>
       <w:r>
+        <w:rPr>
+          <w:b/>
+        </w:rPr>
+        <w:t>● Intro:</w:t>
+      </w:r>
+      <w:r>
         <w:rPr/>
-        <w:t>● Intro: Invoice automation sits between your incoming invoices and the ERP that records them. Your ERP stays the system of record, and everything reaching it is complete, checked and approved.</w:t>
+        <w:t xml:space="preserve"> Invoice automation sits between your incoming invoices and the ERP that records them. Your ERP stays the system of record, and everything reaching it is complete, checked and approved.</w:t>
       </w:r>
     </w:p>
     <w:p>
@@ -3941,8 +4283,14 @@
         <w:jc w:val="both"/>
       </w:pPr>
       <w:r>
+        <w:rPr>
+          <w:b/>
+        </w:rPr>
+        <w:t>● Image:</w:t>
+      </w:r>
+      <w:r>
         <w:rPr/>
-        <w:t>● Image: Invoice channels feed one queue in HLB HAMT Invoice Automation, which posts approved invoices to your ERP and feeds reporting</w:t>
+        <w:t xml:space="preserve"> Invoice channels feed one queue in HLB HAMT Invoice Automation, which posts approved invoices to your ERP and feeds reporting</w:t>
       </w:r>
     </w:p>
     <w:p>
@@ -3952,7 +4300,9 @@
         <w:jc w:val="both"/>
       </w:pPr>
       <w:r>
-        <w:rPr/>
+        <w:rPr>
+          <w:b/>
+        </w:rPr>
         <w:t>Three cards (card / covers / copy):</w:t>
       </w:r>
     </w:p>
@@ -4206,7 +4556,9 @@
         <w:jc w:val="both"/>
       </w:pPr>
       <w:r>
-        <w:rPr/>
+        <w:rPr>
+          <w:b/>
+        </w:rPr>
         <w:t>Principles:</w:t>
       </w:r>
     </w:p>
@@ -4268,8 +4620,14 @@
         <w:jc w:val="both"/>
       </w:pPr>
       <w:r>
+        <w:rPr>
+          <w:b/>
+        </w:rPr>
+        <w:t>● H2:</w:t>
+      </w:r>
+      <w:r>
         <w:rPr/>
-        <w:t>● H2: Start with a process assessment</w:t>
+        <w:t xml:space="preserve"> Start with a process assessment</w:t>
       </w:r>
     </w:p>
     <w:p>
@@ -4279,8 +4637,14 @@
         <w:jc w:val="both"/>
       </w:pPr>
       <w:r>
+        <w:rPr>
+          <w:b/>
+        </w:rPr>
+        <w:t>● Button:</w:t>
+      </w:r>
+      <w:r>
         <w:rPr/>
-        <w:t>● Button: Request an assessment</w:t>
+        <w:t xml:space="preserve"> Request an assessment</w:t>
       </w:r>
     </w:p>
     <w:p/>
@@ -4309,8 +4673,14 @@
         <w:jc w:val="both"/>
       </w:pPr>
       <w:r>
+        <w:rPr>
+          <w:b/>
+        </w:rPr>
+        <w:t>● Eyebrow:</w:t>
+      </w:r>
+      <w:r>
         <w:rPr/>
-        <w:t>● Eyebrow: Invoice automation FAQs</w:t>
+        <w:t xml:space="preserve"> Invoice automation FAQs</w:t>
       </w:r>
     </w:p>
     <w:p>
@@ -4320,8 +4690,14 @@
         <w:jc w:val="both"/>
       </w:pPr>
       <w:r>
+        <w:rPr>
+          <w:b/>
+        </w:rPr>
+        <w:t>● H2:</w:t>
+      </w:r>
+      <w:r>
         <w:rPr/>
-        <w:t>● H2: Questions finance leaders ask us</w:t>
+        <w:t xml:space="preserve"> Questions finance leaders ask us</w:t>
       </w:r>
     </w:p>
     <w:p>
@@ -4482,8 +4858,14 @@
         <w:jc w:val="both"/>
       </w:pPr>
       <w:r>
+        <w:rPr>
+          <w:b/>
+        </w:rPr>
+        <w:t>● Claims carried over from Bala's draft and marked [CONFIRM] in the copy:</w:t>
+      </w:r>
+      <w:r>
         <w:rPr/>
-        <w:t>● Claims carried over from Bala's draft and marked [CONFIRM] in the copy: "award-winning", "more than two decades", "more than 150 countries", "within a few weeks", and the UAE e-invoicing dates and AED 50 million threshold.</w:t>
+        <w:t xml:space="preserve"> "award-winning", "more than two decades", "more than 150 countries", "within a few weeks", and the UAE e-invoicing dates and AED 50 million threshold.</w:t>
       </w:r>
     </w:p>
     <w:p>
@@ -4493,8 +4875,14 @@
         <w:jc w:val="both"/>
       </w:pPr>
       <w:r>
+        <w:rPr>
+          <w:b/>
+        </w:rPr>
+        <w:t>● HAMT AI:</w:t>
+      </w:r>
+      <w:r>
         <w:rPr/>
-        <w:t>● HAMT AI: the only source detail was the four pillars. Confidence scoring, supervised retraining on approved corrections, review-rate tracking and logged corrections are written for this page and must be checked against how HAMT AI actually works.</w:t>
+        <w:t xml:space="preserve"> the only source detail was the four pillars. Confidence scoring, supervised retraining on approved corrections, review-rate tracking and logged corrections are written for this page and must be checked against how HAMT AI actually works.</w:t>
       </w:r>
     </w:p>
     <w:p>
@@ -4504,8 +4892,14 @@
         <w:jc w:val="both"/>
       </w:pPr>
       <w:r>
+        <w:rPr>
+          <w:b/>
+        </w:rPr>
+        <w:t>● Retraining:</w:t>
+      </w:r>
+      <w:r>
         <w:rPr/>
-        <w:t>● Retraining: the page says approved corrections feed the models "for your setup, tested before release". Confirm this matches the real process, and whether training is per client or shared.</w:t>
+        <w:t xml:space="preserve"> the page says approved corrections feed the models "for your setup, tested before release". Confirm this matches the real process, and whether training is per client or shared.</w:t>
       </w:r>
     </w:p>
     <w:p>
@@ -4515,8 +4909,14 @@
         <w:jc w:val="both"/>
       </w:pPr>
       <w:r>
+        <w:rPr>
+          <w:b/>
+        </w:rPr>
+        <w:t>● Data handling:</w:t>
+      </w:r>
+      <w:r>
         <w:rPr/>
-        <w:t>● Data handling: the page says it is agreed with the client IT team before go-live and that data can stay in the UAE. Confirm both.</w:t>
+        <w:t xml:space="preserve"> the page says it is agreed with the client IT team before go-live and that data can stay in the UAE. Confirm both.</w:t>
       </w:r>
     </w:p>
     <w:p>

</xml_diff>

<commit_message>
Reframe learning cycle as built-in expert review; Human-centric; update images and doc
Co-Authored-By: Claude Sonnet 5.5 <noreply@anthropic.com>
Claude-Session: https://claude.ai/code/session_012PGo17x7AccmkmEWZ5KHUv
</commit_message>
<xml_diff>
--- a/invoice-automation.docx
+++ b/invoice-automation.docx
@@ -168,7 +168,7 @@
               <w:rPr>
                 <w:sz w:val="18"/>
               </w:rPr>
-              <w:t>AI invoice automation for UAE and GCC finance teams. HAMT AI learns from reviewer corrections, and HLB HAMT implements it with your ERP.</w:t>
+              <w:t>AI invoice automation for UAE and GCC finance teams. HAMT AI builds your reviewers' expertise in, and HLB HAMT implements it with your ERP.</w:t>
             </w:r>
           </w:p>
         </w:tc>
@@ -372,7 +372,7 @@
       </w:r>
       <w:r>
         <w:rPr/>
-        <w:t xml:space="preserve"> Your business has grown. Your invoice automation should keep learning.</w:t>
+        <w:t xml:space="preserve"> Your business has grown. Your invoice automation should scale with it.</w:t>
       </w:r>
     </w:p>
     <w:p>
@@ -389,7 +389,7 @@
       </w:r>
       <w:r>
         <w:rPr/>
-        <w:t xml:space="preserve"> HLB HAMT's invoice automation uses HAMT AI, our own AI, to capture, check and route every supplier invoice in Arabic or English, from arrival to ERP posting. Built for mid-sized companies and large enterprises across the UAE, the GCC and the wider Middle East, and designed by auditors, so control comes as standard. Reviewer corrections train the models, and we assess, implement, integrate and optimise it with you.</w:t>
+        <w:t xml:space="preserve"> HLB HAMT's invoice automation uses HAMT AI, our own AI, to capture, check and route every supplier invoice in Arabic or English, from arrival to ERP posting. Built for mid-sized companies and large enterprises across the UAE, the GCC and the wider Middle East, and designed by auditors, so control comes as standard. Reviewer decisions are built into the models, and we assess, implement, integrate and optimise it with you.</w:t>
       </w:r>
     </w:p>
     <w:p>
@@ -663,7 +663,7 @@
               <w:rPr>
                 <w:sz w:val="18"/>
               </w:rPr>
-              <w:t>Reviewed and learned</w:t>
+              <w:t>Expert-checked</w:t>
             </w:r>
           </w:p>
         </w:tc>
@@ -679,7 +679,7 @@
               <w:rPr>
                 <w:sz w:val="18"/>
               </w:rPr>
-              <w:t>One low-confidence field went to a reviewer, and the correction trains HAMT AI [Learned]</w:t>
+              <w:t>A reviewer confirmed one field, and HAMT AI adapts [Refined]</w:t>
             </w:r>
           </w:p>
         </w:tc>
@@ -1968,7 +1968,7 @@
               <w:rPr>
                 <w:sz w:val="18"/>
               </w:rPr>
-              <w:t>AP staff move from keying and chasing to reviewing exceptions and analysing spend.</w:t>
+              <w:t>AP staff move from keying and chasing to reviewing and analysing spend.</w:t>
             </w:r>
           </w:p>
         </w:tc>
@@ -2007,7 +2007,7 @@
       </w:r>
       <w:r>
         <w:rPr/>
-        <w:t xml:space="preserve"> The learning cycle</w:t>
+        <w:t xml:space="preserve"> Expert review</w:t>
       </w:r>
     </w:p>
     <w:p>
@@ -2024,7 +2024,7 @@
       </w:r>
       <w:r>
         <w:rPr/>
-        <w:t xml:space="preserve"> Every reviewer correction makes your invoice automation smarter</w:t>
+        <w:t xml:space="preserve"> Your team's expertise, built into HAMT AI</w:t>
       </w:r>
     </w:p>
     <w:p>
@@ -2041,7 +2041,7 @@
       </w:r>
       <w:r>
         <w:rPr/>
-        <w:t xml:space="preserve"> HAMT AI, the engine behind our invoice automation, pairs intelligent document processing with human review and keeps learning from the people who check its work.</w:t>
+        <w:t xml:space="preserve"> HAMT AI, the engine behind our invoice automation, reads and checks invoices accurately from day one, and your reviewers' decisions are built into the models.</w:t>
       </w:r>
     </w:p>
     <w:p>
@@ -2058,7 +2058,7 @@
       </w:r>
       <w:r>
         <w:rPr/>
-        <w:t xml:space="preserve"> Learning cycle: HAMT AI flags uncertain fields, a reviewer corrects them, the models retrain and improve</w:t>
+        <w:t xml:space="preserve"> Expert review cycle: HAMT AI assures each field, a reviewer refines the result, the models are tuned and perform better for your invoices</w:t>
       </w:r>
     </w:p>
     <w:p>
@@ -2084,11 +2084,11 @@
         <w:rPr>
           <w:b/>
         </w:rPr>
-        <w:t>1. Flag</w:t>
+        <w:t>1. Assure</w:t>
       </w:r>
       <w:r>
         <w:rPr/>
-        <w:t xml:space="preserve"> - HAMT AI scores its confidence on each field and holds uncertain values for review.</w:t>
+        <w:t xml:space="preserve"> - HAMT AI scores its confidence on every field, and routes any invoice needing specialist judgement to a reviewer.</w:t>
       </w:r>
     </w:p>
     <w:p>
@@ -2101,11 +2101,11 @@
         <w:rPr>
           <w:b/>
         </w:rPr>
-        <w:t>2. Correct</w:t>
+        <w:t>2. Refine</w:t>
       </w:r>
       <w:r>
         <w:rPr/>
-        <w:t xml:space="preserve"> - A reviewer fixes the value beside the invoice, and the change is recorded.</w:t>
+        <w:t xml:space="preserve"> - A reviewer confirms or refines the result beside the invoice, and every decision is recorded.</w:t>
       </w:r>
     </w:p>
     <w:p>
@@ -2118,11 +2118,11 @@
         <w:rPr>
           <w:b/>
         </w:rPr>
-        <w:t>3. Retrain</w:t>
+        <w:t>3. Tune</w:t>
       </w:r>
       <w:r>
         <w:rPr/>
-        <w:t xml:space="preserve"> - Approved corrections feed the models for your setup, tested before release.</w:t>
+        <w:t xml:space="preserve"> - Approved decisions are built into the models for your setup, tested before release.</w:t>
       </w:r>
     </w:p>
     <w:p>
@@ -2135,11 +2135,11 @@
         <w:rPr>
           <w:b/>
         </w:rPr>
-        <w:t>4. Improve</w:t>
+        <w:t>4. Perform</w:t>
       </w:r>
       <w:r>
         <w:rPr/>
-        <w:t xml:space="preserve"> - The same supplier, layout or wording is read correctly next time, so fewer invoices need review.</w:t>
+        <w:t xml:space="preserve"> - HAMT AI applies that expertise to later invoices from the same supplier or layout, so more go straight through.</w:t>
       </w:r>
     </w:p>
     <w:p>
@@ -2286,7 +2286,7 @@
               <w:rPr>
                 <w:sz w:val="18"/>
               </w:rPr>
-              <w:t>Human-integrated</w:t>
+              <w:t>Human-centric</w:t>
             </w:r>
           </w:p>
         </w:tc>
@@ -2302,7 +2302,7 @@
               <w:rPr>
                 <w:sz w:val="18"/>
               </w:rPr>
-              <w:t>Reviewers see what HAMT AI is unsure about, correct it on one screen and approve what matters.</w:t>
+              <w:t>Your people stay at the centre. Reviewers see the invoice and extracted fields side by side, and their decisions shape how HAMT AI performs.</w:t>
             </w:r>
           </w:p>
         </w:tc>
@@ -2408,7 +2408,7 @@
               <w:rPr>
                 <w:sz w:val="18"/>
               </w:rPr>
-              <w:t>Models handle invoice data extraction and supplier recognition, and sharpen on your suppliers.</w:t>
+              <w:t>Models handle invoice data extraction and supplier recognition with a confidence score on every field.</w:t>
             </w:r>
           </w:p>
         </w:tc>
@@ -2461,7 +2461,7 @@
               <w:rPr>
                 <w:sz w:val="18"/>
               </w:rPr>
-              <w:t>AP moves from keying and chasing to reviewing and controlling, with the process redesigned alongside.</w:t>
+              <w:t>AP moves from keying and chasing to reviewing and controlling.</w:t>
             </w:r>
           </w:p>
         </w:tc>
@@ -2482,7 +2482,7 @@
       </w:r>
       <w:r>
         <w:rPr/>
-        <w:t xml:space="preserve"> Exception handling that gets smarter</w:t>
+        <w:t xml:space="preserve"> Exception handling built around your team</w:t>
       </w:r>
     </w:p>
     <w:p>
@@ -2516,24 +2516,7 @@
       </w:r>
       <w:r>
         <w:rPr/>
-        <w:t xml:space="preserve"> Corrections are logged with who made them and when.</w:t>
-      </w:r>
-    </w:p>
-    <w:p>
-      <w:pPr>
-        <w:spacing w:after="0"/>
-        <w:ind w:left="360" w:hanging="360"/>
-        <w:jc w:val="both"/>
-      </w:pPr>
-      <w:r>
-        <w:rPr>
-          <w:b/>
-        </w:rPr>
-        <w:t>● Point:</w:t>
-      </w:r>
-      <w:r>
-        <w:rPr/>
-        <w:t xml:space="preserve"> Retraining is supervised by HLB HAMT, and data handling is agreed with your IT team before go-live.</w:t>
+        <w:t xml:space="preserve"> Every decision is logged, model updates are supervised by HLB HAMT, and data handling is agreed with your IT team before go-live.</w:t>
       </w:r>
     </w:p>
     <w:p/>
@@ -2569,7 +2552,7 @@
       </w:r>
       <w:r>
         <w:rPr/>
-        <w:t xml:space="preserve"> See HAMT AI learn from your invoices</w:t>
+        <w:t xml:space="preserve"> See HAMT AI work on your invoices</w:t>
       </w:r>
     </w:p>
     <w:p>
@@ -2673,7 +2656,7 @@
       </w:r>
       <w:r>
         <w:rPr/>
-        <w:t xml:space="preserve"> One invoice: HAMT AI reads and checks it, clean invoices go straight to approval and the ERP, flagged ones go to a reviewer whose correction retrains HAMT AI</w:t>
+        <w:t xml:space="preserve"> One invoice: HAMT AI reads and checks it, clean invoices go straight to approval and the ERP, others go to a reviewer whose decision is built into HAMT AI</w:t>
       </w:r>
     </w:p>
     <w:p>
@@ -2946,7 +2929,7 @@
               <w:rPr>
                 <w:sz w:val="18"/>
               </w:rPr>
-              <w:t>Uncertain values go to review instead of being guessed</w:t>
+              <w:t>Ambiguous values go to a reviewer, never assumed</w:t>
             </w:r>
           </w:p>
         </w:tc>
@@ -3647,7 +3630,7 @@
       </w:r>
       <w:r>
         <w:rPr/>
-        <w:t xml:space="preserve"> Every deployment includes bilingual capture, three-way matching, VAT and TRN checks, the HAMT AI learning cycle and a complete audit trail.</w:t>
+        <w:t xml:space="preserve"> Every deployment includes bilingual capture, three-way matching, VAT and TRN checks, built-in expert review and a complete audit trail.</w:t>
       </w:r>
     </w:p>
     <w:p/>
@@ -3971,7 +3954,7 @@
       </w:r>
       <w:r>
         <w:rPr/>
-        <w:t xml:space="preserve"> Software alone rarely fixes accounts payable. Mid-sized and enterprise rollouts follow the same four steps with one team, covering more entities, countries and invoice types as you grow.</w:t>
+        <w:t xml:space="preserve"> Mid-sized and enterprise rollouts follow the same four steps with one team, across more entities, countries and invoice types as you grow.</w:t>
       </w:r>
     </w:p>
     <w:p>
@@ -4741,7 +4724,7 @@
       </w:pPr>
       <w:r>
         <w:rPr/>
-        <w:t>An invoice is captured by email, scanner or e-invoice, read by HAMT AI, checked against the purchase order, goods receipt and VAT rules, approved, then posted to your ERP. OCR only reads text. Intelligent document processing adds invoice data extraction that understands layouts, line items and suppliers, scores its confidence and learns from corrections. Arabic, English and mixed-language invoices, including faded, skewed and dot-matrix prints, are read as standard.</w:t>
+        <w:t>An invoice is captured by email, scanner or e-invoice, read by HAMT AI, checked against the purchase order, goods receipt and VAT rules, approved, then posted to your ERP. OCR only reads text. Intelligent document processing adds invoice data extraction that understands layouts, line items and suppliers, scores its confidence and adapts to your suppliers through reviewer decisions. Arabic, English and mixed-language invoices, including faded, skewed and dot-matrix prints, are read as standard.</w:t>
       </w:r>
     </w:p>
     <w:p>
@@ -4763,7 +4746,7 @@
       </w:pPr>
       <w:r>
         <w:rPr/>
-        <w:t>HAMT AI is HLB HAMT's own AI: Human-integrated, Automation, Machine learning and Transformation. Clean invoices flow through. Uncertain or failed ones go to a reviewer with the reason attached, never guessed, and each correction retrains the models. HLB HAMT builds and supports it, so the team implementing your rollout also tunes it.</w:t>
+        <w:t>HAMT AI is HLB HAMT's own AI: Human-centric, Automation, Machine learning and Transformation. Clean invoices flow through. Anything that calls for judgement goes to a reviewer with the reason attached, and each decision is built into the models. HLB HAMT builds and supports it, so one team implements and tunes it.</w:t>
       </w:r>
     </w:p>
     <w:p>
@@ -4882,7 +4865,7 @@
       </w:r>
       <w:r>
         <w:rPr/>
-        <w:t xml:space="preserve"> the only source detail was the four pillars. Confidence scoring, supervised retraining on approved corrections, review-rate tracking and logged corrections are written for this page and must be checked against how HAMT AI actually works.</w:t>
+        <w:t xml:space="preserve"> the only source detail was the four pillars. Confidence scoring, supervised model updates from approved reviewer decisions, review-rate tracking and logged decisions are written for this page and must be checked against how HAMT AI actually works.</w:t>
       </w:r>
     </w:p>
     <w:p>
@@ -4895,11 +4878,11 @@
         <w:rPr>
           <w:b/>
         </w:rPr>
-        <w:t>● Retraining:</w:t>
+        <w:t>● Model updates:</w:t>
       </w:r>
       <w:r>
         <w:rPr/>
-        <w:t xml:space="preserve"> the page says approved corrections feed the models "for your setup, tested before release". Confirm this matches the real process, and whether training is per client or shared.</w:t>
+        <w:t xml:space="preserve"> the page says approved decisions are built into the models "for your setup, and tested before release". Confirm this matches the real process, and whether training is per client or shared.</w:t>
       </w:r>
     </w:p>
     <w:p>

</xml_diff>